<commit_message>
Capture PMX zero-step hypothesis prospectively and retain reviewed PDF
</commit_message>
<xml_diff>
--- a/docs/manuscript-v3/manuscript.docx
+++ b/docs/manuscript-v3/manuscript.docx
@@ -2680,7 +2680,7 @@
     </w:tbl>
     <w:p>
       <w:pPr>
-        <w:pStyle w:val="CaptionedFigure"/>
+        <w:pStyle w:val="BodyText"/>
       </w:pPr>
       <w:r>
         <w:drawing>
@@ -2723,17 +2723,6 @@
             </a:graphic>
           </wp:inline>
         </w:drawing>
-      </w:r>
-    </w:p>
-    <w:p>
-      <w:pPr>
-        <w:pStyle w:val="ImageCaption"/>
-      </w:pPr>
-      <w:r>
-        <w:rPr>
-          <w:lang w:val="en-GB"/>
-        </w:rPr>
-        <w:t xml:space="preserve">Historical AINA aggregate estimates, observed probe frequencies and signed differences</w:t>
       </w:r>
     </w:p>
     <w:p>

</xml_diff>

<commit_message>
Connect active v3 preflight to automatic main240 dispatch and retain PMX repair in manuscript
</commit_message>
<xml_diff>
--- a/docs/manuscript-v3/manuscript.docx
+++ b/docs/manuscript-v3/manuscript.docx
@@ -600,7 +600,7 @@
     </w:p>
     <w:bookmarkEnd w:id="26"/>
     <w:bookmarkEnd w:id="27"/>
-    <w:bookmarkStart w:id="41" w:name="methods"/>
+    <w:bookmarkStart w:id="42" w:name="methods"/>
     <w:p>
       <w:pPr>
         <w:pStyle w:val="Heading2"/>
@@ -1934,7 +1934,7 @@
       </w:r>
     </w:p>
     <w:bookmarkEnd w:id="35"/>
-    <w:bookmarkStart w:id="37" w:name="comparators-and-information-access"/>
+    <w:bookmarkStart w:id="38" w:name="comparators-and-information-access"/>
     <w:p>
       <w:pPr>
         <w:pStyle w:val="Heading3"/>
@@ -2022,7 +2022,34 @@
         <w:rPr>
           <w:lang w:val="en-GB"/>
         </w:rPr>
-        <w:t xml:space="preserve">The PMX input mapping is fixed per application: service boundaries for DeathStarBench, explicit SERVER spans for OpenTelemetry Demo, and SERVER plus observed MySQL CLIENT peers for Petclinic. In OpenTelemetry Demo, database execution remains aggregated within the enclosing SERVER; it is not an extra PCM peer. Petclinic database CLIENT peers are observed call abstractions, not measured database SERVER state processes. Caller-context separation, failure containment and integer-PMF bridges are declared adaptations. Four known-probability context/database cases, two variants and two solver passes provide 16 oracle records in each application solver batch. Application forecasts require valid probability mass and agreement between repeated solves. A failed oracle invalidates the corresponding application batch.</w:t>
+        <w:t xml:space="preserve">The PMX input mapping is fixed per application: service boundaries for DeathStarBench, explicit SERVER spans for OpenTelemetry Demo, and SERVER plus observed MySQL CLIENT peers for Petclinic. In OpenTelemetry Demo, database execution remains aggregated within the enclosing SERVER; it is not an extra PCM peer. Petclinic database CLIENT peers are observed call abstractions, not measured database SERVER state processes. Caller-context separation, failure containment and integer-PMF bridges are declared adaptations. Four known-probability context/database cases, two variants and two solver passes provide 16 oracle records in each application solver batch. The prospective v3 chain uses a disclosed, SHA-pinned clock-progress correction to the author PMX binary: a zero or nonrepresentably small step advances by max(1 ns, one double ULP), while original interval endpoints and observations are preserved. Its</w:t>
+      </w:r>
+      <w:r>
+        <w:rPr>
+          <w:lang w:val="en-GB"/>
+        </w:rPr>
+        <w:t xml:space="preserve"> </w:t>
+      </w:r>
+      <w:hyperlink r:id="rId37">
+        <w:r>
+          <w:rPr>
+            <w:rStyle w:val="Hyperlink"/>
+            <w:lang w:val="en-GB"/>
+          </w:rPr>
+          <w:t xml:space="preserve">matched development qualification</w:t>
+        </w:r>
+      </w:hyperlink>
+      <w:r>
+        <w:rPr>
+          <w:lang w:val="en-GB"/>
+        </w:rPr>
+        <w:t xml:space="preserve"> </w:t>
+      </w:r>
+      <w:r>
+        <w:rPr>
+          <w:lang w:val="en-GB"/>
+        </w:rPr>
+        <w:t xml:space="preserve">preserves all 32 previously supported forecasts and resolves one timed-out projection; it does not supply independent test accuracy. Derived-binary compilation is recorded separately from extraction and solving. Application forecasts require valid probability mass and agreement between repeated solves. A failed oracle invalidates the corresponding application batch.</w:t>
       </w:r>
     </w:p>
     <w:p>
@@ -2036,8 +2063,8 @@
         <w:t xml:space="preserve">These differences form an information-access comparison, not a claim that every method estimates the same state parameters from identical fields. The external target Y, campaign identities, calibration/test separation and error analysis are shared.</w:t>
       </w:r>
     </w:p>
-    <w:bookmarkEnd w:id="37"/>
-    <w:bookmarkStart w:id="39" w:name="X484a2fe3fff0944d95f760688e0f50071d288e3"/>
+    <w:bookmarkEnd w:id="38"/>
+    <w:bookmarkStart w:id="40" w:name="X484a2fe3fff0944d95f760688e0f50071d288e3"/>
     <w:p>
       <w:pPr>
         <w:pStyle w:val="Heading3"/>
@@ -2098,7 +2125,7 @@
         </w:rPr>
         <w:t xml:space="preserve"> </w:t>
       </w:r>
-      <w:hyperlink r:id="rId38">
+      <w:hyperlink r:id="rId39">
         <w:r>
           <w:rPr>
             <w:rStyle w:val="Hyperlink"/>
@@ -2142,8 +2169,8 @@
         <w:t xml:space="preserve">For every planned source-to-other-placement direction, the current implementation reports transfer as unsupported: null target point/error, unrestricted target-event bounds [0,1], and change bounds relative to a source point where available. Observed target outcomes and changes are opened only for evaluation. These no-information bounds are neither useful transfer forecasts nor confidence intervals. The zero point-coverage result is an explicit limitation, not an omitted experiment or a refit advertised as transport.</w:t>
       </w:r>
     </w:p>
-    <w:bookmarkEnd w:id="39"/>
-    <w:bookmarkStart w:id="40" w:name="X25ff07b890f17560f8efd0d619947e51038bbe6"/>
+    <w:bookmarkEnd w:id="40"/>
+    <w:bookmarkStart w:id="41" w:name="X25ff07b890f17560f8efd0d619947e51038bbe6"/>
     <w:p>
       <w:pPr>
         <w:pStyle w:val="Heading3"/>
@@ -2215,9 +2242,9 @@
         <w:t xml:space="preserve">records which publication claims are already supportable and which await the prospective results.</w:t>
       </w:r>
     </w:p>
-    <w:bookmarkEnd w:id="40"/>
     <w:bookmarkEnd w:id="41"/>
-    <w:bookmarkStart w:id="62" w:name="results"/>
+    <w:bookmarkEnd w:id="42"/>
+    <w:bookmarkStart w:id="64" w:name="results"/>
     <w:p>
       <w:pPr>
         <w:pStyle w:val="Heading2"/>
@@ -2229,7 +2256,7 @@
         <w:t xml:space="preserve">Results</w:t>
       </w:r>
     </w:p>
-    <w:bookmarkStart w:id="51" w:name="X67f9ab04a00b5bf3e8d2d0acf7f8e15f0435ced"/>
+    <w:bookmarkStart w:id="52" w:name="X67f9ab04a00b5bf3e8d2d0acf7f8e15f0435ced"/>
     <w:p>
       <w:pPr>
         <w:pStyle w:val="Heading3"/>
@@ -2268,7 +2295,7 @@
         </w:rPr>
         <w:t xml:space="preserve"> </w:t>
       </w:r>
-      <w:hyperlink r:id="rId42">
+      <w:hyperlink r:id="rId43">
         <w:r>
           <w:rPr>
             <w:rStyle w:val="Hyperlink"/>
@@ -2687,18 +2714,18 @@
           <wp:inline>
             <wp:extent cx="5334000" cy="2163233"/>
             <wp:effectExtent b="0" l="0" r="0" t="0"/>
-            <wp:docPr descr="Historical AINA aggregate estimates, observed probe frequencies and signed differences" title="" id="44" name="Picture"/>
+            <wp:docPr descr="Historical AINA aggregate estimates, observed probe frequencies and signed differences" title="" id="45" name="Picture"/>
             <a:graphic>
               <a:graphicData uri="http://schemas.openxmlformats.org/drawingml/2006/picture">
                 <pic:pic>
                   <pic:nvPicPr>
-                    <pic:cNvPr descr="../figures/aina-audit-v3-review.png" id="45" name="Picture"/>
+                    <pic:cNvPr descr="../figures/aina-audit-v3-review.png" id="46" name="Picture"/>
                     <pic:cNvPicPr>
                       <a:picLocks noChangeArrowheads="1" noChangeAspect="1"/>
                     </pic:cNvPicPr>
                   </pic:nvPicPr>
                   <pic:blipFill>
-                    <a:blip r:embed="rId43"/>
+                    <a:blip r:embed="rId44"/>
                     <a:stretch>
                       <a:fillRect/>
                     </a:stretch>
@@ -2745,7 +2772,7 @@
         </w:rPr>
         <w:t xml:space="preserve"> </w:t>
       </w:r>
-      <w:hyperlink r:id="rId46">
+      <w:hyperlink r:id="rId47">
         <w:r>
           <w:rPr>
             <w:rStyle w:val="Hyperlink"/>
@@ -2772,7 +2799,7 @@
         </w:rPr>
         <w:t xml:space="preserve"> </w:t>
       </w:r>
-      <w:hyperlink r:id="rId47">
+      <w:hyperlink r:id="rId48">
         <w:r>
           <w:rPr>
             <w:rStyle w:val="Hyperlink"/>
@@ -2799,7 +2826,7 @@
         </w:rPr>
         <w:t xml:space="preserve"> </w:t>
       </w:r>
-      <w:hyperlink r:id="rId48">
+      <w:hyperlink r:id="rId49">
         <w:r>
           <w:rPr>
             <w:rStyle w:val="Hyperlink"/>
@@ -2843,7 +2870,7 @@
         </w:rPr>
         <w:t xml:space="preserve"> </w:t>
       </w:r>
-      <w:hyperlink r:id="rId49">
+      <w:hyperlink r:id="rId50">
         <w:r>
           <w:rPr>
             <w:rStyle w:val="Hyperlink"/>
@@ -2892,7 +2919,7 @@
         </w:rPr>
         <w:t xml:space="preserve"> </w:t>
       </w:r>
-      <w:hyperlink r:id="rId50">
+      <w:hyperlink r:id="rId51">
         <w:r>
           <w:rPr>
             <w:rStyle w:val="Hyperlink"/>
@@ -2914,8 +2941,8 @@
         <w:t xml:space="preserve">examines the documented controller period, sequential probes and timeout configuration. Conditional duration lower bounds exceed the nominal 60-second controller period in 3,483 of 25,000 windows. These bounds indicate a measurement-alignment concern, but do not reconstruct actual per-probe times or establish exact fault overlap. Original application images/runtime identity are not fully pinned. The discrepancy is reproducible as an observation; its historical cause is not established by these checks.</w:t>
       </w:r>
     </w:p>
-    <w:bookmarkEnd w:id="51"/>
-    <w:bookmarkStart w:id="52" w:name="X5cce87afd976305cd1d2593d1b87bff3354d54c"/>
+    <w:bookmarkEnd w:id="52"/>
+    <w:bookmarkStart w:id="53" w:name="X5cce87afd976305cd1d2593d1b87bff3354d54c"/>
     <w:p>
       <w:pPr>
         <w:pStyle w:val="Heading3"/>
@@ -3206,8 +3233,8 @@
         <w:t xml:space="preserve">The initial study gate qualified 31/32 cells because one native-parser cleanliness check failed. A separately versioned replay on the final immutable uploaded inputs qualified the remaining cell while preserving all request outcomes and inferential results. A concurrent append is a plausible explanation for the original parser failure, but the precise bytes observed at that moment were not retained. This repair is evidence about input integrity, not another independent experiment or an extra block. The result supports one scoped mechanism; it neither identifies a mediation fraction nor explains the historical AINA bias.</w:t>
       </w:r>
     </w:p>
-    <w:bookmarkEnd w:id="52"/>
-    <w:bookmarkStart w:id="55" w:name="Xa4f2a1b99eb38c03a1b89ff95f05a6c035af07d"/>
+    <w:bookmarkEnd w:id="53"/>
+    <w:bookmarkStart w:id="56" w:name="Xa4f2a1b99eb38c03a1b89ff95f05a6c035af07d"/>
     <w:p>
       <w:pPr>
         <w:pStyle w:val="Heading3"/>
@@ -3634,7 +3661,7 @@
         </w:rPr>
         <w:t xml:space="preserve"> </w:t>
       </w:r>
-      <w:hyperlink r:id="rId53">
+      <w:hyperlink r:id="rId54">
         <w:r>
           <w:rPr>
             <w:rStyle w:val="Hyperlink"/>
@@ -3683,7 +3710,7 @@
         </w:rPr>
         <w:t xml:space="preserve"> </w:t>
       </w:r>
-      <w:hyperlink r:id="rId54">
+      <w:hyperlink r:id="rId55">
         <w:r>
           <w:rPr>
             <w:rStyle w:val="Hyperlink"/>
@@ -3705,8 +3732,8 @@
         <w:t xml:space="preserve">supplies ten point forecasts, ten exact saved-model replays and 41 structural controls. Its fixed-k quantization and all-attempt eligibility-based parameterization are explicit. The earlier AINA probability law is not silently represented as an unchanged application of the new observation contract.</w:t>
       </w:r>
     </w:p>
-    <w:bookmarkEnd w:id="55"/>
-    <w:bookmarkStart w:id="60" w:name="Xa62ec04076493218a52dd8cbbbb18cadd750d5c"/>
+    <w:bookmarkEnd w:id="56"/>
+    <w:bookmarkStart w:id="62" w:name="Xa62ec04076493218a52dd8cbbbb18cadd750d5c"/>
     <w:p>
       <w:pPr>
         <w:pStyle w:val="Heading3"/>
@@ -3800,7 +3827,7 @@
         </w:rPr>
         <w:t xml:space="preserve"> </w:t>
       </w:r>
-      <w:hyperlink r:id="rId56">
+      <w:hyperlink r:id="rId57">
         <w:r>
           <w:rPr>
             <w:rStyle w:val="Hyperlink"/>
@@ -3838,7 +3865,7 @@
         </w:rPr>
         <w:t xml:space="preserve"> </w:t>
       </w:r>
-      <w:hyperlink r:id="rId57">
+      <w:hyperlink r:id="rId58">
         <w:r>
           <w:rPr>
             <w:rStyle w:val="Hyperlink"/>
@@ -3860,7 +3887,7 @@
         <w:t xml:space="preserve">derives the legacy wrapper’s profile from the sealed campaign identity, preserves the eight-field input files and rejects extra fields. Exact-schema controls reproduce the original error and show equivalence to the qualified legacy projection with that metadata supplied explicitly. It changes no graph functional, native observation, PMX failure policy or outcome. Its full-duration preflight uses a new registered seed and namespace; v1 is preserved as failed development evidence.</w:t>
       </w:r>
     </w:p>
-    <w:bookmarkStart w:id="59" w:name="X880e93b24695459a513dfacfeebfbf3589e2f3b"/>
+    <w:bookmarkStart w:id="60" w:name="X880e93b24695459a513dfacfeebfbf3589e2f3b"/>
     <w:p>
       <w:pPr>
         <w:pStyle w:val="Heading4"/>
@@ -3924,7 +3951,7 @@
         </w:rPr>
         <w:t xml:space="preserve"> </w:t>
       </w:r>
-      <w:hyperlink r:id="rId58">
+      <w:hyperlink r:id="rId59">
         <w:r>
           <w:rPr>
             <w:rStyle w:val="Hyperlink"/>
@@ -3946,18 +3973,17 @@
         <w:t xml:space="preserve">retains all200 method slots, all21,600 all-sequence test attempts and the exact missing forecasts. Primary PMX has13 points, six valid conditional-local refusals and one technical failure; inclusive PMX has19 points and one failure. Gstar has10 points, eight ambiguous cells and two structural refusals. The successful subchain retains48 known oracle solves and passes1293 other strict provenance/replay/read-order checks. Those checks do not remove the failed admission gates. A separately declared exact-input process diagnostic follows; the cause of the nonterminating process is not inferred from its timeout alone.</w:t>
       </w:r>
     </w:p>
-    <w:bookmarkEnd w:id="59"/>
     <w:bookmarkEnd w:id="60"/>
-    <w:bookmarkStart w:id="61" w:name="Xfca87b76d71a9eeeedfed17811310ea13fd4e43"/>
-    <w:p>
-      <w:pPr>
-        <w:pStyle w:val="Heading3"/>
-      </w:pPr>
-      <w:r>
-        <w:rPr>
-          <w:lang w:val="en-GB"/>
-        </w:rPr>
-        <w:t xml:space="preserve">5. Independent main results remain a separate obligation</w:t>
+    <w:bookmarkStart w:id="61" w:name="Xf831647aee167505ae71107c3ae6e0b2616b92b"/>
+    <w:p>
+      <w:pPr>
+        <w:pStyle w:val="Heading4"/>
+      </w:pPr>
+      <w:r>
+        <w:rPr>
+          <w:lang w:val="en-GB"/>
+        </w:rPr>
+        <w:t xml:space="preserve">Source-derived computational repair, separately qualified</w:t>
       </w:r>
     </w:p>
     <w:p>
@@ -3968,23 +3994,86 @@
         <w:rPr>
           <w:lang w:val="en-GB"/>
         </w:rPr>
-        <w:t xml:space="preserve">The 240-campaign main series has not yet been admitted. Consequently this chapter makes no Gstar-versus-PMX/G0 superiority claim, no equivalence claim, and no claim that the final model is independently adequate across three applications. Completed mechanisms, arithmetic audits, technical controls and development forecasts cannot substitute for that series.</w:t>
-      </w:r>
-    </w:p>
-    <w:p>
-      <w:pPr>
-        <w:pStyle w:val="BodyText"/>
-      </w:pPr>
-      <w:r>
-        <w:rPr>
-          <w:lang w:val="en-GB"/>
-        </w:rPr>
-        <w:t xml:space="preserve">The final main section must report all 800 planned operation cells per method, support and absence reasons, own/common-support errors, the six prespecified paired contrasts, all-sequence/stable distinctions, source-only transfer coverage, measured stage/process costs and unresolved quantities. The reported source-only transfer procedure currently identifies no target point under an unrestricted changed joint law. That limitation must remain visible alongside current-campaign results, and target-calibrated rebuilding must not be relabelled as transfer.</w:t>
+        <w:t xml:space="preserve">Pinned-source and bytecode inspection plus an observer-only replay identify a zero-width overlap and zero LibReDE step in the timed-out case. A minimal representable-clock-progress correction preserves the original interval, samples and all other JAR members outside the factory class/source. The</w:t>
+      </w:r>
+      <w:r>
+        <w:rPr>
+          <w:lang w:val="en-GB"/>
+        </w:rPr>
+        <w:t xml:space="preserve"> </w:t>
+      </w:r>
+      <w:hyperlink r:id="rId37">
+        <w:r>
+          <w:rPr>
+            <w:rStyle w:val="Hyperlink"/>
+            <w:lang w:val="en-GB"/>
+          </w:rPr>
+          <w:t xml:space="preserve">matched qualification</w:t>
+        </w:r>
+      </w:hyperlink>
+      <w:r>
+        <w:rPr>
+          <w:lang w:val="en-GB"/>
+        </w:rPr>
+        <w:t xml:space="preserve"> </w:t>
+      </w:r>
+      <w:r>
+        <w:rPr>
+          <w:lang w:val="en-GB"/>
+        </w:rPr>
+        <w:t xml:space="preserve">completes all20 saved application projections and four controls. All19 originally complete projections preserve every resolved field, including resource demands. The failed projection completes in23.08seconds including20seconds of startup. Seven builds yield the same derived JAR.</w:t>
+      </w:r>
+    </w:p>
+    <w:p>
+      <w:pPr>
+        <w:pStyle w:val="BodyText"/>
+      </w:pPr>
+      <w:r>
+        <w:rPr>
+          <w:lang w:val="en-GB"/>
+        </w:rPr>
+        <w:t xml:space="preserve">All48 known solver-oracle records pass. The32 previously supported forecasts remain exactly unchanged, six conditional unsupported slots retain null points/reasons, and two forecasts are recovered. No business test outcome is read in this repair qualification. These results establish a scoped computational repair on development inputs. A newly versioned full-duration preflight using seed771605 must still pass before independent main admission.</w:t>
       </w:r>
     </w:p>
     <w:bookmarkEnd w:id="61"/>
     <w:bookmarkEnd w:id="62"/>
-    <w:bookmarkStart w:id="69" w:name="discussion"/>
+    <w:bookmarkStart w:id="63" w:name="Xfca87b76d71a9eeeedfed17811310ea13fd4e43"/>
+    <w:p>
+      <w:pPr>
+        <w:pStyle w:val="Heading3"/>
+      </w:pPr>
+      <w:r>
+        <w:rPr>
+          <w:lang w:val="en-GB"/>
+        </w:rPr>
+        <w:t xml:space="preserve">5. Independent main results remain a separate obligation</w:t>
+      </w:r>
+    </w:p>
+    <w:p>
+      <w:pPr>
+        <w:pStyle w:val="FirstParagraph"/>
+      </w:pPr>
+      <w:r>
+        <w:rPr>
+          <w:lang w:val="en-GB"/>
+        </w:rPr>
+        <w:t xml:space="preserve">The 240-campaign main series has not yet been admitted. Consequently this chapter makes no Gstar-versus-PMX/G0 superiority claim, no equivalence claim, and no claim that the final model is independently adequate across three applications. Completed mechanisms, arithmetic audits, technical controls and development forecasts cannot substitute for that series.</w:t>
+      </w:r>
+    </w:p>
+    <w:p>
+      <w:pPr>
+        <w:pStyle w:val="BodyText"/>
+      </w:pPr>
+      <w:r>
+        <w:rPr>
+          <w:lang w:val="en-GB"/>
+        </w:rPr>
+        <w:t xml:space="preserve">The final main section must report all 800 planned operation cells per method, support and absence reasons, own/common-support errors, the six prespecified paired contrasts, all-sequence/stable distinctions, source-only transfer coverage, measured stage/process costs and unresolved quantities. The reported source-only transfer procedure currently identifies no target point under an unrestricted changed joint law. That limitation must remain visible alongside current-campaign results, and target-calibrated rebuilding must not be relabelled as transfer.</w:t>
+      </w:r>
+    </w:p>
+    <w:bookmarkEnd w:id="63"/>
+    <w:bookmarkEnd w:id="64"/>
+    <w:bookmarkStart w:id="71" w:name="discussion"/>
     <w:p>
       <w:pPr>
         <w:pStyle w:val="Heading2"/>
@@ -3996,7 +4085,7 @@
         <w:t xml:space="preserve">Discussion</w:t>
       </w:r>
     </w:p>
-    <w:bookmarkStart w:id="63" w:name="X9d6b68513f878977fec1830a6879ec8b9936a8e"/>
+    <w:bookmarkStart w:id="65" w:name="X9d6b68513f878977fec1830a6879ec8b9936a8e"/>
     <w:p>
       <w:pPr>
         <w:pStyle w:val="Heading3"/>
@@ -4041,8 +4130,8 @@
         <w:t xml:space="preserve">The practical output is therefore conditional. A reachability forecast is justified as an execution forecast only under its stated event equivalence. An execution forecast is justified as a business forecast only under the additional operation contract and measurement assumptions. Independent error and coverage tables assess the latter relationship on their supported application conditions. The present procedure does not automatically select a universally smallest adequate model.</w:t>
       </w:r>
     </w:p>
-    <w:bookmarkEnd w:id="63"/>
-    <w:bookmarkStart w:id="64" w:name="identification-and-observation-quality"/>
+    <w:bookmarkEnd w:id="65"/>
+    <w:bookmarkStart w:id="66" w:name="identification-and-observation-quality"/>
     <w:p>
       <w:pPr>
         <w:pStyle w:val="Heading3"/>
@@ -4087,8 +4176,8 @@
         <w:t xml:space="preserve">The support policy is deliberately observable. Every calibration attempt enters the denominator, including failures, timeouts and untraced attempts. Missing evidence can widen a bound or prevent structural binding; it does not disappear by conditioning on complete traces. This avoids one form of selective reporting, but does not establish that the available instrumentation identifies all requested functionals. The independent results must show point coverage, the reasons for ambiguity, structural refusal and technical failure alongside error. Technical failures remain distinct from a valid method-level refusal to identify a point.</w:t>
       </w:r>
     </w:p>
-    <w:bookmarkEnd w:id="64"/>
-    <w:bookmarkStart w:id="65" w:name="causal-scope-and-guard-ablations"/>
+    <w:bookmarkEnd w:id="66"/>
+    <w:bookmarkStart w:id="67" w:name="causal-scope-and-guard-ablations"/>
     <w:p>
       <w:pPr>
         <w:pStyle w:val="Heading3"/>
@@ -4133,8 +4222,8 @@
         <w:t xml:space="preserve">Historical timing bounds are likewise diagnostic rather than causal. They show that some conditional duration lower bounds are incompatible with treating every original probe window as wholly contained in one short controller period. They do not reconstruct actual probe timestamps or assign an unobserved overlap to a particular failure. The historical biases motivate this investigation while retaining their unresolved causal attribution.</w:t>
       </w:r>
     </w:p>
-    <w:bookmarkEnd w:id="65"/>
-    <w:bookmarkStart w:id="66" w:name="interpreting-independent-comparisons"/>
+    <w:bookmarkEnd w:id="67"/>
+    <w:bookmarkStart w:id="68" w:name="interpreting-independent-comparisons"/>
     <w:p>
       <w:pPr>
         <w:pStyle w:val="Heading3"/>
@@ -4190,8 +4279,8 @@
         <w:t xml:space="preserve">The all-sequence result is primary. The stable view uses the same frozen forecast on a separately reported, bracketed subset of attempts, and can change the observed operating-condition mix. It does not rescue an unsuccessful primary forecast or exclude every DOWN state. Differences between the views are interpreted with their retained fractions and condition coverage.</w:t>
       </w:r>
     </w:p>
-    <w:bookmarkEnd w:id="66"/>
-    <w:bookmarkStart w:id="67" w:name="transfer-cost-and-automation"/>
+    <w:bookmarkEnd w:id="68"/>
+    <w:bookmarkStart w:id="69" w:name="transfer-cost-and-automation"/>
     <w:p>
       <w:pPr>
         <w:pStyle w:val="Heading3"/>
@@ -4236,8 +4325,8 @@
         <w:t xml:space="preserve">Automation begins after several manual choices: the external success contract, source error-propagation rules, required and optional call groups, peer identity declarations, fault/placement class and comparator adapters. The downstream extraction, identification, calculation, replay and scoring are automated under those declarations. This scope is useful and reproducible, but does not establish fully automatic integration of an unfamiliar application. Low CPU time alone is not evidence of low total integration or monitoring cost.</w:t>
       </w:r>
     </w:p>
-    <w:bookmarkEnd w:id="67"/>
-    <w:bookmarkStart w:id="68" w:name="generalization-and-reproducibility"/>
+    <w:bookmarkEnd w:id="69"/>
+    <w:bookmarkStart w:id="70" w:name="generalization-and-reproducibility"/>
     <w:p>
       <w:pPr>
         <w:pStyle w:val="Heading3"/>
@@ -4282,9 +4371,9 @@
         <w:t xml:space="preserve">Reproducibility requires preserving the failures that changed the implementation. The first full comparison preflight’s PMX profile-interface failure is retained beside its versioned repair. The H-EXEC immutable-input replay retains the original parser failure and all unchanged outcomes. A successful replay verifies the recorded calculation and input association; it does not create another independent campaign. The final article must preserve any further technical failures, invalid probabilities, empty contrasts and unfavorable results, and base its accuracy conclusions on the audited prospective evidence.</w:t>
       </w:r>
     </w:p>
-    <w:bookmarkEnd w:id="68"/>
-    <w:bookmarkEnd w:id="69"/>
-    <w:bookmarkStart w:id="78" w:name="Xca5978b00292db4c29cfb3375589ea70af0cfb1"/>
+    <w:bookmarkEnd w:id="70"/>
+    <w:bookmarkEnd w:id="71"/>
+    <w:bookmarkStart w:id="80" w:name="Xca5978b00292db4c29cfb3375589ea70af0cfb1"/>
     <w:p>
       <w:pPr>
         <w:pStyle w:val="Heading2"/>
@@ -4296,7 +4385,7 @@
         <w:t xml:space="preserve">Appendix: contribution and evidence boundaries</w:t>
       </w:r>
     </w:p>
-    <w:bookmarkStart w:id="75" w:name="contribution-and-evidence-table"/>
+    <w:bookmarkStart w:id="77" w:name="contribution-and-evidence-table"/>
     <w:p>
       <w:pPr>
         <w:pStyle w:val="Heading3"/>
@@ -4417,7 +4506,7 @@
             <w:pPr>
               <w:pStyle w:val="Compact"/>
             </w:pPr>
-            <w:hyperlink r:id="rId42">
+            <w:hyperlink r:id="rId43">
               <w:r>
                 <w:rPr>
                   <w:rStyle w:val="Hyperlink"/>
@@ -4438,7 +4527,7 @@
               </w:rPr>
               <w:t xml:space="preserve"> </w:t>
             </w:r>
-            <w:hyperlink r:id="rId49">
+            <w:hyperlink r:id="rId50">
               <w:r>
                 <w:rPr>
                   <w:rStyle w:val="Hyperlink"/>
@@ -4499,7 +4588,7 @@
             <w:pPr>
               <w:pStyle w:val="Compact"/>
             </w:pPr>
-            <w:hyperlink r:id="rId70">
+            <w:hyperlink r:id="rId72">
               <w:r>
                 <w:rPr>
                   <w:rStyle w:val="Hyperlink"/>
@@ -4520,7 +4609,7 @@
               </w:rPr>
               <w:t xml:space="preserve"> </w:t>
             </w:r>
-            <w:hyperlink r:id="rId71">
+            <w:hyperlink r:id="rId73">
               <w:r>
                 <w:rPr>
                   <w:rStyle w:val="Hyperlink"/>
@@ -4651,7 +4740,7 @@
               </w:rPr>
               <w:t xml:space="preserve"> </w:t>
             </w:r>
-            <w:hyperlink r:id="rId53">
+            <w:hyperlink r:id="rId54">
               <w:r>
                 <w:rPr>
                   <w:rStyle w:val="Hyperlink"/>
@@ -4770,7 +4859,7 @@
             <w:pPr>
               <w:pStyle w:val="Compact"/>
             </w:pPr>
-            <w:hyperlink r:id="rId72">
+            <w:hyperlink r:id="rId74">
               <w:r>
                 <w:rPr>
                   <w:rStyle w:val="Hyperlink"/>
@@ -4971,7 +5060,7 @@
             <w:pPr>
               <w:pStyle w:val="Compact"/>
             </w:pPr>
-            <w:hyperlink r:id="rId73">
+            <w:hyperlink r:id="rId75">
               <w:r>
                 <w:rPr>
                   <w:rStyle w:val="Hyperlink"/>
@@ -4992,7 +5081,7 @@
               </w:rPr>
               <w:t xml:space="preserve"> </w:t>
             </w:r>
-            <w:hyperlink r:id="rId54">
+            <w:hyperlink r:id="rId55">
               <w:r>
                 <w:rPr>
                   <w:rStyle w:val="Hyperlink"/>
@@ -5331,7 +5420,7 @@
         </w:rPr>
         <w:t xml:space="preserve"> </w:t>
       </w:r>
-      <w:hyperlink r:id="rId74">
+      <w:hyperlink r:id="rId76">
         <w:r>
           <w:rPr>
             <w:rStyle w:val="Hyperlink"/>
@@ -5353,8 +5442,8 @@
         <w:t xml:space="preserve">identifies the sources and access limits behind the attribution boundaries. In particular, log-linear/rank identification, binary network tomography, sharp probability bounds, automatic architectural calibration and event/resource-driven reliability modeling predate this work. The final novelty claim must name the declared execution/observation class, supported identification algorithm and linked independent tests, rather than claiming these broader research directions as new.</w:t>
       </w:r>
     </w:p>
-    <w:bookmarkEnd w:id="75"/>
-    <w:bookmarkStart w:id="76" w:name="manual-input-and-integration-inventory"/>
+    <w:bookmarkEnd w:id="77"/>
+    <w:bookmarkStart w:id="78" w:name="manual-input-and-integration-inventory"/>
     <w:p>
       <w:pPr>
         <w:pStyle w:val="Heading3"/>
@@ -5867,7 +5956,7 @@
             <w:pPr>
               <w:pStyle w:val="Compact"/>
             </w:pPr>
-            <w:hyperlink r:id="rId38">
+            <w:hyperlink r:id="rId39">
               <w:r>
                 <w:rPr>
                   <w:rStyle w:val="Hyperlink"/>
@@ -5914,8 +6003,8 @@
         </w:tc>
       </w:tr>
     </w:tbl>
-    <w:bookmarkEnd w:id="76"/>
-    <w:bookmarkStart w:id="77" w:name="Xd813bc0ac44da3215c8dbccccb245cb170c3963"/>
+    <w:bookmarkEnd w:id="78"/>
+    <w:bookmarkStart w:id="79" w:name="Xd813bc0ac44da3215c8dbccccb245cb170c3963"/>
     <w:p>
       <w:pPr>
         <w:pStyle w:val="Heading3"/>
@@ -6017,8 +6106,8 @@
         <w:t xml:space="preserve">Main findings, error/coverage tables, measured costs and final conclusions must be filled from the admitted prospective evidence, with its exact run and source provenance. This table cannot be used to mark those pending conditions complete.</w:t>
       </w:r>
     </w:p>
-    <w:bookmarkEnd w:id="77"/>
-    <w:bookmarkEnd w:id="78"/>
+    <w:bookmarkEnd w:id="79"/>
+    <w:bookmarkEnd w:id="80"/>
     <w:sectPr>
       <w:footnotePr>
         <w:numRestart w:val="eachSect"/>

</xml_diff>

<commit_message>
Complete PMX provenance and bibliography corrections in current review manuscript
</commit_message>
<xml_diff>
--- a/docs/manuscript-v3/manuscript.docx
+++ b/docs/manuscript-v3/manuscript.docx
@@ -497,7 +497,7 @@
         <w:rPr>
           <w:lang w:val="en-GB"/>
         </w:rPr>
-        <w:t xml:space="preserve">Process-mining reliability research similarly combines event and resource-state information with process and failure models. Friederich and Lazarova-Molnar’s 2022 paper specifies such an extraction and parameterization path. Their later SIMPAT article occupies the broader data-driven reliability lifecycle, although the earlier review obtained only its abstract and metadata. We therefore do not infer the absence of detailed identification guarantees from that abstract. These predecessors establish the need to state exactly which observations, execution assumptions and calculation guarantees distinguish the present application class.</w:t>
+        <w:t xml:space="preserve">Process-mining reliability research similarly combines event and resource-state information with process and failure models. Friederich and Lazarova-Molnar’s 2022 paper specifies such an extraction and parameterization path. Their later article in SIMULATION occupies the broader data-driven reliability lifecycle, although the earlier review obtained only its abstract and metadata. We therefore do not infer the absence of detailed identification guarantees from that abstract. These predecessors establish the need to state exactly which observations, execution assumptions and calculation guarantees distinguish the present application class.</w:t>
       </w:r>
       <w:r>
         <w:rPr>
@@ -532,7 +532,7 @@
             <w:rStyle w:val="Hyperlink"/>
             <w:lang w:val="en-GB"/>
           </w:rPr>
-          <w:t xml:space="preserve">SIMPAT article</w:t>
+          <w:t xml:space="preserve">SIMULATION article</w:t>
         </w:r>
       </w:hyperlink>
       <w:r>
@@ -1755,7 +1755,7 @@
         <w:rPr>
           <w:lang w:val="en-GB"/>
         </w:rPr>
-        <w:t xml:space="preserve">E is obtained by conjoining additional Boolean requirements with B. Hence B-E is the indicator of B=1 and E=0; integration gives the identity and its almost-sure equality condition. Pointwise equality on S is sufficient for every supported law. If equality fails at any state in S, a point mass at that state disproves necessity in the opposite direction. These are elementary indicator facts, not a new general probability theorem.</w:t>
+        <w:t xml:space="preserve">E is obtained by conjoining additional Boolean requirements with B. Hence B-E is the indicator of B=1 and E=0; integration gives the identity and its almost-sure equality condition. Pointwise equality on S is sufficient for every supported law. If equality fails at any state in S, a point mass at that state violates equality, proving that pointwise equality is necessary. These are elementary indicator facts, not a new general probability theorem.</w:t>
       </w:r>
     </w:p>
     <w:p>
@@ -3753,7 +3753,7 @@
         <w:rPr>
           <w:lang w:val="en-GB"/>
         </w:rPr>
-        <w:t xml:space="preserve">The first full prospective-pipeline preflight,run</w:t>
+        <w:t xml:space="preserve">The first full prospective-pipeline preflight, run</w:t>
       </w:r>
       <w:r>
         <w:rPr>
@@ -3907,7 +3907,7 @@
         <w:rPr>
           <w:lang w:val="en-GB"/>
         </w:rPr>
-        <w:t xml:space="preserve">The corrected run34447262633 completes all36 workflow jobs and resolves the request-profile interface. Nineteen of20 operation projections qualify, but DeathStarBench split</w:t>
+        <w:t xml:space="preserve">The corrected run 34447262633 completes all 36 workflow jobs and resolves the request-profile interface. Nineteen of 20 operation projections qualify, but DeathStarBench split</w:t>
       </w:r>
       <w:r>
         <w:rPr>
@@ -3932,7 +3932,7 @@
         <w:rPr>
           <w:lang w:val="en-GB"/>
         </w:rPr>
-        <w:t xml:space="preserve">reaches the frozen1800second PMX watchdog and exits124 without a PCM repository. Both PMX variants for that cell are technical failures. The automatic admission check correctly rejects the main launch even though the provider shows a green workflow.</w:t>
+        <w:t xml:space="preserve">reaches the frozen 1800 second PMX watchdog and exits 124 without a PCM repository. Both PMX variants for that cell are technical failures. The automatic admission check correctly rejects the main launch even though the provider shows a green workflow.</w:t>
       </w:r>
     </w:p>
     <w:p>
@@ -3970,7 +3970,7 @@
         <w:rPr>
           <w:lang w:val="en-GB"/>
         </w:rPr>
-        <w:t xml:space="preserve">retains all200 method slots, all21,600 all-sequence test attempts and the exact missing forecasts. Primary PMX has13 points, six valid conditional-local refusals and one technical failure; inclusive PMX has19 points and one failure. Gstar has10 points, eight ambiguous cells and two structural refusals. The successful subchain retains48 known oracle solves and passes1293 other strict provenance/replay/read-order checks. Those checks do not remove the failed admission gates. A separately declared exact-input process diagnostic follows; the cause of the nonterminating process is not inferred from its timeout alone.</w:t>
+        <w:t xml:space="preserve">retains all 200 method slots, all 21,600 all-sequence test attempts and the exact missing forecasts. Primary PMX has 13 points, six valid conditional-local refusals and one technical failure; inclusive PMX has 19 points and one failure. Gstar has 10 points, eight ambiguous cells and two structural refusals. The successful subchain retains 48 known oracle solves and passes 1293 other strict provenance/replay/read-order checks. Those checks do not remove the failed admission gates. A separately declared exact-input process diagnostic follows; the cause of the nonterminating process is not inferred from its timeout alone.</w:t>
       </w:r>
     </w:p>
     <w:bookmarkEnd w:id="60"/>
@@ -4021,18 +4021,18 @@
         <w:rPr>
           <w:lang w:val="en-GB"/>
         </w:rPr>
-        <w:t xml:space="preserve">completes all20 saved application projections and four controls. All19 originally complete projections preserve every resolved field, including resource demands. The failed projection completes in23.08seconds including20seconds of startup. Seven builds yield the same derived JAR.</w:t>
-      </w:r>
-    </w:p>
-    <w:p>
-      <w:pPr>
-        <w:pStyle w:val="BodyText"/>
-      </w:pPr>
-      <w:r>
-        <w:rPr>
-          <w:lang w:val="en-GB"/>
-        </w:rPr>
-        <w:t xml:space="preserve">All48 known solver-oracle records pass. The32 previously supported forecasts remain exactly unchanged, six conditional unsupported slots retain null points/reasons, and two forecasts are recovered. No business test outcome is read in this repair qualification. These results establish a scoped computational repair on development inputs. A newly versioned full-duration preflight using seed771605 must still pass before independent main admission.</w:t>
+        <w:t xml:space="preserve">completes all 20 saved application projections and four controls. All 19 originally complete projections preserve every resolved field, including resource demands. The failed projection completes in 23.08 seconds including 20 seconds of startup. Seven builds yield the same derived JAR.</w:t>
+      </w:r>
+    </w:p>
+    <w:p>
+      <w:pPr>
+        <w:pStyle w:val="BodyText"/>
+      </w:pPr>
+      <w:r>
+        <w:rPr>
+          <w:lang w:val="en-GB"/>
+        </w:rPr>
+        <w:t xml:space="preserve">All 48 known solver-oracle records pass. The 32 previously supported forecasts remain exactly unchanged, six conditional unsupported slots retain null points/reasons, and two forecasts are recovered. No business test outcome is read in this repair qualification. These results establish a scoped computational repair on development inputs. A newly versioned full-duration preflight using seed 771605 must still pass before independent main admission.</w:t>
       </w:r>
     </w:p>
     <w:bookmarkEnd w:id="61"/>
@@ -4368,7 +4368,7 @@
         <w:rPr>
           <w:lang w:val="en-GB"/>
         </w:rPr>
-        <w:t xml:space="preserve">Reproducibility requires preserving the failures that changed the implementation. The first full comparison preflight’s PMX profile-interface failure is retained beside its versioned repair. The H-EXEC immutable-input replay retains the original parser failure and all unchanged outcomes. A successful replay verifies the recorded calculation and input association; it does not create another independent campaign. The final article must preserve any further technical failures, invalid probabilities, empty contrasts and unfavorable results, and base its accuracy conclusions on the audited prospective evidence.</w:t>
+        <w:t xml:space="preserve">Reproducibility requires preserving the failures that changed the implementation. The first full comparison preflight’s PMX profile-interface failure is retained beside its versioned repair. The second preflight exposes a zero-step PMX resource-estimation loop; its separately qualified clock-progress correction preserves all previously supported forecasts on the saved development inputs. That repair is disclosed as a derived binary, and its qualification does not add independent test campaigns. The H-EXEC immutable-input replay retains the original parser failure and all unchanged outcomes. A successful replay verifies the recorded calculation and input association; it does not create another independent campaign. The final article must preserve any further technical failures, invalid probabilities, empty contrasts and unfavorable results, and base its accuracy conclusions on the audited prospective evidence.</w:t>
       </w:r>
     </w:p>
     <w:bookmarkEnd w:id="70"/>
@@ -5152,7 +5152,28 @@
               <w:rPr>
                 <w:lang w:val="en-GB"/>
               </w:rPr>
-              <w:t xml:space="preserve">Retained M9X and Petclinic qualifications; four known-probability controls and per-batch repeatability checks in the prospective workflow</w:t>
+              <w:t xml:space="preserve">Retained M9X and Petclinic qualifications;</w:t>
+            </w:r>
+            <w:r>
+              <w:rPr>
+                <w:lang w:val="en-GB"/>
+              </w:rPr>
+              <w:t xml:space="preserve"> </w:t>
+            </w:r>
+            <w:hyperlink r:id="rId37">
+              <w:r>
+                <w:rPr>
+                  <w:rStyle w:val="Hyperlink"/>
+                  <w:lang w:val="en-GB"/>
+                </w:rPr>
+                <w:t xml:space="preserve">qualified derived PMX repair</w:t>
+              </w:r>
+            </w:hyperlink>
+            <w:r>
+              <w:rPr>
+                <w:lang w:val="en-GB"/>
+              </w:rPr>
+              <w:t xml:space="preserve">; four known-probability controls and per-batch repeatability checks in the prospective workflow</w:t>
             </w:r>
           </w:p>
         </w:tc>

</xml_diff>

<commit_message>
Relate model adequacy to prior SIMPAT validation methods in review manuscript
</commit_message>
<xml_diff>
--- a/docs/manuscript-v3/manuscript.docx
+++ b/docs/manuscript-v3/manuscript.docx
@@ -282,7 +282,7 @@
       </w:r>
     </w:p>
     <w:bookmarkEnd w:id="14"/>
-    <w:bookmarkStart w:id="27" w:name="related-work-and-the-remaining-question"/>
+    <w:bookmarkStart w:id="30" w:name="related-work-and-the-remaining-question"/>
     <w:p>
       <w:pPr>
         <w:pStyle w:val="Heading2"/>
@@ -543,7 +543,7 @@
       </w:r>
     </w:p>
     <w:bookmarkEnd w:id="24"/>
-    <w:bookmarkStart w:id="26" w:name="transport-and-the-scope-of-a-forecast"/>
+    <w:bookmarkStart w:id="27" w:name="X477e812e27c255f4c5e8d8a7a3b9e2814ef439e"/>
     <w:p>
       <w:pPr>
         <w:pStyle w:val="Heading3"/>
@@ -552,6 +552,83 @@
         <w:rPr>
           <w:lang w:val="en-GB"/>
         </w:rPr>
+        <w:t xml:space="preserve">Purpose-specific validity and systematic simulation tests</w:t>
+      </w:r>
+    </w:p>
+    <w:p>
+      <w:pPr>
+        <w:pStyle w:val="FirstParagraph"/>
+      </w:pPr>
+      <w:r>
+        <w:rPr>
+          <w:lang w:val="en-GB"/>
+        </w:rPr>
+        <w:t xml:space="preserve">Purpose-specific adequacy already has formal precedents in Simulation Modelling Practice and Theory. Foures, Albert and Nketsa combine a system model with its experimental frame to assess whether simulation scenarios support the intended purpose. Their input/output-automata approach makes model/context compatibility explicit. Our Boolean simplification condition addresses a narrower probability target, while masked-law identification concerns what telemetry determines; neither replaces the broader experimental-frame viewpoint.</w:t>
+      </w:r>
+      <w:r>
+        <w:rPr>
+          <w:lang w:val="en-GB"/>
+        </w:rPr>
+        <w:t xml:space="preserve"> </w:t>
+      </w:r>
+      <w:hyperlink r:id="rId25">
+        <w:r>
+          <w:rPr>
+            <w:rStyle w:val="Hyperlink"/>
+            <w:lang w:val="en-GB"/>
+          </w:rPr>
+          <w:t xml:space="preserve">Foures et al.</w:t>
+        </w:r>
+      </w:hyperlink>
+      <w:r>
+        <w:rPr>
+          <w:lang w:val="en-GB"/>
+        </w:rPr>
+        <w:t xml:space="preserve">.</w:t>
+      </w:r>
+    </w:p>
+    <w:p>
+      <w:pPr>
+        <w:pStyle w:val="BodyText"/>
+      </w:pPr>
+      <w:r>
+        <w:rPr>
+          <w:lang w:val="en-GB"/>
+        </w:rPr>
+        <w:t xml:space="preserve">Hollmann, Cristiá and Frydman derive simulation-configuration classes from mathematical DEVS specifications to guide systematic validation. Their selection relies on a uniformity hypothesis within each class. Our reduced enumeration has an exact guarantee within its finite completion-conjunction class; application adequacy instead requires the separately measured outcome. Systematic controls, formal calculation and empirical validation therefore retain distinct evidential roles.</w:t>
+      </w:r>
+      <w:r>
+        <w:rPr>
+          <w:lang w:val="en-GB"/>
+        </w:rPr>
+        <w:t xml:space="preserve"> </w:t>
+      </w:r>
+      <w:hyperlink r:id="rId26">
+        <w:r>
+          <w:rPr>
+            <w:rStyle w:val="Hyperlink"/>
+            <w:lang w:val="en-GB"/>
+          </w:rPr>
+          <w:t xml:space="preserve">Hollmann et al.</w:t>
+        </w:r>
+      </w:hyperlink>
+      <w:r>
+        <w:rPr>
+          <w:lang w:val="en-GB"/>
+        </w:rPr>
+        <w:t xml:space="preserve">.</w:t>
+      </w:r>
+    </w:p>
+    <w:bookmarkEnd w:id="27"/>
+    <w:bookmarkStart w:id="29" w:name="transport-and-the-scope-of-a-forecast"/>
+    <w:p>
+      <w:pPr>
+        <w:pStyle w:val="Heading3"/>
+      </w:pPr>
+      <w:r>
+        <w:rPr>
+          <w:lang w:val="en-GB"/>
+        </w:rPr>
         <w:t xml:space="preserve">Transport and the scope of a forecast</w:t>
       </w:r>
     </w:p>
@@ -571,7 +648,7 @@
         </w:rPr>
         <w:t xml:space="preserve"> </w:t>
       </w:r>
-      <w:hyperlink r:id="rId25">
+      <w:hyperlink r:id="rId28">
         <w:r>
           <w:rPr>
             <w:rStyle w:val="Hyperlink"/>
@@ -598,9 +675,9 @@
         <w:t xml:space="preserve">Across these lines, the remaining question is narrower than whether telemetry can produce models. It is when an explicit, automatically identified model has enough semantic and observational support for the requested availability claim, and what a controlled independent comparison establishes about that support. The present study answers the formal and implementation parts for a declared class; its empirical generalization is bounded by the completed mechanisms, the tested operation contracts and the actual support of the prospective comparison.</w:t>
       </w:r>
     </w:p>
-    <w:bookmarkEnd w:id="26"/>
-    <w:bookmarkEnd w:id="27"/>
-    <w:bookmarkStart w:id="42" w:name="methods"/>
+    <w:bookmarkEnd w:id="29"/>
+    <w:bookmarkEnd w:id="30"/>
+    <w:bookmarkStart w:id="45" w:name="methods"/>
     <w:p>
       <w:pPr>
         <w:pStyle w:val="Heading2"/>
@@ -612,7 +689,7 @@
         <w:t xml:space="preserve">Methods</w:t>
       </w:r>
     </w:p>
-    <w:bookmarkStart w:id="29" w:name="estimand-and-unit-of-observation"/>
+    <w:bookmarkStart w:id="32" w:name="estimand-and-unit-of-observation"/>
     <w:p>
       <w:pPr>
         <w:pStyle w:val="Heading3"/>
@@ -640,7 +717,7 @@
         </w:rPr>
         <w:t xml:space="preserve"> </w:t>
       </w:r>
-      <w:hyperlink r:id="rId28">
+      <w:hyperlink r:id="rId31">
         <w:r>
           <w:rPr>
             <w:rStyle w:val="Hyperlink"/>
@@ -684,8 +761,8 @@
         <w:t xml:space="preserve">The comparison uses three applications and ten operations, two declared placements and four failure-law conditions. A campaign is the independent experimental and resampling unit. Requests within a campaign may be dependent. Source-only prediction after a placement change is a different estimand, for which the current implementation does not identify a target probability.</w:t>
       </w:r>
     </w:p>
-    <w:bookmarkEnd w:id="29"/>
-    <w:bookmarkStart w:id="32" w:name="X328c05eadbb2e25dc76fb2ffcd534ad653d1100"/>
+    <w:bookmarkEnd w:id="32"/>
+    <w:bookmarkStart w:id="35" w:name="X328c05eadbb2e25dc76fb2ffcd534ad653d1100"/>
     <w:p>
       <w:pPr>
         <w:pStyle w:val="Heading3"/>
@@ -1564,7 +1641,7 @@
         </w:rPr>
         <w:t xml:space="preserve"> </w:t>
       </w:r>
-      <w:hyperlink r:id="rId30">
+      <w:hyperlink r:id="rId33">
         <w:r>
           <w:rPr>
             <w:rStyle w:val="Hyperlink"/>
@@ -1585,7 +1662,7 @@
         </w:rPr>
         <w:t xml:space="preserve"> </w:t>
       </w:r>
-      <w:hyperlink r:id="rId31">
+      <w:hyperlink r:id="rId34">
         <w:r>
           <w:rPr>
             <w:rStyle w:val="Hyperlink"/>
@@ -1601,8 +1678,8 @@
         <w:t xml:space="preserve">. The prospective wrapper preserves the qualified numeric identification/solve path, while changing campaign identity, expected calibration census and stage timing. It does not tune an unexplained q from semantic labels.</w:t>
       </w:r>
     </w:p>
-    <w:bookmarkEnd w:id="32"/>
-    <w:bookmarkStart w:id="34" w:name="Xaca6518484ef186592f7dceb6ce7ca825ecd5a0"/>
+    <w:bookmarkEnd w:id="35"/>
+    <w:bookmarkStart w:id="37" w:name="Xaca6518484ef186592f7dceb6ce7ca825ecd5a0"/>
     <w:p>
       <w:pPr>
         <w:pStyle w:val="Heading3"/>
@@ -1785,7 +1862,7 @@
         </w:rPr>
         <w:t xml:space="preserve"> </w:t>
       </w:r>
-      <w:hyperlink r:id="rId33">
+      <w:hyperlink r:id="rId36">
         <w:r>
           <w:rPr>
             <w:rStyle w:val="Hyperlink"/>
@@ -1807,8 +1884,8 @@
         <w:t xml:space="preserve">supplies an independent, scoped routing/execution mechanism check. It does not establish every business-equivalence assumption or explain the historical AINA biases. Only this one deep mechanism is selected; the three ablations are not presented as three additional causal hypotheses.</w:t>
       </w:r>
     </w:p>
-    <w:bookmarkEnd w:id="34"/>
-    <w:bookmarkStart w:id="35" w:name="X11d4db10393470adc4e89f2d19b53f4a4ec0d37"/>
+    <w:bookmarkEnd w:id="37"/>
+    <w:bookmarkStart w:id="38" w:name="X11d4db10393470adc4e89f2d19b53f4a4ec0d37"/>
     <w:p>
       <w:pPr>
         <w:pStyle w:val="Heading3"/>
@@ -1933,8 +2010,8 @@
         <w:t xml:space="preserve">Q estimated from a finite calibration sample is not the population observation law. Forecasting a later period also assumes invariance of the relevant law. Identification bounds, calibration sampling error, between-campaign uncertainty and semantic misspecification are distinct. The earlier independent-primitive/monomial identification results belong to their own restricted model class and are not silently transferred to this joint execution estimator.</w:t>
       </w:r>
     </w:p>
-    <w:bookmarkEnd w:id="35"/>
-    <w:bookmarkStart w:id="38" w:name="comparators-and-information-access"/>
+    <w:bookmarkEnd w:id="38"/>
+    <w:bookmarkStart w:id="41" w:name="comparators-and-information-access"/>
     <w:p>
       <w:pPr>
         <w:pStyle w:val="Heading3"/>
@@ -1962,7 +2039,7 @@
         </w:rPr>
         <w:t xml:space="preserve"> </w:t>
       </w:r>
-      <w:hyperlink r:id="rId36">
+      <w:hyperlink r:id="rId39">
         <w:r>
           <w:rPr>
             <w:rStyle w:val="Hyperlink"/>
@@ -2030,7 +2107,7 @@
         </w:rPr>
         <w:t xml:space="preserve"> </w:t>
       </w:r>
-      <w:hyperlink r:id="rId37">
+      <w:hyperlink r:id="rId40">
         <w:r>
           <w:rPr>
             <w:rStyle w:val="Hyperlink"/>
@@ -2063,8 +2140,8 @@
         <w:t xml:space="preserve">These differences form an information-access comparison, not a claim that every method estimates the same state parameters from identical fields. The external target Y, campaign identities, calibration/test separation and error analysis are shared.</w:t>
       </w:r>
     </w:p>
-    <w:bookmarkEnd w:id="38"/>
-    <w:bookmarkStart w:id="40" w:name="X484a2fe3fff0944d95f760688e0f50071d288e3"/>
+    <w:bookmarkEnd w:id="41"/>
+    <w:bookmarkStart w:id="43" w:name="X484a2fe3fff0944d95f760688e0f50071d288e3"/>
     <w:p>
       <w:pPr>
         <w:pStyle w:val="Heading3"/>
@@ -2125,7 +2202,7 @@
         </w:rPr>
         <w:t xml:space="preserve"> </w:t>
       </w:r>
-      <w:hyperlink r:id="rId39">
+      <w:hyperlink r:id="rId42">
         <w:r>
           <w:rPr>
             <w:rStyle w:val="Hyperlink"/>
@@ -2169,8 +2246,8 @@
         <w:t xml:space="preserve">For every planned source-to-other-placement direction, the current implementation reports transfer as unsupported: null target point/error, unrestricted target-event bounds [0,1], and change bounds relative to a source point where available. Observed target outcomes and changes are opened only for evaluation. These no-information bounds are neither useful transfer forecasts nor confidence intervals. The zero point-coverage result is an explicit limitation, not an omitted experiment or a refit advertised as transport.</w:t>
       </w:r>
     </w:p>
-    <w:bookmarkEnd w:id="40"/>
-    <w:bookmarkStart w:id="41" w:name="X25ff07b890f17560f8efd0d619947e51038bbe6"/>
+    <w:bookmarkEnd w:id="43"/>
+    <w:bookmarkStart w:id="44" w:name="X25ff07b890f17560f8efd0d619947e51038bbe6"/>
     <w:p>
       <w:pPr>
         <w:pStyle w:val="Heading3"/>
@@ -2242,9 +2319,9 @@
         <w:t xml:space="preserve">records which publication claims are already supportable and which await the prospective results.</w:t>
       </w:r>
     </w:p>
-    <w:bookmarkEnd w:id="41"/>
-    <w:bookmarkEnd w:id="42"/>
-    <w:bookmarkStart w:id="64" w:name="results"/>
+    <w:bookmarkEnd w:id="44"/>
+    <w:bookmarkEnd w:id="45"/>
+    <w:bookmarkStart w:id="67" w:name="results"/>
     <w:p>
       <w:pPr>
         <w:pStyle w:val="Heading2"/>
@@ -2256,7 +2333,7 @@
         <w:t xml:space="preserve">Results</w:t>
       </w:r>
     </w:p>
-    <w:bookmarkStart w:id="52" w:name="X67f9ab04a00b5bf3e8d2d0acf7f8e15f0435ced"/>
+    <w:bookmarkStart w:id="55" w:name="X67f9ab04a00b5bf3e8d2d0acf7f8e15f0435ced"/>
     <w:p>
       <w:pPr>
         <w:pStyle w:val="Heading3"/>
@@ -2295,7 +2372,7 @@
         </w:rPr>
         <w:t xml:space="preserve"> </w:t>
       </w:r>
-      <w:hyperlink r:id="rId43">
+      <w:hyperlink r:id="rId46">
         <w:r>
           <w:rPr>
             <w:rStyle w:val="Hyperlink"/>
@@ -2714,18 +2791,18 @@
           <wp:inline>
             <wp:extent cx="5334000" cy="2163233"/>
             <wp:effectExtent b="0" l="0" r="0" t="0"/>
-            <wp:docPr descr="Historical AINA aggregate estimates, observed probe frequencies and signed differences" title="" id="45" name="Picture"/>
+            <wp:docPr descr="Historical AINA aggregate estimates, observed probe frequencies and signed differences" title="" id="48" name="Picture"/>
             <a:graphic>
               <a:graphicData uri="http://schemas.openxmlformats.org/drawingml/2006/picture">
                 <pic:pic>
                   <pic:nvPicPr>
-                    <pic:cNvPr descr="../figures/aina-audit-v3-review.png" id="46" name="Picture"/>
+                    <pic:cNvPr descr="../figures/aina-audit-v3-review.png" id="49" name="Picture"/>
                     <pic:cNvPicPr>
                       <a:picLocks noChangeArrowheads="1" noChangeAspect="1"/>
                     </pic:cNvPicPr>
                   </pic:nvPicPr>
                   <pic:blipFill>
-                    <a:blip r:embed="rId44"/>
+                    <a:blip r:embed="rId47"/>
                     <a:stretch>
                       <a:fillRect/>
                     </a:stretch>
@@ -2772,7 +2849,7 @@
         </w:rPr>
         <w:t xml:space="preserve"> </w:t>
       </w:r>
-      <w:hyperlink r:id="rId47">
+      <w:hyperlink r:id="rId50">
         <w:r>
           <w:rPr>
             <w:rStyle w:val="Hyperlink"/>
@@ -2799,7 +2876,7 @@
         </w:rPr>
         <w:t xml:space="preserve"> </w:t>
       </w:r>
-      <w:hyperlink r:id="rId48">
+      <w:hyperlink r:id="rId51">
         <w:r>
           <w:rPr>
             <w:rStyle w:val="Hyperlink"/>
@@ -2826,7 +2903,7 @@
         </w:rPr>
         <w:t xml:space="preserve"> </w:t>
       </w:r>
-      <w:hyperlink r:id="rId49">
+      <w:hyperlink r:id="rId52">
         <w:r>
           <w:rPr>
             <w:rStyle w:val="Hyperlink"/>
@@ -2870,7 +2947,7 @@
         </w:rPr>
         <w:t xml:space="preserve"> </w:t>
       </w:r>
-      <w:hyperlink r:id="rId50">
+      <w:hyperlink r:id="rId53">
         <w:r>
           <w:rPr>
             <w:rStyle w:val="Hyperlink"/>
@@ -2919,7 +2996,7 @@
         </w:rPr>
         <w:t xml:space="preserve"> </w:t>
       </w:r>
-      <w:hyperlink r:id="rId51">
+      <w:hyperlink r:id="rId54">
         <w:r>
           <w:rPr>
             <w:rStyle w:val="Hyperlink"/>
@@ -2941,8 +3018,8 @@
         <w:t xml:space="preserve">examines the documented controller period, sequential probes and timeout configuration. Conditional duration lower bounds exceed the nominal 60-second controller period in 3,483 of 25,000 windows. These bounds indicate a measurement-alignment concern, but do not reconstruct actual per-probe times or establish exact fault overlap. Original application images/runtime identity are not fully pinned. The discrepancy is reproducible as an observation; its historical cause is not established by these checks.</w:t>
       </w:r>
     </w:p>
-    <w:bookmarkEnd w:id="52"/>
-    <w:bookmarkStart w:id="53" w:name="X5cce87afd976305cd1d2593d1b87bff3354d54c"/>
+    <w:bookmarkEnd w:id="55"/>
+    <w:bookmarkStart w:id="56" w:name="X5cce87afd976305cd1d2593d1b87bff3354d54c"/>
     <w:p>
       <w:pPr>
         <w:pStyle w:val="Heading3"/>
@@ -3200,7 +3277,7 @@
         </w:rPr>
         <w:t xml:space="preserve"> </w:t>
       </w:r>
-      <w:hyperlink r:id="rId33">
+      <w:hyperlink r:id="rId36">
         <w:r>
           <w:rPr>
             <w:rStyle w:val="Hyperlink"/>
@@ -3233,8 +3310,8 @@
         <w:t xml:space="preserve">The initial study gate qualified 31/32 cells because one native-parser cleanliness check failed. A separately versioned replay on the final immutable uploaded inputs qualified the remaining cell while preserving all request outcomes and inferential results. A concurrent append is a plausible explanation for the original parser failure, but the precise bytes observed at that moment were not retained. This repair is evidence about input integrity, not another independent experiment or an extra block. The result supports one scoped mechanism; it neither identifies a mediation fraction nor explains the historical AINA bias.</w:t>
       </w:r>
     </w:p>
-    <w:bookmarkEnd w:id="53"/>
-    <w:bookmarkStart w:id="56" w:name="Xa4f2a1b99eb38c03a1b89ff95f05a6c035af07d"/>
+    <w:bookmarkEnd w:id="56"/>
+    <w:bookmarkStart w:id="59" w:name="Xa4f2a1b99eb38c03a1b89ff95f05a6c035af07d"/>
     <w:p>
       <w:pPr>
         <w:pStyle w:val="Heading3"/>
@@ -3661,7 +3738,7 @@
         </w:rPr>
         <w:t xml:space="preserve"> </w:t>
       </w:r>
-      <w:hyperlink r:id="rId54">
+      <w:hyperlink r:id="rId57">
         <w:r>
           <w:rPr>
             <w:rStyle w:val="Hyperlink"/>
@@ -3710,7 +3787,7 @@
         </w:rPr>
         <w:t xml:space="preserve"> </w:t>
       </w:r>
-      <w:hyperlink r:id="rId55">
+      <w:hyperlink r:id="rId58">
         <w:r>
           <w:rPr>
             <w:rStyle w:val="Hyperlink"/>
@@ -3732,8 +3809,8 @@
         <w:t xml:space="preserve">supplies ten point forecasts, ten exact saved-model replays and 41 structural controls. Its fixed-k quantization and all-attempt eligibility-based parameterization are explicit. The earlier AINA probability law is not silently represented as an unchanged application of the new observation contract.</w:t>
       </w:r>
     </w:p>
-    <w:bookmarkEnd w:id="56"/>
-    <w:bookmarkStart w:id="62" w:name="Xa62ec04076493218a52dd8cbbbb18cadd750d5c"/>
+    <w:bookmarkEnd w:id="59"/>
+    <w:bookmarkStart w:id="65" w:name="Xa62ec04076493218a52dd8cbbbb18cadd750d5c"/>
     <w:p>
       <w:pPr>
         <w:pStyle w:val="Heading3"/>
@@ -3827,7 +3904,7 @@
         </w:rPr>
         <w:t xml:space="preserve"> </w:t>
       </w:r>
-      <w:hyperlink r:id="rId57">
+      <w:hyperlink r:id="rId60">
         <w:r>
           <w:rPr>
             <w:rStyle w:val="Hyperlink"/>
@@ -3865,7 +3942,7 @@
         </w:rPr>
         <w:t xml:space="preserve"> </w:t>
       </w:r>
-      <w:hyperlink r:id="rId58">
+      <w:hyperlink r:id="rId61">
         <w:r>
           <w:rPr>
             <w:rStyle w:val="Hyperlink"/>
@@ -3887,7 +3964,7 @@
         <w:t xml:space="preserve">derives the legacy wrapper’s profile from the sealed campaign identity, preserves the eight-field input files and rejects extra fields. Exact-schema controls reproduce the original error and show equivalence to the qualified legacy projection with that metadata supplied explicitly. It changes no graph functional, native observation, PMX failure policy or outcome. Its full-duration preflight uses a new registered seed and namespace; v1 is preserved as failed development evidence.</w:t>
       </w:r>
     </w:p>
-    <w:bookmarkStart w:id="60" w:name="X880e93b24695459a513dfacfeebfbf3589e2f3b"/>
+    <w:bookmarkStart w:id="63" w:name="X880e93b24695459a513dfacfeebfbf3589e2f3b"/>
     <w:p>
       <w:pPr>
         <w:pStyle w:val="Heading4"/>
@@ -3951,7 +4028,7 @@
         </w:rPr>
         <w:t xml:space="preserve"> </w:t>
       </w:r>
-      <w:hyperlink r:id="rId59">
+      <w:hyperlink r:id="rId62">
         <w:r>
           <w:rPr>
             <w:rStyle w:val="Hyperlink"/>
@@ -3973,8 +4050,8 @@
         <w:t xml:space="preserve">retains all 200 method slots, all 21,600 all-sequence test attempts and the exact missing forecasts. Primary PMX has 13 points, six valid conditional-local refusals and one technical failure; inclusive PMX has 19 points and one failure. Gstar has 10 points, eight ambiguous cells and two structural refusals. The successful subchain retains 48 known oracle solves and passes 1293 other strict provenance/replay/read-order checks. Those checks do not remove the failed admission gates. A separately declared exact-input process diagnostic follows; the cause of the nonterminating process is not inferred from its timeout alone.</w:t>
       </w:r>
     </w:p>
-    <w:bookmarkEnd w:id="60"/>
-    <w:bookmarkStart w:id="61" w:name="Xf831647aee167505ae71107c3ae6e0b2616b92b"/>
+    <w:bookmarkEnd w:id="63"/>
+    <w:bookmarkStart w:id="64" w:name="Xf831647aee167505ae71107c3ae6e0b2616b92b"/>
     <w:p>
       <w:pPr>
         <w:pStyle w:val="Heading4"/>
@@ -4002,7 +4079,7 @@
         </w:rPr>
         <w:t xml:space="preserve"> </w:t>
       </w:r>
-      <w:hyperlink r:id="rId37">
+      <w:hyperlink r:id="rId40">
         <w:r>
           <w:rPr>
             <w:rStyle w:val="Hyperlink"/>
@@ -4035,9 +4112,9 @@
         <w:t xml:space="preserve">All 48 known solver-oracle records pass. The 32 previously supported forecasts remain exactly unchanged, six conditional unsupported slots retain null points/reasons, and two forecasts are recovered. No business test outcome is read in this repair qualification. These results establish a scoped computational repair on development inputs. A newly versioned full-duration preflight using seed 771605 must still pass before independent main admission.</w:t>
       </w:r>
     </w:p>
-    <w:bookmarkEnd w:id="61"/>
-    <w:bookmarkEnd w:id="62"/>
-    <w:bookmarkStart w:id="63" w:name="Xfca87b76d71a9eeeedfed17811310ea13fd4e43"/>
+    <w:bookmarkEnd w:id="64"/>
+    <w:bookmarkEnd w:id="65"/>
+    <w:bookmarkStart w:id="66" w:name="Xfca87b76d71a9eeeedfed17811310ea13fd4e43"/>
     <w:p>
       <w:pPr>
         <w:pStyle w:val="Heading3"/>
@@ -4071,9 +4148,9 @@
         <w:t xml:space="preserve">The final main section must report all 800 planned operation cells per method, support and absence reasons, own/common-support errors, the six prespecified paired contrasts, all-sequence/stable distinctions, source-only transfer coverage, measured stage/process costs and unresolved quantities. The reported source-only transfer procedure currently identifies no target point under an unrestricted changed joint law. That limitation must remain visible alongside current-campaign results, and target-calibrated rebuilding must not be relabelled as transfer.</w:t>
       </w:r>
     </w:p>
-    <w:bookmarkEnd w:id="63"/>
-    <w:bookmarkEnd w:id="64"/>
-    <w:bookmarkStart w:id="71" w:name="discussion"/>
+    <w:bookmarkEnd w:id="66"/>
+    <w:bookmarkEnd w:id="67"/>
+    <w:bookmarkStart w:id="74" w:name="discussion"/>
     <w:p>
       <w:pPr>
         <w:pStyle w:val="Heading2"/>
@@ -4085,7 +4162,7 @@
         <w:t xml:space="preserve">Discussion</w:t>
       </w:r>
     </w:p>
-    <w:bookmarkStart w:id="65" w:name="X9d6b68513f878977fec1830a6879ec8b9936a8e"/>
+    <w:bookmarkStart w:id="68" w:name="X9d6b68513f878977fec1830a6879ec8b9936a8e"/>
     <w:p>
       <w:pPr>
         <w:pStyle w:val="Heading3"/>
@@ -4130,8 +4207,8 @@
         <w:t xml:space="preserve">The practical output is therefore conditional. A reachability forecast is justified as an execution forecast only under its stated event equivalence. An execution forecast is justified as a business forecast only under the additional operation contract and measurement assumptions. Independent error and coverage tables assess the latter relationship on their supported application conditions. The present procedure does not automatically select a universally smallest adequate model.</w:t>
       </w:r>
     </w:p>
-    <w:bookmarkEnd w:id="65"/>
-    <w:bookmarkStart w:id="66" w:name="identification-and-observation-quality"/>
+    <w:bookmarkEnd w:id="68"/>
+    <w:bookmarkStart w:id="69" w:name="identification-and-observation-quality"/>
     <w:p>
       <w:pPr>
         <w:pStyle w:val="Heading3"/>
@@ -4176,8 +4253,8 @@
         <w:t xml:space="preserve">The support policy is deliberately observable. Every calibration attempt enters the denominator, including failures, timeouts and untraced attempts. Missing evidence can widen a bound or prevent structural binding; it does not disappear by conditioning on complete traces. This avoids one form of selective reporting, but does not establish that the available instrumentation identifies all requested functionals. The independent results must show point coverage, the reasons for ambiguity, structural refusal and technical failure alongside error. Technical failures remain distinct from a valid method-level refusal to identify a point.</w:t>
       </w:r>
     </w:p>
-    <w:bookmarkEnd w:id="66"/>
-    <w:bookmarkStart w:id="67" w:name="causal-scope-and-guard-ablations"/>
+    <w:bookmarkEnd w:id="69"/>
+    <w:bookmarkStart w:id="70" w:name="causal-scope-and-guard-ablations"/>
     <w:p>
       <w:pPr>
         <w:pStyle w:val="Heading3"/>
@@ -4222,8 +4299,8 @@
         <w:t xml:space="preserve">Historical timing bounds are likewise diagnostic rather than causal. They show that some conditional duration lower bounds are incompatible with treating every original probe window as wholly contained in one short controller period. They do not reconstruct actual probe timestamps or assign an unobserved overlap to a particular failure. The historical biases motivate this investigation while retaining their unresolved causal attribution.</w:t>
       </w:r>
     </w:p>
-    <w:bookmarkEnd w:id="67"/>
-    <w:bookmarkStart w:id="68" w:name="interpreting-independent-comparisons"/>
+    <w:bookmarkEnd w:id="70"/>
+    <w:bookmarkStart w:id="71" w:name="interpreting-independent-comparisons"/>
     <w:p>
       <w:pPr>
         <w:pStyle w:val="Heading3"/>
@@ -4279,8 +4356,8 @@
         <w:t xml:space="preserve">The all-sequence result is primary. The stable view uses the same frozen forecast on a separately reported, bracketed subset of attempts, and can change the observed operating-condition mix. It does not rescue an unsuccessful primary forecast or exclude every DOWN state. Differences between the views are interpreted with their retained fractions and condition coverage.</w:t>
       </w:r>
     </w:p>
-    <w:bookmarkEnd w:id="68"/>
-    <w:bookmarkStart w:id="69" w:name="transfer-cost-and-automation"/>
+    <w:bookmarkEnd w:id="71"/>
+    <w:bookmarkStart w:id="72" w:name="transfer-cost-and-automation"/>
     <w:p>
       <w:pPr>
         <w:pStyle w:val="Heading3"/>
@@ -4325,8 +4402,8 @@
         <w:t xml:space="preserve">Automation begins after several manual choices: the external success contract, source error-propagation rules, required and optional call groups, peer identity declarations, fault/placement class and comparator adapters. The downstream extraction, identification, calculation, replay and scoring are automated under those declarations. This scope is useful and reproducible, but does not establish fully automatic integration of an unfamiliar application. Low CPU time alone is not evidence of low total integration or monitoring cost.</w:t>
       </w:r>
     </w:p>
-    <w:bookmarkEnd w:id="69"/>
-    <w:bookmarkStart w:id="70" w:name="generalization-and-reproducibility"/>
+    <w:bookmarkEnd w:id="72"/>
+    <w:bookmarkStart w:id="73" w:name="generalization-and-reproducibility"/>
     <w:p>
       <w:pPr>
         <w:pStyle w:val="Heading3"/>
@@ -4371,9 +4448,9 @@
         <w:t xml:space="preserve">Reproducibility requires preserving the failures that changed the implementation. The first full comparison preflight’s PMX profile-interface failure is retained beside its versioned repair. The second preflight exposes a zero-step PMX resource-estimation loop; its separately qualified clock-progress correction preserves all previously supported forecasts on the saved development inputs. That repair is disclosed as a derived binary, and its qualification does not add independent test campaigns. The H-EXEC immutable-input replay retains the original parser failure and all unchanged outcomes. A successful replay verifies the recorded calculation and input association; it does not create another independent campaign. The final article must preserve any further technical failures, invalid probabilities, empty contrasts and unfavorable results, and base its accuracy conclusions on the audited prospective evidence.</w:t>
       </w:r>
     </w:p>
-    <w:bookmarkEnd w:id="70"/>
-    <w:bookmarkEnd w:id="71"/>
-    <w:bookmarkStart w:id="80" w:name="Xca5978b00292db4c29cfb3375589ea70af0cfb1"/>
+    <w:bookmarkEnd w:id="73"/>
+    <w:bookmarkEnd w:id="74"/>
+    <w:bookmarkStart w:id="84" w:name="Xca5978b00292db4c29cfb3375589ea70af0cfb1"/>
     <w:p>
       <w:pPr>
         <w:pStyle w:val="Heading2"/>
@@ -4385,7 +4462,7 @@
         <w:t xml:space="preserve">Appendix: contribution and evidence boundaries</w:t>
       </w:r>
     </w:p>
-    <w:bookmarkStart w:id="77" w:name="contribution-and-evidence-table"/>
+    <w:bookmarkStart w:id="81" w:name="contribution-and-evidence-table"/>
     <w:p>
       <w:pPr>
         <w:pStyle w:val="Heading3"/>
@@ -4506,7 +4583,7 @@
             <w:pPr>
               <w:pStyle w:val="Compact"/>
             </w:pPr>
-            <w:hyperlink r:id="rId43">
+            <w:hyperlink r:id="rId46">
               <w:r>
                 <w:rPr>
                   <w:rStyle w:val="Hyperlink"/>
@@ -4527,7 +4604,7 @@
               </w:rPr>
               <w:t xml:space="preserve"> </w:t>
             </w:r>
-            <w:hyperlink r:id="rId50">
+            <w:hyperlink r:id="rId53">
               <w:r>
                 <w:rPr>
                   <w:rStyle w:val="Hyperlink"/>
@@ -4588,7 +4665,7 @@
             <w:pPr>
               <w:pStyle w:val="Compact"/>
             </w:pPr>
-            <w:hyperlink r:id="rId72">
+            <w:hyperlink r:id="rId75">
               <w:r>
                 <w:rPr>
                   <w:rStyle w:val="Hyperlink"/>
@@ -4609,7 +4686,7 @@
               </w:rPr>
               <w:t xml:space="preserve"> </w:t>
             </w:r>
-            <w:hyperlink r:id="rId73">
+            <w:hyperlink r:id="rId76">
               <w:r>
                 <w:rPr>
                   <w:rStyle w:val="Hyperlink"/>
@@ -4740,7 +4817,7 @@
               </w:rPr>
               <w:t xml:space="preserve"> </w:t>
             </w:r>
-            <w:hyperlink r:id="rId54">
+            <w:hyperlink r:id="rId57">
               <w:r>
                 <w:rPr>
                   <w:rStyle w:val="Hyperlink"/>
@@ -4859,7 +4936,7 @@
             <w:pPr>
               <w:pStyle w:val="Compact"/>
             </w:pPr>
-            <w:hyperlink r:id="rId74">
+            <w:hyperlink r:id="rId77">
               <w:r>
                 <w:rPr>
                   <w:rStyle w:val="Hyperlink"/>
@@ -4926,7 +5003,7 @@
             <w:pPr>
               <w:pStyle w:val="Compact"/>
             </w:pPr>
-            <w:hyperlink r:id="rId33">
+            <w:hyperlink r:id="rId36">
               <w:r>
                 <w:rPr>
                   <w:rStyle w:val="Hyperlink"/>
@@ -4993,7 +5070,7 @@
             <w:pPr>
               <w:pStyle w:val="Compact"/>
             </w:pPr>
-            <w:hyperlink r:id="rId36">
+            <w:hyperlink r:id="rId39">
               <w:r>
                 <w:rPr>
                   <w:rStyle w:val="Hyperlink"/>
@@ -5060,7 +5137,7 @@
             <w:pPr>
               <w:pStyle w:val="Compact"/>
             </w:pPr>
-            <w:hyperlink r:id="rId75">
+            <w:hyperlink r:id="rId78">
               <w:r>
                 <w:rPr>
                   <w:rStyle w:val="Hyperlink"/>
@@ -5081,7 +5158,7 @@
               </w:rPr>
               <w:t xml:space="preserve"> </w:t>
             </w:r>
-            <w:hyperlink r:id="rId55">
+            <w:hyperlink r:id="rId58">
               <w:r>
                 <w:rPr>
                   <w:rStyle w:val="Hyperlink"/>
@@ -5160,7 +5237,7 @@
               </w:rPr>
               <w:t xml:space="preserve"> </w:t>
             </w:r>
-            <w:hyperlink r:id="rId37">
+            <w:hyperlink r:id="rId40">
               <w:r>
                 <w:rPr>
                   <w:rStyle w:val="Hyperlink"/>
@@ -5441,7 +5518,7 @@
         </w:rPr>
         <w:t xml:space="preserve"> </w:t>
       </w:r>
-      <w:hyperlink r:id="rId76">
+      <w:hyperlink r:id="rId79">
         <w:r>
           <w:rPr>
             <w:rStyle w:val="Hyperlink"/>
@@ -5460,11 +5537,38 @@
         <w:rPr>
           <w:lang w:val="en-GB"/>
         </w:rPr>
-        <w:t xml:space="preserve">identifies the sources and access limits behind the attribution boundaries. In particular, log-linear/rank identification, binary network tomography, sharp probability bounds, automatic architectural calibration and event/resource-driven reliability modeling predate this work. The final novelty claim must name the declared execution/observation class, supported identification algorithm and linked independent tests, rather than claiming these broader research directions as new.</w:t>
-      </w:r>
-    </w:p>
-    <w:bookmarkEnd w:id="77"/>
-    <w:bookmarkStart w:id="78" w:name="manual-input-and-integration-inventory"/>
+        <w:t xml:space="preserve">and</w:t>
+      </w:r>
+      <w:r>
+        <w:rPr>
+          <w:lang w:val="en-GB"/>
+        </w:rPr>
+        <w:t xml:space="preserve"> </w:t>
+      </w:r>
+      <w:hyperlink r:id="rId80">
+        <w:r>
+          <w:rPr>
+            <w:rStyle w:val="Hyperlink"/>
+            <w:lang w:val="en-GB"/>
+          </w:rPr>
+          <w:t xml:space="preserve">validation addendum</w:t>
+        </w:r>
+      </w:hyperlink>
+      <w:r>
+        <w:rPr>
+          <w:lang w:val="en-GB"/>
+        </w:rPr>
+        <w:t xml:space="preserve"> </w:t>
+      </w:r>
+      <w:r>
+        <w:rPr>
+          <w:lang w:val="en-GB"/>
+        </w:rPr>
+        <w:t xml:space="preserve">identify the sources and access limits behind the attribution boundaries. In particular, log-linear/rank identification, binary network tomography, sharp probability bounds, automatic architectural calibration and event/resource-driven reliability modeling predate this work. The final novelty claim must name the declared execution/observation class, supported identification algorithm and linked independent tests, rather than claiming these broader research directions as new.</w:t>
+      </w:r>
+    </w:p>
+    <w:bookmarkEnd w:id="81"/>
+    <w:bookmarkStart w:id="82" w:name="manual-input-and-integration-inventory"/>
     <w:p>
       <w:pPr>
         <w:pStyle w:val="Heading3"/>
@@ -5582,7 +5686,7 @@
             <w:pPr>
               <w:pStyle w:val="Compact"/>
             </w:pPr>
-            <w:hyperlink r:id="rId28">
+            <w:hyperlink r:id="rId31">
               <w:r>
                 <w:rPr>
                   <w:rStyle w:val="Hyperlink"/>
@@ -5714,7 +5818,7 @@
             <w:pPr>
               <w:pStyle w:val="Compact"/>
             </w:pPr>
-            <w:hyperlink r:id="rId30">
+            <w:hyperlink r:id="rId33">
               <w:r>
                 <w:rPr>
                   <w:rStyle w:val="Hyperlink"/>
@@ -5852,7 +5956,7 @@
             <w:pPr>
               <w:pStyle w:val="Compact"/>
             </w:pPr>
-            <w:hyperlink r:id="rId36">
+            <w:hyperlink r:id="rId39">
               <w:r>
                 <w:rPr>
                   <w:rStyle w:val="Hyperlink"/>
@@ -5977,7 +6081,7 @@
             <w:pPr>
               <w:pStyle w:val="Compact"/>
             </w:pPr>
-            <w:hyperlink r:id="rId39">
+            <w:hyperlink r:id="rId42">
               <w:r>
                 <w:rPr>
                   <w:rStyle w:val="Hyperlink"/>
@@ -6024,8 +6128,8 @@
         </w:tc>
       </w:tr>
     </w:tbl>
-    <w:bookmarkEnd w:id="78"/>
-    <w:bookmarkStart w:id="79" w:name="Xd813bc0ac44da3215c8dbccccb245cb170c3963"/>
+    <w:bookmarkEnd w:id="82"/>
+    <w:bookmarkStart w:id="83" w:name="Xd813bc0ac44da3215c8dbccccb245cb170c3963"/>
     <w:p>
       <w:pPr>
         <w:pStyle w:val="Heading3"/>
@@ -6127,8 +6231,8 @@
         <w:t xml:space="preserve">Main findings, error/coverage tables, measured costs and final conclusions must be filled from the admitted prospective evidence, with its exact run and source provenance. This table cannot be used to mark those pending conditions complete.</w:t>
       </w:r>
     </w:p>
-    <w:bookmarkEnd w:id="79"/>
-    <w:bookmarkEnd w:id="80"/>
+    <w:bookmarkEnd w:id="83"/>
+    <w:bookmarkEnd w:id="84"/>
     <w:sectPr>
       <w:footnotePr>
         <w:numRestart w:val="eachSect"/>

</xml_diff>

<commit_message>
Include source-linked bibliography in the integrated article
</commit_message>
<xml_diff>
--- a/docs/manuscript-v3/manuscript.docx
+++ b/docs/manuscript-v3/manuscript.docx
@@ -4450,7 +4450,7 @@
     </w:p>
     <w:bookmarkEnd w:id="73"/>
     <w:bookmarkEnd w:id="74"/>
-    <w:bookmarkStart w:id="84" w:name="Xca5978b00292db4c29cfb3375589ea70af0cfb1"/>
+    <w:bookmarkStart w:id="82" w:name="references"/>
     <w:p>
       <w:pPr>
         <w:pStyle w:val="Heading2"/>
@@ -4459,10 +4459,772 @@
         <w:rPr>
           <w:lang w:val="en-GB"/>
         </w:rPr>
+        <w:t xml:space="preserve">References</w:t>
+      </w:r>
+    </w:p>
+    <w:p>
+      <w:pPr>
+        <w:pStyle w:val="FirstParagraph"/>
+      </w:pPr>
+      <w:r>
+        <w:rPr>
+          <w:lang w:val="en-GB"/>
+        </w:rPr>
+        <w:t xml:space="preserve">Boros, E., and Lee, J. (2025).</w:t>
+      </w:r>
+      <w:r>
+        <w:rPr>
+          <w:lang w:val="en-GB"/>
+        </w:rPr>
+        <w:t xml:space="preserve"> </w:t>
+      </w:r>
+      <w:r>
+        <w:rPr>
+          <w:i/>
+          <w:iCs/>
+          <w:lang w:val="en-GB"/>
+        </w:rPr>
+        <w:t xml:space="preserve">Boole’s probability bounding problem, linear programming aggregations, and nonnegative quadratic pseudo-Boolean functions</w:t>
+      </w:r>
+      <w:r>
+        <w:rPr>
+          <w:lang w:val="en-GB"/>
+        </w:rPr>
+        <w:t xml:space="preserve">. arXiv:2110.10672v4, revised 24 January 2025; original preprint 2021.</w:t>
+      </w:r>
+      <w:r>
+        <w:rPr>
+          <w:lang w:val="en-GB"/>
+        </w:rPr>
+        <w:t xml:space="preserve"> </w:t>
+      </w:r>
+      <w:hyperlink r:id="rId75">
+        <w:r>
+          <w:rPr>
+            <w:rStyle w:val="Hyperlink"/>
+            <w:lang w:val="en-GB"/>
+          </w:rPr>
+          <w:t xml:space="preserve">Version cited</w:t>
+        </w:r>
+      </w:hyperlink>
+      <w:r>
+        <w:rPr>
+          <w:lang w:val="en-GB"/>
+        </w:rPr>
+        <w:t xml:space="preserve">.</w:t>
+      </w:r>
+    </w:p>
+    <w:p>
+      <w:pPr>
+        <w:pStyle w:val="BodyText"/>
+      </w:pPr>
+      <w:r>
+        <w:rPr>
+          <w:lang w:val="en-GB"/>
+        </w:rPr>
+        <w:t xml:space="preserve">Bu, T., Duffield, N., Lo Presti, F., and Towsley, D. (2002).</w:t>
+      </w:r>
+      <w:r>
+        <w:rPr>
+          <w:lang w:val="en-GB"/>
+        </w:rPr>
+        <w:t xml:space="preserve"> </w:t>
+      </w:r>
+      <w:r>
+        <w:rPr>
+          <w:i/>
+          <w:iCs/>
+          <w:lang w:val="en-GB"/>
+        </w:rPr>
+        <w:t xml:space="preserve">Network Tomography on General Topologies</w:t>
+      </w:r>
+      <w:r>
+        <w:rPr>
+          <w:lang w:val="en-GB"/>
+        </w:rPr>
+        <w:t xml:space="preserve">. Proceedings of ACM SIGMETRICS 2002.</w:t>
+      </w:r>
+      <w:r>
+        <w:rPr>
+          <w:lang w:val="en-GB"/>
+        </w:rPr>
+        <w:t xml:space="preserve"> </w:t>
+      </w:r>
+      <w:hyperlink r:id="rId15">
+        <w:r>
+          <w:rPr>
+            <w:rStyle w:val="Hyperlink"/>
+            <w:lang w:val="en-GB"/>
+          </w:rPr>
+          <w:t xml:space="preserve">Author-hosted paper</w:t>
+        </w:r>
+      </w:hyperlink>
+      <w:r>
+        <w:rPr>
+          <w:lang w:val="en-GB"/>
+        </w:rPr>
+        <w:t xml:space="preserve">.</w:t>
+      </w:r>
+    </w:p>
+    <w:p>
+      <w:pPr>
+        <w:pStyle w:val="BodyText"/>
+      </w:pPr>
+      <w:r>
+        <w:rPr>
+          <w:lang w:val="en-GB"/>
+        </w:rPr>
+        <w:t xml:space="preserve">Duffield, N. (2006).</w:t>
+      </w:r>
+      <w:r>
+        <w:rPr>
+          <w:lang w:val="en-GB"/>
+        </w:rPr>
+        <w:t xml:space="preserve"> </w:t>
+      </w:r>
+      <w:r>
+        <w:rPr>
+          <w:i/>
+          <w:iCs/>
+          <w:lang w:val="en-GB"/>
+        </w:rPr>
+        <w:t xml:space="preserve">Network Tomography of Binary Network Performance Characteristics</w:t>
+      </w:r>
+      <w:r>
+        <w:rPr>
+          <w:lang w:val="en-GB"/>
+        </w:rPr>
+        <w:t xml:space="preserve">.</w:t>
+      </w:r>
+      <w:r>
+        <w:rPr>
+          <w:lang w:val="en-GB"/>
+        </w:rPr>
+        <w:t xml:space="preserve"> </w:t>
+      </w:r>
+      <w:hyperlink r:id="rId16">
+        <w:r>
+          <w:rPr>
+            <w:rStyle w:val="Hyperlink"/>
+            <w:lang w:val="en-GB"/>
+          </w:rPr>
+          <w:t xml:space="preserve">Author-hosted paper</w:t>
+        </w:r>
+      </w:hyperlink>
+      <w:r>
+        <w:rPr>
+          <w:lang w:val="en-GB"/>
+        </w:rPr>
+        <w:t xml:space="preserve">.</w:t>
+      </w:r>
+    </w:p>
+    <w:p>
+      <w:pPr>
+        <w:pStyle w:val="BodyText"/>
+      </w:pPr>
+      <w:r>
+        <w:rPr>
+          <w:lang w:val="en-GB"/>
+        </w:rPr>
+        <w:t xml:space="preserve">Foures, D., Albert, V., and Nketsa, A. (2016).</w:t>
+      </w:r>
+      <w:r>
+        <w:rPr>
+          <w:lang w:val="en-GB"/>
+        </w:rPr>
+        <w:t xml:space="preserve"> </w:t>
+      </w:r>
+      <w:r>
+        <w:rPr>
+          <w:i/>
+          <w:iCs/>
+          <w:lang w:val="en-GB"/>
+        </w:rPr>
+        <w:t xml:space="preserve">A new specification-based qualitative metric for simulation model validity</w:t>
+      </w:r>
+      <w:r>
+        <w:rPr>
+          <w:lang w:val="en-GB"/>
+        </w:rPr>
+        <w:t xml:space="preserve">. Simulation Modelling Practice and Theory 66, 1–15.</w:t>
+      </w:r>
+      <w:r>
+        <w:rPr>
+          <w:lang w:val="en-GB"/>
+        </w:rPr>
+        <w:t xml:space="preserve"> </w:t>
+      </w:r>
+      <w:hyperlink r:id="rId76">
+        <w:r>
+          <w:rPr>
+            <w:rStyle w:val="Hyperlink"/>
+            <w:lang w:val="en-GB"/>
+          </w:rPr>
+          <w:t xml:space="preserve">DOI: 10.1016/j.simpat.2016.03.002</w:t>
+        </w:r>
+      </w:hyperlink>
+      <w:r>
+        <w:rPr>
+          <w:lang w:val="en-GB"/>
+        </w:rPr>
+        <w:t xml:space="preserve">.</w:t>
+      </w:r>
+    </w:p>
+    <w:p>
+      <w:pPr>
+        <w:pStyle w:val="BodyText"/>
+      </w:pPr>
+      <w:r>
+        <w:rPr>
+          <w:lang w:val="en-GB"/>
+        </w:rPr>
+        <w:t xml:space="preserve">Friederich, J., and Lazarova-Molnar, S. (2022).</w:t>
+      </w:r>
+      <w:r>
+        <w:rPr>
+          <w:lang w:val="en-GB"/>
+        </w:rPr>
+        <w:t xml:space="preserve"> </w:t>
+      </w:r>
+      <w:r>
+        <w:rPr>
+          <w:i/>
+          <w:iCs/>
+          <w:lang w:val="en-GB"/>
+        </w:rPr>
+        <w:t xml:space="preserve">Data-Driven Reliability Modeling of Smart Manufacturing Systems Using Process Mining</w:t>
+      </w:r>
+      <w:r>
+        <w:rPr>
+          <w:lang w:val="en-GB"/>
+        </w:rPr>
+        <w:t xml:space="preserve">. Proceedings of the 2022 Winter Simulation Conference, 2534–2545.</w:t>
+      </w:r>
+      <w:r>
+        <w:rPr>
+          <w:lang w:val="en-GB"/>
+        </w:rPr>
+        <w:t xml:space="preserve"> </w:t>
+      </w:r>
+      <w:hyperlink r:id="rId22">
+        <w:r>
+          <w:rPr>
+            <w:rStyle w:val="Hyperlink"/>
+            <w:lang w:val="en-GB"/>
+          </w:rPr>
+          <w:t xml:space="preserve">Conference paper</w:t>
+        </w:r>
+      </w:hyperlink>
+      <w:r>
+        <w:rPr>
+          <w:lang w:val="en-GB"/>
+        </w:rPr>
+        <w:t xml:space="preserve">.</w:t>
+      </w:r>
+    </w:p>
+    <w:p>
+      <w:pPr>
+        <w:pStyle w:val="BodyText"/>
+      </w:pPr>
+      <w:r>
+        <w:rPr>
+          <w:lang w:val="en-GB"/>
+        </w:rPr>
+        <w:t xml:space="preserve">Friederich, J., and Lazarova-Molnar, S. (2025).</w:t>
+      </w:r>
+      <w:r>
+        <w:rPr>
+          <w:lang w:val="en-GB"/>
+        </w:rPr>
+        <w:t xml:space="preserve"> </w:t>
+      </w:r>
+      <w:r>
+        <w:rPr>
+          <w:i/>
+          <w:iCs/>
+          <w:lang w:val="en-GB"/>
+        </w:rPr>
+        <w:t xml:space="preserve">Data-driven reliability assessment of manufacturing systems using process mining</w:t>
+      </w:r>
+      <w:r>
+        <w:rPr>
+          <w:lang w:val="en-GB"/>
+        </w:rPr>
+        <w:t xml:space="preserve">. SIMULATION 101(8), 863–888; first published online 30 December 2024.</w:t>
+      </w:r>
+      <w:r>
+        <w:rPr>
+          <w:lang w:val="en-GB"/>
+        </w:rPr>
+        <w:t xml:space="preserve"> </w:t>
+      </w:r>
+      <w:hyperlink r:id="rId77">
+        <w:r>
+          <w:rPr>
+            <w:rStyle w:val="Hyperlink"/>
+            <w:lang w:val="en-GB"/>
+          </w:rPr>
+          <w:t xml:space="preserve">DOI: 10.1177/00375497241302866</w:t>
+        </w:r>
+      </w:hyperlink>
+      <w:r>
+        <w:rPr>
+          <w:lang w:val="en-GB"/>
+        </w:rPr>
+        <w:t xml:space="preserve">.</w:t>
+      </w:r>
+    </w:p>
+    <w:p>
+      <w:pPr>
+        <w:pStyle w:val="BodyText"/>
+      </w:pPr>
+      <w:r>
+        <w:rPr>
+          <w:lang w:val="en-GB"/>
+        </w:rPr>
+        <w:t xml:space="preserve">Hollmann, D. A., Cristiá, M., and Frydman, C. (2014).</w:t>
+      </w:r>
+      <w:r>
+        <w:rPr>
+          <w:lang w:val="en-GB"/>
+        </w:rPr>
+        <w:t xml:space="preserve"> </w:t>
+      </w:r>
+      <w:r>
+        <w:rPr>
+          <w:i/>
+          <w:iCs/>
+          <w:lang w:val="en-GB"/>
+        </w:rPr>
+        <w:t xml:space="preserve">A family of simulation criteria to guide DEVS models validation rigorously, systematically and semi-automatically</w:t>
+      </w:r>
+      <w:r>
+        <w:rPr>
+          <w:lang w:val="en-GB"/>
+        </w:rPr>
+        <w:t xml:space="preserve">. Simulation Modelling Practice and Theory 49, 1–26.</w:t>
+      </w:r>
+      <w:r>
+        <w:rPr>
+          <w:lang w:val="en-GB"/>
+        </w:rPr>
+        <w:t xml:space="preserve"> </w:t>
+      </w:r>
+      <w:hyperlink r:id="rId78">
+        <w:r>
+          <w:rPr>
+            <w:rStyle w:val="Hyperlink"/>
+            <w:lang w:val="en-GB"/>
+          </w:rPr>
+          <w:t xml:space="preserve">DOI: 10.1016/j.simpat.2014.07.003</w:t>
+        </w:r>
+      </w:hyperlink>
+      <w:r>
+        <w:rPr>
+          <w:lang w:val="en-GB"/>
+        </w:rPr>
+        <w:t xml:space="preserve">.</w:t>
+      </w:r>
+    </w:p>
+    <w:p>
+      <w:pPr>
+        <w:pStyle w:val="BodyText"/>
+      </w:pPr>
+      <w:r>
+        <w:rPr>
+          <w:lang w:val="en-GB"/>
+        </w:rPr>
+        <w:t xml:space="preserve">Krasnovsky, A. A. (2026).</w:t>
+      </w:r>
+      <w:r>
+        <w:rPr>
+          <w:lang w:val="en-GB"/>
+        </w:rPr>
+        <w:t xml:space="preserve"> </w:t>
+      </w:r>
+      <w:r>
+        <w:rPr>
+          <w:i/>
+          <w:iCs/>
+          <w:lang w:val="en-GB"/>
+        </w:rPr>
+        <w:t xml:space="preserve">Model Discovery and Graph Simulation: A Lightweight Gateway to Chaos Engineering</w:t>
+      </w:r>
+      <w:r>
+        <w:rPr>
+          <w:lang w:val="en-GB"/>
+        </w:rPr>
+        <w:t xml:space="preserve">. ICSE 2026, New Ideas and Emerging Results.</w:t>
+      </w:r>
+      <w:r>
+        <w:rPr>
+          <w:lang w:val="en-GB"/>
+        </w:rPr>
+        <w:t xml:space="preserve"> </w:t>
+      </w:r>
+      <w:hyperlink r:id="rId79">
+        <w:r>
+          <w:rPr>
+            <w:rStyle w:val="Hyperlink"/>
+            <w:lang w:val="en-GB"/>
+          </w:rPr>
+          <w:t xml:space="preserve">DOI: 10.1145/3786582.3786823</w:t>
+        </w:r>
+      </w:hyperlink>
+      <w:r>
+        <w:rPr>
+          <w:lang w:val="en-GB"/>
+        </w:rPr>
+        <w:t xml:space="preserve">. The retained textual source is</w:t>
+      </w:r>
+      <w:r>
+        <w:rPr>
+          <w:lang w:val="en-GB"/>
+        </w:rPr>
+        <w:t xml:space="preserve"> </w:t>
+      </w:r>
+      <w:hyperlink r:id="rId9">
+        <w:r>
+          <w:rPr>
+            <w:rStyle w:val="Hyperlink"/>
+            <w:lang w:val="en-GB"/>
+          </w:rPr>
+          <w:t xml:space="preserve">arXiv:2506.11176v2</w:t>
+        </w:r>
+      </w:hyperlink>
+      <w:r>
+        <w:rPr>
+          <w:lang w:val="en-GB"/>
+        </w:rPr>
+        <w:t xml:space="preserve">, 30 September 2025.</w:t>
+      </w:r>
+    </w:p>
+    <w:p>
+      <w:pPr>
+        <w:pStyle w:val="BodyText"/>
+      </w:pPr>
+      <w:r>
+        <w:rPr>
+          <w:lang w:val="en-GB"/>
+        </w:rPr>
+        <w:t xml:space="preserve">Krasnovsky, A. A. (2025).</w:t>
+      </w:r>
+      <w:r>
+        <w:rPr>
+          <w:lang w:val="en-GB"/>
+        </w:rPr>
+        <w:t xml:space="preserve"> </w:t>
+      </w:r>
+      <w:r>
+        <w:rPr>
+          <w:i/>
+          <w:iCs/>
+          <w:lang w:val="en-GB"/>
+        </w:rPr>
+        <w:t xml:space="preserve">Evaluating Asynchronous Semantics in Trace-Discovered Resilience Models: A Case Study on the OpenTelemetry Demo</w:t>
+      </w:r>
+      <w:r>
+        <w:rPr>
+          <w:lang w:val="en-GB"/>
+        </w:rPr>
+        <w:t xml:space="preserve">. arXiv:2512.12314v1, 13 December 2025.</w:t>
+      </w:r>
+      <w:r>
+        <w:rPr>
+          <w:lang w:val="en-GB"/>
+        </w:rPr>
+        <w:t xml:space="preserve"> </w:t>
+      </w:r>
+      <w:hyperlink r:id="rId10">
+        <w:r>
+          <w:rPr>
+            <w:rStyle w:val="Hyperlink"/>
+            <w:lang w:val="en-GB"/>
+          </w:rPr>
+          <w:t xml:space="preserve">Preprint version</w:t>
+        </w:r>
+      </w:hyperlink>
+      <w:r>
+        <w:rPr>
+          <w:lang w:val="en-GB"/>
+        </w:rPr>
+        <w:t xml:space="preserve">.</w:t>
+      </w:r>
+    </w:p>
+    <w:p>
+      <w:pPr>
+        <w:pStyle w:val="BodyText"/>
+      </w:pPr>
+      <w:r>
+        <w:rPr>
+          <w:lang w:val="en-GB"/>
+        </w:rPr>
+        <w:t xml:space="preserve">Krasnovsky, A. A. (2026).</w:t>
+      </w:r>
+      <w:r>
+        <w:rPr>
+          <w:lang w:val="en-GB"/>
+        </w:rPr>
+        <w:t xml:space="preserve"> </w:t>
+      </w:r>
+      <w:r>
+        <w:rPr>
+          <w:i/>
+          <w:iCs/>
+          <w:lang w:val="en-GB"/>
+        </w:rPr>
+        <w:t xml:space="preserve">Refining Resilience Model Discovery: A Case Study on the Limited Role of Asynchronous Edges in the OpenTelemetry Demo</w:t>
+      </w:r>
+      <w:r>
+        <w:rPr>
+          <w:lang w:val="en-GB"/>
+        </w:rPr>
+        <w:t xml:space="preserve">. AINA proceedings chapter.</w:t>
+      </w:r>
+      <w:r>
+        <w:rPr>
+          <w:lang w:val="en-GB"/>
+        </w:rPr>
+        <w:t xml:space="preserve"> </w:t>
+      </w:r>
+      <w:hyperlink r:id="rId11">
+        <w:r>
+          <w:rPr>
+            <w:rStyle w:val="Hyperlink"/>
+            <w:lang w:val="en-GB"/>
+          </w:rPr>
+          <w:t xml:space="preserve">DOI: 10.1007/978-3-032-23304-2_24</w:t>
+        </w:r>
+      </w:hyperlink>
+      <w:r>
+        <w:rPr>
+          <w:lang w:val="en-GB"/>
+        </w:rPr>
+        <w:t xml:space="preserve">. The published chapter and preceding preprint retain their distinct titles and cited versions.</w:t>
+      </w:r>
+    </w:p>
+    <w:p>
+      <w:pPr>
+        <w:pStyle w:val="BodyText"/>
+      </w:pPr>
+      <w:r>
+        <w:rPr>
+          <w:lang w:val="en-GB"/>
+        </w:rPr>
+        <w:t xml:space="preserve">Mazkatli, M., Monschein, D., Armbruster, M., Heinrich, R., and Koziolek, A. (2025).</w:t>
+      </w:r>
+      <w:r>
+        <w:rPr>
+          <w:lang w:val="en-GB"/>
+        </w:rPr>
+        <w:t xml:space="preserve"> </w:t>
+      </w:r>
+      <w:r>
+        <w:rPr>
+          <w:i/>
+          <w:iCs/>
+          <w:lang w:val="en-GB"/>
+        </w:rPr>
+        <w:t xml:space="preserve">Continuous integration of architectural performance models with parametric dependencies – the CIPM approach</w:t>
+      </w:r>
+      <w:r>
+        <w:rPr>
+          <w:lang w:val="en-GB"/>
+        </w:rPr>
+        <w:t xml:space="preserve">. Automated Software Engineering 32, article 54.</w:t>
+      </w:r>
+      <w:r>
+        <w:rPr>
+          <w:lang w:val="en-GB"/>
+        </w:rPr>
+        <w:t xml:space="preserve"> </w:t>
+      </w:r>
+      <w:hyperlink r:id="rId80">
+        <w:r>
+          <w:rPr>
+            <w:rStyle w:val="Hyperlink"/>
+            <w:lang w:val="en-GB"/>
+          </w:rPr>
+          <w:t xml:space="preserve">DOI: 10.1007/s10515-025-00521-9</w:t>
+        </w:r>
+      </w:hyperlink>
+      <w:r>
+        <w:rPr>
+          <w:lang w:val="en-GB"/>
+        </w:rPr>
+        <w:t xml:space="preserve">.</w:t>
+      </w:r>
+    </w:p>
+    <w:p>
+      <w:pPr>
+        <w:pStyle w:val="BodyText"/>
+      </w:pPr>
+      <w:r>
+        <w:rPr>
+          <w:lang w:val="en-GB"/>
+        </w:rPr>
+        <w:t xml:space="preserve">Prékopa, A. (1990).</w:t>
+      </w:r>
+      <w:r>
+        <w:rPr>
+          <w:lang w:val="en-GB"/>
+        </w:rPr>
+        <w:t xml:space="preserve"> </w:t>
+      </w:r>
+      <w:r>
+        <w:rPr>
+          <w:i/>
+          <w:iCs/>
+          <w:lang w:val="en-GB"/>
+        </w:rPr>
+        <w:t xml:space="preserve">Sharp Bounds on Probabilities Using Linear Programming</w:t>
+      </w:r>
+      <w:r>
+        <w:rPr>
+          <w:lang w:val="en-GB"/>
+        </w:rPr>
+        <w:t xml:space="preserve">. Operations Research 38(2), 227–239.</w:t>
+      </w:r>
+      <w:r>
+        <w:rPr>
+          <w:lang w:val="en-GB"/>
+        </w:rPr>
+        <w:t xml:space="preserve"> </w:t>
+      </w:r>
+      <w:hyperlink r:id="rId81">
+        <w:r>
+          <w:rPr>
+            <w:rStyle w:val="Hyperlink"/>
+            <w:lang w:val="en-GB"/>
+          </w:rPr>
+          <w:t xml:space="preserve">DOI: 10.1287/opre.38.2.227</w:t>
+        </w:r>
+      </w:hyperlink>
+      <w:r>
+        <w:rPr>
+          <w:lang w:val="en-GB"/>
+        </w:rPr>
+        <w:t xml:space="preserve">.</w:t>
+      </w:r>
+    </w:p>
+    <w:p>
+      <w:pPr>
+        <w:pStyle w:val="BodyText"/>
+      </w:pPr>
+      <w:r>
+        <w:rPr>
+          <w:lang w:val="en-GB"/>
+        </w:rPr>
+        <w:t xml:space="preserve">Sugiyama, M., Krauledat, M., and Müller, K.-R. (2007).</w:t>
+      </w:r>
+      <w:r>
+        <w:rPr>
+          <w:lang w:val="en-GB"/>
+        </w:rPr>
+        <w:t xml:space="preserve"> </w:t>
+      </w:r>
+      <w:r>
+        <w:rPr>
+          <w:i/>
+          <w:iCs/>
+          <w:lang w:val="en-GB"/>
+        </w:rPr>
+        <w:t xml:space="preserve">Covariate Shift Adaptation by Importance Weighted Cross Validation</w:t>
+      </w:r>
+      <w:r>
+        <w:rPr>
+          <w:lang w:val="en-GB"/>
+        </w:rPr>
+        <w:t xml:space="preserve">. Journal of Machine Learning Research 8(35), 985–1005.</w:t>
+      </w:r>
+      <w:r>
+        <w:rPr>
+          <w:lang w:val="en-GB"/>
+        </w:rPr>
+        <w:t xml:space="preserve"> </w:t>
+      </w:r>
+      <w:hyperlink r:id="rId28">
+        <w:r>
+          <w:rPr>
+            <w:rStyle w:val="Hyperlink"/>
+            <w:lang w:val="en-GB"/>
+          </w:rPr>
+          <w:t xml:space="preserve">Publisher record</w:t>
+        </w:r>
+      </w:hyperlink>
+      <w:r>
+        <w:rPr>
+          <w:lang w:val="en-GB"/>
+        </w:rPr>
+        <w:t xml:space="preserve">.</w:t>
+      </w:r>
+    </w:p>
+    <w:p>
+      <w:pPr>
+        <w:pStyle w:val="BodyText"/>
+      </w:pPr>
+      <w:r>
+        <w:rPr>
+          <w:lang w:val="en-GB"/>
+        </w:rPr>
+        <w:t xml:space="preserve">Weber, S., Weber, T., and Henß, J.</w:t>
+      </w:r>
+      <w:r>
+        <w:rPr>
+          <w:lang w:val="en-GB"/>
+        </w:rPr>
+        <w:t xml:space="preserve"> </w:t>
+      </w:r>
+      <w:r>
+        <w:rPr>
+          <w:i/>
+          <w:iCs/>
+          <w:lang w:val="en-GB"/>
+        </w:rPr>
+        <w:t xml:space="preserve">Integration of Performability-Model Extraction and Performability Prediction in Continuous Integration / Continuous Delivery</w:t>
+      </w:r>
+      <w:r>
+        <w:rPr>
+          <w:lang w:val="en-GB"/>
+        </w:rPr>
+        <w:t xml:space="preserve">. Softwaretechnik-Trends, volume 45, issue 1, three-page report.</w:t>
+      </w:r>
+      <w:r>
+        <w:rPr>
+          <w:lang w:val="en-GB"/>
+        </w:rPr>
+        <w:t xml:space="preserve"> </w:t>
+      </w:r>
+      <w:hyperlink r:id="rId20">
+        <w:r>
+          <w:rPr>
+            <w:rStyle w:val="Hyperlink"/>
+            <w:lang w:val="en-GB"/>
+          </w:rPr>
+          <w:t xml:space="preserve">Publisher-hosted paper</w:t>
+        </w:r>
+      </w:hyperlink>
+      <w:r>
+        <w:rPr>
+          <w:lang w:val="en-GB"/>
+        </w:rPr>
+        <w:t xml:space="preserve">.</w:t>
+      </w:r>
+    </w:p>
+    <w:bookmarkEnd w:id="82"/>
+    <w:bookmarkStart w:id="92" w:name="Xca5978b00292db4c29cfb3375589ea70af0cfb1"/>
+    <w:p>
+      <w:pPr>
+        <w:pStyle w:val="Heading2"/>
+      </w:pPr>
+      <w:r>
+        <w:rPr>
+          <w:lang w:val="en-GB"/>
+        </w:rPr>
         <w:t xml:space="preserve">Appendix: contribution and evidence boundaries</w:t>
       </w:r>
     </w:p>
-    <w:bookmarkStart w:id="81" w:name="contribution-and-evidence-table"/>
+    <w:bookmarkStart w:id="89" w:name="contribution-and-evidence-table"/>
     <w:p>
       <w:pPr>
         <w:pStyle w:val="Heading3"/>
@@ -4665,7 +5427,7 @@
             <w:pPr>
               <w:pStyle w:val="Compact"/>
             </w:pPr>
-            <w:hyperlink r:id="rId75">
+            <w:hyperlink r:id="rId83">
               <w:r>
                 <w:rPr>
                   <w:rStyle w:val="Hyperlink"/>
@@ -4686,7 +5448,7 @@
               </w:rPr>
               <w:t xml:space="preserve"> </w:t>
             </w:r>
-            <w:hyperlink r:id="rId76">
+            <w:hyperlink r:id="rId84">
               <w:r>
                 <w:rPr>
                   <w:rStyle w:val="Hyperlink"/>
@@ -4936,7 +5698,7 @@
             <w:pPr>
               <w:pStyle w:val="Compact"/>
             </w:pPr>
-            <w:hyperlink r:id="rId77">
+            <w:hyperlink r:id="rId85">
               <w:r>
                 <w:rPr>
                   <w:rStyle w:val="Hyperlink"/>
@@ -5137,7 +5899,7 @@
             <w:pPr>
               <w:pStyle w:val="Compact"/>
             </w:pPr>
-            <w:hyperlink r:id="rId78">
+            <w:hyperlink r:id="rId86">
               <w:r>
                 <w:rPr>
                   <w:rStyle w:val="Hyperlink"/>
@@ -5518,7 +6280,7 @@
         </w:rPr>
         <w:t xml:space="preserve"> </w:t>
       </w:r>
-      <w:hyperlink r:id="rId79">
+      <w:hyperlink r:id="rId87">
         <w:r>
           <w:rPr>
             <w:rStyle w:val="Hyperlink"/>
@@ -5545,7 +6307,7 @@
         </w:rPr>
         <w:t xml:space="preserve"> </w:t>
       </w:r>
-      <w:hyperlink r:id="rId80">
+      <w:hyperlink r:id="rId88">
         <w:r>
           <w:rPr>
             <w:rStyle w:val="Hyperlink"/>
@@ -5567,8 +6329,8 @@
         <w:t xml:space="preserve">identify the sources and access limits behind the attribution boundaries. In particular, log-linear/rank identification, binary network tomography, sharp probability bounds, automatic architectural calibration and event/resource-driven reliability modeling predate this work. The final novelty claim must name the declared execution/observation class, supported identification algorithm and linked independent tests, rather than claiming these broader research directions as new.</w:t>
       </w:r>
     </w:p>
-    <w:bookmarkEnd w:id="81"/>
-    <w:bookmarkStart w:id="82" w:name="manual-input-and-integration-inventory"/>
+    <w:bookmarkEnd w:id="89"/>
+    <w:bookmarkStart w:id="90" w:name="manual-input-and-integration-inventory"/>
     <w:p>
       <w:pPr>
         <w:pStyle w:val="Heading3"/>
@@ -6128,8 +6890,8 @@
         </w:tc>
       </w:tr>
     </w:tbl>
-    <w:bookmarkEnd w:id="82"/>
-    <w:bookmarkStart w:id="83" w:name="Xd813bc0ac44da3215c8dbccccb245cb170c3963"/>
+    <w:bookmarkEnd w:id="90"/>
+    <w:bookmarkStart w:id="91" w:name="Xd813bc0ac44da3215c8dbccccb245cb170c3963"/>
     <w:p>
       <w:pPr>
         <w:pStyle w:val="Heading3"/>
@@ -6231,8 +6993,8 @@
         <w:t xml:space="preserve">Main findings, error/coverage tables, measured costs and final conclusions must be filled from the admitted prospective evidence, with its exact run and source provenance. This table cannot be used to mark those pending conditions complete.</w:t>
       </w:r>
     </w:p>
-    <w:bookmarkEnd w:id="83"/>
-    <w:bookmarkEnd w:id="84"/>
+    <w:bookmarkEnd w:id="91"/>
+    <w:bookmarkEnd w:id="92"/>
     <w:sectPr>
       <w:footnotePr>
         <w:numRestart w:val="eachSect"/>

</xml_diff>

<commit_message>
Report qualified preflight and running main; respect API quota during terminal evidence collection
</commit_message>
<xml_diff>
--- a/docs/manuscript-v3/manuscript.docx
+++ b/docs/manuscript-v3/manuscript.docx
@@ -61,7 +61,7 @@
         <w:rPr>
           <w:lang w:val="en-GB"/>
         </w:rPr>
-        <w:t xml:space="preserve">Draft for review. The independent main comparison has not yet supplied its audited result section.</w:t>
+        <w:t xml:space="preserve">Draft for review. Independent main run 34465226083 is registered; its audited interpretation must be integrated before submission.</w:t>
       </w:r>
     </w:p>
     <w:p>
@@ -2321,7 +2321,7 @@
     </w:p>
     <w:bookmarkEnd w:id="44"/>
     <w:bookmarkEnd w:id="45"/>
-    <w:bookmarkStart w:id="67" w:name="results"/>
+    <w:bookmarkStart w:id="71" w:name="results"/>
     <w:p>
       <w:pPr>
         <w:pStyle w:val="Heading2"/>
@@ -3810,7 +3810,7 @@
       </w:r>
     </w:p>
     <w:bookmarkEnd w:id="59"/>
-    <w:bookmarkStart w:id="65" w:name="Xa62ec04076493218a52dd8cbbbb18cadd750d5c"/>
+    <w:bookmarkStart w:id="67" w:name="Xa62ec04076493218a52dd8cbbbb18cadd750d5c"/>
     <w:p>
       <w:pPr>
         <w:pStyle w:val="Heading3"/>
@@ -4109,21 +4109,20 @@
         <w:rPr>
           <w:lang w:val="en-GB"/>
         </w:rPr>
-        <w:t xml:space="preserve">All 48 known solver-oracle records pass. The 32 previously supported forecasts remain exactly unchanged, six conditional unsupported slots retain null points/reasons, and two forecasts are recovered. No business test outcome is read in this repair qualification. These results establish a scoped computational repair on development inputs. A newly versioned full-duration preflight using seed 771605 must still pass before independent main admission.</w:t>
+        <w:t xml:space="preserve">All 48 known solver-oracle records pass. The 32 previously supported forecasts remain exactly unchanged, six conditional unsupported slots retain null points/reasons, and two forecasts are recovered. No business test outcome is read in this repair qualification. These results establish a scoped computational repair on development inputs. The newly versioned full-duration preflight using seed 771605 subsequently passed its complete audit, as reported below.</w:t>
       </w:r>
     </w:p>
     <w:bookmarkEnd w:id="64"/>
-    <w:bookmarkEnd w:id="65"/>
-    <w:bookmarkStart w:id="66" w:name="Xfca87b76d71a9eeeedfed17811310ea13fd4e43"/>
-    <w:p>
-      <w:pPr>
-        <w:pStyle w:val="Heading3"/>
-      </w:pPr>
-      <w:r>
-        <w:rPr>
-          <w:lang w:val="en-GB"/>
-        </w:rPr>
-        <w:t xml:space="preserve">5. Independent main results remain a separate obligation</w:t>
+    <w:bookmarkStart w:id="66" w:name="qualified-full-v3-preflight"/>
+    <w:p>
+      <w:pPr>
+        <w:pStyle w:val="Heading4"/>
+      </w:pPr>
+      <w:r>
+        <w:rPr>
+          <w:lang w:val="en-GB"/>
+        </w:rPr>
+        <w:t xml:space="preserve">Qualified full v3 preflight</w:t>
       </w:r>
     </w:p>
     <w:p>
@@ -4134,23 +4133,203 @@
         <w:rPr>
           <w:lang w:val="en-GB"/>
         </w:rPr>
-        <w:t xml:space="preserve">The 240-campaign main series has not yet been admitted. Consequently this chapter makes no Gstar-versus-PMX/G0 superiority claim, no equivalence claim, and no claim that the final model is independently adequate across three applications. Completed mechanisms, arithmetic audits, technical controls and development forecasts cannot substitute for that series.</w:t>
-      </w:r>
-    </w:p>
-    <w:p>
-      <w:pPr>
-        <w:pStyle w:val="BodyText"/>
-      </w:pPr>
-      <w:r>
-        <w:rPr>
-          <w:lang w:val="en-GB"/>
-        </w:rPr>
-        <w:t xml:space="preserve">The final main section must report all 800 planned operation cells per method, support and absence reasons, own/common-support errors, the six prespecified paired contrasts, all-sequence/stable distinctions, source-only transfer coverage, measured stage/process costs and unresolved quantities. The reported source-only transfer procedure currently identifies no target point under an unrestricted changed joint law. That limitation must remain visible alongside current-campaign results, and target-calibrated rebuilding must not be relabelled as transfer.</w:t>
+        <w:t xml:space="preserve">The fresh full preflight, run</w:t>
+      </w:r>
+      <w:r>
+        <w:rPr>
+          <w:lang w:val="en-GB"/>
+        </w:rPr>
+        <w:t xml:space="preserve"> </w:t>
+      </w:r>
+      <w:r>
+        <w:rPr>
+          <w:rStyle w:val="VerbatimChar"/>
+          <w:lang w:val="en-GB"/>
+        </w:rPr>
+        <w:t xml:space="preserve">34460574221</w:t>
+      </w:r>
+      <w:r>
+        <w:rPr>
+          <w:lang w:val="en-GB"/>
+        </w:rPr>
+        <w:t xml:space="preserve">, completes all 36 jobs in 49 minutes 25 seconds. Its</w:t>
+      </w:r>
+      <w:r>
+        <w:rPr>
+          <w:lang w:val="en-GB"/>
+        </w:rPr>
+        <w:t xml:space="preserve"> </w:t>
+      </w:r>
+      <w:hyperlink r:id="rId65">
+        <w:r>
+          <w:rPr>
+            <w:rStyle w:val="Hyperlink"/>
+            <w:lang w:val="en-GB"/>
+          </w:rPr>
+          <w:t xml:space="preserve">complete admission audit</w:t>
+        </w:r>
+      </w:hyperlink>
+      <w:r>
+        <w:rPr>
+          <w:lang w:val="en-GB"/>
+        </w:rPr>
+        <w:t xml:space="preserve"> </w:t>
+      </w:r>
+      <w:r>
+        <w:rPr>
+          <w:lang w:val="en-GB"/>
+        </w:rPr>
+        <w:t xml:space="preserve">qualifies all six campaigns, 200 method slots, 48 known solver-oracle records, all 20 PMX operation extractions, saved-model replay and actual data-read order. The retained package contains 28 compact archives, 167,051 bytes and 107 members, with no missing artifact. All 21,600 test attempts remain development evidence.</w:t>
+      </w:r>
+    </w:p>
+    <w:p>
+      <w:pPr>
+        <w:pStyle w:val="BodyText"/>
+      </w:pPr>
+      <w:r>
+        <w:rPr>
+          <w:lang w:val="en-GB"/>
+        </w:rPr>
+        <w:t xml:space="preserve">Technical qualification preserves the methods’ valid refusals. Gstar supplies 12/20 points, GID and G0 18/20, B0 20/20, primary PMX 14/20 and inclusive PMX 20/20. Gstar has six masked-law ambiguities in OpenTelemetry Demo and two unexplained-parent structural refusals in DeathStarBench. Primary PMX retains six conditional-propagation/positivity refusals in OpenTelemetry Demo. No technical forecast failure remains. Low error and superiority played no role in admission.</w:t>
       </w:r>
     </w:p>
     <w:bookmarkEnd w:id="66"/>
     <w:bookmarkEnd w:id="67"/>
-    <w:bookmarkStart w:id="74" w:name="discussion"/>
+    <w:bookmarkStart w:id="70" w:name="X3e3842fe780a5d9580f897dc4217b830c2425fa"/>
+    <w:p>
+      <w:pPr>
+        <w:pStyle w:val="Heading3"/>
+      </w:pPr>
+      <w:r>
+        <w:rPr>
+          <w:lang w:val="en-GB"/>
+        </w:rPr>
+        <w:t xml:space="preserve">5. Independent main: admitted, results pending</w:t>
+      </w:r>
+    </w:p>
+    <w:p>
+      <w:pPr>
+        <w:pStyle w:val="FirstParagraph"/>
+      </w:pPr>
+      <w:r>
+        <w:rPr>
+          <w:lang w:val="en-GB"/>
+        </w:rPr>
+        <w:t xml:space="preserve">The 240-campaign main series was dispatched as</w:t>
+      </w:r>
+      <w:r>
+        <w:rPr>
+          <w:lang w:val="en-GB"/>
+        </w:rPr>
+        <w:t xml:space="preserve"> </w:t>
+      </w:r>
+      <w:hyperlink r:id="rId68">
+        <w:r>
+          <w:rPr>
+            <w:rStyle w:val="Hyperlink"/>
+            <w:lang w:val="en-GB"/>
+          </w:rPr>
+          <w:t xml:space="preserve">run 34465226083</w:t>
+        </w:r>
+      </w:hyperlink>
+      <w:r>
+        <w:rPr>
+          <w:lang w:val="en-GB"/>
+        </w:rPr>
+        <w:t xml:space="preserve"> </w:t>
+      </w:r>
+      <w:r>
+        <w:rPr>
+          <w:lang w:val="en-GB"/>
+        </w:rPr>
+        <w:t xml:space="preserve">on 10 September 2026 at 10:16:55 UTC, from source</w:t>
+      </w:r>
+      <w:r>
+        <w:rPr>
+          <w:lang w:val="en-GB"/>
+        </w:rPr>
+        <w:t xml:space="preserve"> </w:t>
+      </w:r>
+      <w:r>
+        <w:rPr>
+          <w:rStyle w:val="VerbatimChar"/>
+          <w:lang w:val="en-GB"/>
+        </w:rPr>
+        <w:t xml:space="preserve">d857ea65ca9da7fa9ae4ee1198317487475246a7</w:t>
+      </w:r>
+      <w:r>
+        <w:rPr>
+          <w:lang w:val="en-GB"/>
+        </w:rPr>
+        <w:t xml:space="preserve"> </w:t>
+      </w:r>
+      <w:r>
+        <w:rPr>
+          <w:lang w:val="en-GB"/>
+        </w:rPr>
+        <w:t xml:space="preserve">and tag</w:t>
+      </w:r>
+      <w:r>
+        <w:rPr>
+          <w:lang w:val="en-GB"/>
+        </w:rPr>
+        <w:t xml:space="preserve"> </w:t>
+      </w:r>
+      <w:r>
+        <w:rPr>
+          <w:rStyle w:val="VerbatimChar"/>
+          <w:lang w:val="en-GB"/>
+        </w:rPr>
+        <w:t xml:space="preserve">v3-main-771601-v3-admitted</w:t>
+      </w:r>
+      <w:r>
+        <w:rPr>
+          <w:lang w:val="en-GB"/>
+        </w:rPr>
+        <w:t xml:space="preserve">. Exact-source CI 34465095817 passed. The</w:t>
+      </w:r>
+      <w:r>
+        <w:rPr>
+          <w:lang w:val="en-GB"/>
+        </w:rPr>
+        <w:t xml:space="preserve"> </w:t>
+      </w:r>
+      <w:hyperlink r:id="rId69">
+        <w:r>
+          <w:rPr>
+            <w:rStyle w:val="Hyperlink"/>
+            <w:lang w:val="en-GB"/>
+          </w:rPr>
+          <w:t xml:space="preserve">dispatch record</w:t>
+        </w:r>
+      </w:hyperlink>
+      <w:r>
+        <w:rPr>
+          <w:lang w:val="en-GB"/>
+        </w:rPr>
+        <w:t xml:space="preserve"> </w:t>
+      </w:r>
+      <w:r>
+        <w:rPr>
+          <w:lang w:val="en-GB"/>
+        </w:rPr>
+        <w:t xml:space="preserve">binds this independent series to the qualified preflight and fresh main seed 771601. Acquisition is active; the series has not yet supplied its final audited results. Consequently this chapter makes no Gstar-versus-PMX/G0 superiority or equivalence claim. Completed mechanisms, arithmetic audits, technical controls and development forecasts cannot substitute for the pending main results.</w:t>
+      </w:r>
+    </w:p>
+    <w:p>
+      <w:pPr>
+        <w:pStyle w:val="BodyText"/>
+      </w:pPr>
+      <w:r>
+        <w:rPr>
+          <w:lang w:val="en-GB"/>
+        </w:rPr>
+        <w:t xml:space="preserve">The final main section must report all 800 planned operation cells per method, support and absence reasons, own/common-support errors, the six prespecified paired contrasts, all-sequence/stable distinctions, source-only transfer coverage, measured stage/process costs and unresolved quantities. The reported source-only transfer procedure currently identifies no target point under an unrestricted changed joint law. That limitation must remain visible alongside current-campaign results, and target-calibrated rebuilding must not be relabelled as transfer.</w:t>
+      </w:r>
+    </w:p>
+    <w:bookmarkEnd w:id="70"/>
+    <w:bookmarkEnd w:id="71"/>
+    <w:bookmarkStart w:id="78" w:name="discussion"/>
     <w:p>
       <w:pPr>
         <w:pStyle w:val="Heading2"/>
@@ -4162,7 +4341,7 @@
         <w:t xml:space="preserve">Discussion</w:t>
       </w:r>
     </w:p>
-    <w:bookmarkStart w:id="68" w:name="X9d6b68513f878977fec1830a6879ec8b9936a8e"/>
+    <w:bookmarkStart w:id="72" w:name="X9d6b68513f878977fec1830a6879ec8b9936a8e"/>
     <w:p>
       <w:pPr>
         <w:pStyle w:val="Heading3"/>
@@ -4207,8 +4386,8 @@
         <w:t xml:space="preserve">The practical output is therefore conditional. A reachability forecast is justified as an execution forecast only under its stated event equivalence. An execution forecast is justified as a business forecast only under the additional operation contract and measurement assumptions. Independent error and coverage tables assess the latter relationship on their supported application conditions. The present procedure does not automatically select a universally smallest adequate model.</w:t>
       </w:r>
     </w:p>
-    <w:bookmarkEnd w:id="68"/>
-    <w:bookmarkStart w:id="69" w:name="identification-and-observation-quality"/>
+    <w:bookmarkEnd w:id="72"/>
+    <w:bookmarkStart w:id="73" w:name="identification-and-observation-quality"/>
     <w:p>
       <w:pPr>
         <w:pStyle w:val="Heading3"/>
@@ -4253,8 +4432,8 @@
         <w:t xml:space="preserve">The support policy is deliberately observable. Every calibration attempt enters the denominator, including failures, timeouts and untraced attempts. Missing evidence can widen a bound or prevent structural binding; it does not disappear by conditioning on complete traces. This avoids one form of selective reporting, but does not establish that the available instrumentation identifies all requested functionals. The independent results must show point coverage, the reasons for ambiguity, structural refusal and technical failure alongside error. Technical failures remain distinct from a valid method-level refusal to identify a point.</w:t>
       </w:r>
     </w:p>
-    <w:bookmarkEnd w:id="69"/>
-    <w:bookmarkStart w:id="70" w:name="causal-scope-and-guard-ablations"/>
+    <w:bookmarkEnd w:id="73"/>
+    <w:bookmarkStart w:id="74" w:name="causal-scope-and-guard-ablations"/>
     <w:p>
       <w:pPr>
         <w:pStyle w:val="Heading3"/>
@@ -4299,8 +4478,8 @@
         <w:t xml:space="preserve">Historical timing bounds are likewise diagnostic rather than causal. They show that some conditional duration lower bounds are incompatible with treating every original probe window as wholly contained in one short controller period. They do not reconstruct actual probe timestamps or assign an unobserved overlap to a particular failure. The historical biases motivate this investigation while retaining their unresolved causal attribution.</w:t>
       </w:r>
     </w:p>
-    <w:bookmarkEnd w:id="70"/>
-    <w:bookmarkStart w:id="71" w:name="interpreting-independent-comparisons"/>
+    <w:bookmarkEnd w:id="74"/>
+    <w:bookmarkStart w:id="75" w:name="interpreting-independent-comparisons"/>
     <w:p>
       <w:pPr>
         <w:pStyle w:val="Heading3"/>
@@ -4356,8 +4535,8 @@
         <w:t xml:space="preserve">The all-sequence result is primary. The stable view uses the same frozen forecast on a separately reported, bracketed subset of attempts, and can change the observed operating-condition mix. It does not rescue an unsuccessful primary forecast or exclude every DOWN state. Differences between the views are interpreted with their retained fractions and condition coverage.</w:t>
       </w:r>
     </w:p>
-    <w:bookmarkEnd w:id="71"/>
-    <w:bookmarkStart w:id="72" w:name="transfer-cost-and-automation"/>
+    <w:bookmarkEnd w:id="75"/>
+    <w:bookmarkStart w:id="76" w:name="transfer-cost-and-automation"/>
     <w:p>
       <w:pPr>
         <w:pStyle w:val="Heading3"/>
@@ -4402,8 +4581,8 @@
         <w:t xml:space="preserve">Automation begins after several manual choices: the external success contract, source error-propagation rules, required and optional call groups, peer identity declarations, fault/placement class and comparator adapters. The downstream extraction, identification, calculation, replay and scoring are automated under those declarations. This scope is useful and reproducible, but does not establish fully automatic integration of an unfamiliar application. Low CPU time alone is not evidence of low total integration or monitoring cost.</w:t>
       </w:r>
     </w:p>
-    <w:bookmarkEnd w:id="72"/>
-    <w:bookmarkStart w:id="73" w:name="generalization-and-reproducibility"/>
+    <w:bookmarkEnd w:id="76"/>
+    <w:bookmarkStart w:id="77" w:name="generalization-and-reproducibility"/>
     <w:p>
       <w:pPr>
         <w:pStyle w:val="Heading3"/>
@@ -4448,9 +4627,9 @@
         <w:t xml:space="preserve">Reproducibility requires preserving the failures that changed the implementation. The first full comparison preflight’s PMX profile-interface failure is retained beside its versioned repair. The second preflight exposes a zero-step PMX resource-estimation loop; its separately qualified clock-progress correction preserves all previously supported forecasts on the saved development inputs. That repair is disclosed as a derived binary, and its qualification does not add independent test campaigns. The H-EXEC immutable-input replay retains the original parser failure and all unchanged outcomes. A successful replay verifies the recorded calculation and input association; it does not create another independent campaign. The final article must preserve any further technical failures, invalid probabilities, empty contrasts and unfavorable results, and base its accuracy conclusions on the audited prospective evidence.</w:t>
       </w:r>
     </w:p>
-    <w:bookmarkEnd w:id="73"/>
-    <w:bookmarkEnd w:id="74"/>
-    <w:bookmarkStart w:id="82" w:name="references"/>
+    <w:bookmarkEnd w:id="77"/>
+    <w:bookmarkEnd w:id="78"/>
+    <w:bookmarkStart w:id="86" w:name="references"/>
     <w:p>
       <w:pPr>
         <w:pStyle w:val="Heading2"/>
@@ -4498,7 +4677,7 @@
         </w:rPr>
         <w:t xml:space="preserve"> </w:t>
       </w:r>
-      <w:hyperlink r:id="rId75">
+      <w:hyperlink r:id="rId79">
         <w:r>
           <w:rPr>
             <w:rStyle w:val="Hyperlink"/>
@@ -4654,7 +4833,7 @@
         </w:rPr>
         <w:t xml:space="preserve"> </w:t>
       </w:r>
-      <w:hyperlink r:id="rId76">
+      <w:hyperlink r:id="rId80">
         <w:r>
           <w:rPr>
             <w:rStyle w:val="Hyperlink"/>
@@ -4758,7 +4937,7 @@
         </w:rPr>
         <w:t xml:space="preserve"> </w:t>
       </w:r>
-      <w:hyperlink r:id="rId77">
+      <w:hyperlink r:id="rId81">
         <w:r>
           <w:rPr>
             <w:rStyle w:val="Hyperlink"/>
@@ -4810,7 +4989,7 @@
         </w:rPr>
         <w:t xml:space="preserve"> </w:t>
       </w:r>
-      <w:hyperlink r:id="rId78">
+      <w:hyperlink r:id="rId82">
         <w:r>
           <w:rPr>
             <w:rStyle w:val="Hyperlink"/>
@@ -4862,7 +5041,7 @@
         </w:rPr>
         <w:t xml:space="preserve"> </w:t>
       </w:r>
-      <w:hyperlink r:id="rId79">
+      <w:hyperlink r:id="rId83">
         <w:r>
           <w:rPr>
             <w:rStyle w:val="Hyperlink"/>
@@ -5039,7 +5218,7 @@
         </w:rPr>
         <w:t xml:space="preserve"> </w:t>
       </w:r>
-      <w:hyperlink r:id="rId80">
+      <w:hyperlink r:id="rId84">
         <w:r>
           <w:rPr>
             <w:rStyle w:val="Hyperlink"/>
@@ -5091,7 +5270,7 @@
         </w:rPr>
         <w:t xml:space="preserve"> </w:t>
       </w:r>
-      <w:hyperlink r:id="rId81">
+      <w:hyperlink r:id="rId85">
         <w:r>
           <w:rPr>
             <w:rStyle w:val="Hyperlink"/>
@@ -5211,8 +5390,8 @@
         <w:t xml:space="preserve">.</w:t>
       </w:r>
     </w:p>
-    <w:bookmarkEnd w:id="82"/>
-    <w:bookmarkStart w:id="92" w:name="Xca5978b00292db4c29cfb3375589ea70af0cfb1"/>
+    <w:bookmarkEnd w:id="86"/>
+    <w:bookmarkStart w:id="96" w:name="Xca5978b00292db4c29cfb3375589ea70af0cfb1"/>
     <w:p>
       <w:pPr>
         <w:pStyle w:val="Heading2"/>
@@ -5224,7 +5403,7 @@
         <w:t xml:space="preserve">Appendix: contribution and evidence boundaries</w:t>
       </w:r>
     </w:p>
-    <w:bookmarkStart w:id="89" w:name="contribution-and-evidence-table"/>
+    <w:bookmarkStart w:id="93" w:name="contribution-and-evidence-table"/>
     <w:p>
       <w:pPr>
         <w:pStyle w:val="Heading3"/>
@@ -5427,7 +5606,7 @@
             <w:pPr>
               <w:pStyle w:val="Compact"/>
             </w:pPr>
-            <w:hyperlink r:id="rId83">
+            <w:hyperlink r:id="rId87">
               <w:r>
                 <w:rPr>
                   <w:rStyle w:val="Hyperlink"/>
@@ -5448,7 +5627,7 @@
               </w:rPr>
               <w:t xml:space="preserve"> </w:t>
             </w:r>
-            <w:hyperlink r:id="rId84">
+            <w:hyperlink r:id="rId88">
               <w:r>
                 <w:rPr>
                   <w:rStyle w:val="Hyperlink"/>
@@ -5698,7 +5877,7 @@
             <w:pPr>
               <w:pStyle w:val="Compact"/>
             </w:pPr>
-            <w:hyperlink r:id="rId85">
+            <w:hyperlink r:id="rId89">
               <w:r>
                 <w:rPr>
                   <w:rStyle w:val="Hyperlink"/>
@@ -5899,7 +6078,7 @@
             <w:pPr>
               <w:pStyle w:val="Compact"/>
             </w:pPr>
-            <w:hyperlink r:id="rId86">
+            <w:hyperlink r:id="rId90">
               <w:r>
                 <w:rPr>
                   <w:rStyle w:val="Hyperlink"/>
@@ -6280,7 +6459,7 @@
         </w:rPr>
         <w:t xml:space="preserve"> </w:t>
       </w:r>
-      <w:hyperlink r:id="rId87">
+      <w:hyperlink r:id="rId91">
         <w:r>
           <w:rPr>
             <w:rStyle w:val="Hyperlink"/>
@@ -6307,7 +6486,7 @@
         </w:rPr>
         <w:t xml:space="preserve"> </w:t>
       </w:r>
-      <w:hyperlink r:id="rId88">
+      <w:hyperlink r:id="rId92">
         <w:r>
           <w:rPr>
             <w:rStyle w:val="Hyperlink"/>
@@ -6329,8 +6508,8 @@
         <w:t xml:space="preserve">identify the sources and access limits behind the attribution boundaries. In particular, log-linear/rank identification, binary network tomography, sharp probability bounds, automatic architectural calibration and event/resource-driven reliability modeling predate this work. The final novelty claim must name the declared execution/observation class, supported identification algorithm and linked independent tests, rather than claiming these broader research directions as new.</w:t>
       </w:r>
     </w:p>
-    <w:bookmarkEnd w:id="89"/>
-    <w:bookmarkStart w:id="90" w:name="manual-input-and-integration-inventory"/>
+    <w:bookmarkEnd w:id="93"/>
+    <w:bookmarkStart w:id="94" w:name="manual-input-and-integration-inventory"/>
     <w:p>
       <w:pPr>
         <w:pStyle w:val="Heading3"/>
@@ -6890,8 +7069,8 @@
         </w:tc>
       </w:tr>
     </w:tbl>
-    <w:bookmarkEnd w:id="90"/>
-    <w:bookmarkStart w:id="91" w:name="Xd813bc0ac44da3215c8dbccccb245cb170c3963"/>
+    <w:bookmarkEnd w:id="94"/>
+    <w:bookmarkStart w:id="95" w:name="Xd813bc0ac44da3215c8dbccccb245cb170c3963"/>
     <w:p>
       <w:pPr>
         <w:pStyle w:val="Heading3"/>
@@ -6993,8 +7172,8 @@
         <w:t xml:space="preserve">Main findings, error/coverage tables, measured costs and final conclusions must be filled from the admitted prospective evidence, with its exact run and source provenance. This table cannot be used to mark those pending conditions complete.</w:t>
       </w:r>
     </w:p>
-    <w:bookmarkEnd w:id="91"/>
-    <w:bookmarkEnd w:id="92"/>
+    <w:bookmarkEnd w:id="95"/>
+    <w:bookmarkEnd w:id="96"/>
     <w:sectPr>
       <w:footnotePr>
         <w:numRestart w:val="eachSect"/>

</xml_diff>

<commit_message>
Explain executable identification and cite exact predecessor in the manuscript
</commit_message>
<xml_diff>
--- a/docs/manuscript-v3/manuscript.docx
+++ b/docs/manuscript-v3/manuscript.docx
@@ -75,7 +75,7 @@
         <w:t xml:space="preserve">Historical audits, technical checks, mechanism evidence and independent comparison have separate scopes. The original source chapters and complete claim table remain part of this draft.</w:t>
       </w:r>
     </w:p>
-    <w:bookmarkStart w:id="14" w:name="introduction"/>
+    <w:bookmarkStart w:id="15" w:name="introduction"/>
     <w:p>
       <w:pPr>
         <w:pStyle w:val="Heading2"/>
@@ -240,7 +240,7 @@
         <w:rPr>
           <w:lang w:val="en-GB"/>
         </w:rPr>
-        <w:t xml:space="preserve">This gives two formal contributions in a restricted application class: an executable semantic specification with exact simplification conditions, and a source-bound identification and reduction procedure that preserves ambiguity. The indicator identities and finite-state probability-bounding arguments are established mathematical tools; the contribution is their explicit connection to this execution and observation class, its discovered graph, and a checked implementation. The notation alone is not new, and the origin of the formalization in the MODELS manuscript/preprint is credited without describing that manuscript as an accepted conference publication. The</w:t>
+        <w:t xml:space="preserve">This gives two formal contributions in a restricted application class: an executable semantic specification with exact simplification conditions, and a source-bound identification and reduction procedure that preserves ambiguity. The indicator identities and finite-state probability-bounding arguments are established mathematical tools; the contribution is their explicit connection to this execution and observation class, its discovered graph, and a checked implementation. The notation alone is not new: the earlier formalization appears in the</w:t>
       </w:r>
       <w:r>
         <w:rPr>
@@ -249,6 +249,27 @@
         <w:t xml:space="preserve"> </w:t>
       </w:r>
       <w:hyperlink r:id="rId13">
+        <w:r>
+          <w:rPr>
+            <w:rStyle w:val="Hyperlink"/>
+            <w:lang w:val="en-GB"/>
+          </w:rPr>
+          <w:t xml:space="preserve">stochastic-connectivity preprint by Krasnovsky and Maslovskaya</w:t>
+        </w:r>
+      </w:hyperlink>
+      <w:r>
+        <w:rPr>
+          <w:lang w:val="en-GB"/>
+        </w:rPr>
+        <w:t xml:space="preserve">. The</w:t>
+      </w:r>
+      <w:r>
+        <w:rPr>
+          <w:lang w:val="en-GB"/>
+        </w:rPr>
+        <w:t xml:space="preserve"> </w:t>
+      </w:r>
+      <w:hyperlink r:id="rId14">
         <w:r>
           <w:rPr>
             <w:rStyle w:val="Hyperlink"/>
@@ -281,8 +302,8 @@
         <w:t xml:space="preserve">The experimental contribution links a controlled mechanism check to prospective validation. H-EXEC holds a replica pause fixed while changing routing, establishing a scoped failure mechanism for the declared checkout operation. It motivates examining selection and execution guards, but does not retrospectively explain the AINA biases. Technical application checks then establish that the native graph actually enters calculation and that saved models replay exactly. The independent comparison is designed to assess the selected graph model, its guard ablations, a source-adapted earlier graph estimator, raw calibration frequency and independent PMX/Palladio forecasts. Its three applications, ten external operation contracts and complete attempted census are specified before opening main test outcomes. Its accuracy and coverage findings remain to be supplied by that series.</w:t>
       </w:r>
     </w:p>
-    <w:bookmarkEnd w:id="14"/>
-    <w:bookmarkStart w:id="30" w:name="related-work-and-the-remaining-question"/>
+    <w:bookmarkEnd w:id="15"/>
+    <w:bookmarkStart w:id="31" w:name="related-work-and-the-remaining-question"/>
     <w:p>
       <w:pPr>
         <w:pStyle w:val="Heading2"/>
@@ -294,7 +315,7 @@
         <w:t xml:space="preserve">Related work and the remaining question</w:t>
       </w:r>
     </w:p>
-    <w:bookmarkStart w:id="19" w:name="Xee8510d8b496aee36639ebae294e442585ec2eb"/>
+    <w:bookmarkStart w:id="20" w:name="Xee8510d8b496aee36639ebae294e442585ec2eb"/>
     <w:p>
       <w:pPr>
         <w:pStyle w:val="Heading3"/>
@@ -322,7 +343,7 @@
         </w:rPr>
         <w:t xml:space="preserve"> </w:t>
       </w:r>
-      <w:hyperlink r:id="rId15">
+      <w:hyperlink r:id="rId16">
         <w:r>
           <w:rPr>
             <w:rStyle w:val="Hyperlink"/>
@@ -343,7 +364,7 @@
         </w:rPr>
         <w:t xml:space="preserve"> </w:t>
       </w:r>
-      <w:hyperlink r:id="rId16">
+      <w:hyperlink r:id="rId17">
         <w:r>
           <w:rPr>
             <w:rStyle w:val="Hyperlink"/>
@@ -375,7 +396,7 @@
         </w:rPr>
         <w:t xml:space="preserve"> </w:t>
       </w:r>
-      <w:hyperlink r:id="rId17">
+      <w:hyperlink r:id="rId18">
         <w:r>
           <w:rPr>
             <w:rStyle w:val="Hyperlink"/>
@@ -396,7 +417,7 @@
         </w:rPr>
         <w:t xml:space="preserve"> </w:t>
       </w:r>
-      <w:hyperlink r:id="rId18">
+      <w:hyperlink r:id="rId19">
         <w:r>
           <w:rPr>
             <w:rStyle w:val="Hyperlink"/>
@@ -412,8 +433,8 @@
         <w:t xml:space="preserve">.</w:t>
       </w:r>
     </w:p>
-    <w:bookmarkEnd w:id="19"/>
-    <w:bookmarkStart w:id="24" w:name="X0e6309d77ea8102e3585b3854998162c93cc3b8"/>
+    <w:bookmarkEnd w:id="20"/>
+    <w:bookmarkStart w:id="25" w:name="X0e6309d77ea8102e3585b3854998162c93cc3b8"/>
     <w:p>
       <w:pPr>
         <w:pStyle w:val="Heading3"/>
@@ -441,7 +462,7 @@
         </w:rPr>
         <w:t xml:space="preserve"> </w:t>
       </w:r>
-      <w:hyperlink r:id="rId20">
+      <w:hyperlink r:id="rId21">
         <w:r>
           <w:rPr>
             <w:rStyle w:val="Hyperlink"/>
@@ -473,7 +494,7 @@
         </w:rPr>
         <w:t xml:space="preserve"> </w:t>
       </w:r>
-      <w:hyperlink r:id="rId21">
+      <w:hyperlink r:id="rId22">
         <w:r>
           <w:rPr>
             <w:rStyle w:val="Hyperlink"/>
@@ -505,7 +526,7 @@
         </w:rPr>
         <w:t xml:space="preserve"> </w:t>
       </w:r>
-      <w:hyperlink r:id="rId22">
+      <w:hyperlink r:id="rId23">
         <w:r>
           <w:rPr>
             <w:rStyle w:val="Hyperlink"/>
@@ -526,7 +547,7 @@
         </w:rPr>
         <w:t xml:space="preserve"> </w:t>
       </w:r>
-      <w:hyperlink r:id="rId23">
+      <w:hyperlink r:id="rId24">
         <w:r>
           <w:rPr>
             <w:rStyle w:val="Hyperlink"/>
@@ -542,8 +563,8 @@
         <w:t xml:space="preserve">.</w:t>
       </w:r>
     </w:p>
-    <w:bookmarkEnd w:id="24"/>
-    <w:bookmarkStart w:id="27" w:name="X477e812e27c255f4c5e8d8a7a3b9e2814ef439e"/>
+    <w:bookmarkEnd w:id="25"/>
+    <w:bookmarkStart w:id="28" w:name="X477e812e27c255f4c5e8d8a7a3b9e2814ef439e"/>
     <w:p>
       <w:pPr>
         <w:pStyle w:val="Heading3"/>
@@ -571,7 +592,7 @@
         </w:rPr>
         <w:t xml:space="preserve"> </w:t>
       </w:r>
-      <w:hyperlink r:id="rId25">
+      <w:hyperlink r:id="rId26">
         <w:r>
           <w:rPr>
             <w:rStyle w:val="Hyperlink"/>
@@ -603,7 +624,7 @@
         </w:rPr>
         <w:t xml:space="preserve"> </w:t>
       </w:r>
-      <w:hyperlink r:id="rId26">
+      <w:hyperlink r:id="rId27">
         <w:r>
           <w:rPr>
             <w:rStyle w:val="Hyperlink"/>
@@ -619,8 +640,8 @@
         <w:t xml:space="preserve">.</w:t>
       </w:r>
     </w:p>
-    <w:bookmarkEnd w:id="27"/>
-    <w:bookmarkStart w:id="29" w:name="transport-and-the-scope-of-a-forecast"/>
+    <w:bookmarkEnd w:id="28"/>
+    <w:bookmarkStart w:id="30" w:name="transport-and-the-scope-of-a-forecast"/>
     <w:p>
       <w:pPr>
         <w:pStyle w:val="Heading3"/>
@@ -648,7 +669,7 @@
         </w:rPr>
         <w:t xml:space="preserve"> </w:t>
       </w:r>
-      <w:hyperlink r:id="rId28">
+      <w:hyperlink r:id="rId29">
         <w:r>
           <w:rPr>
             <w:rStyle w:val="Hyperlink"/>
@@ -675,9 +696,9 @@
         <w:t xml:space="preserve">Across these lines, the remaining question is narrower than whether telemetry can produce models. It is when an explicit, automatically identified model has enough semantic and observational support for the requested availability claim, and what a controlled independent comparison establishes about that support. The present study answers the formal and implementation parts for a declared class; its empirical generalization is bounded by the completed mechanisms, the tested operation contracts and the actual support of the prospective comparison.</w:t>
       </w:r>
     </w:p>
-    <w:bookmarkEnd w:id="29"/>
     <w:bookmarkEnd w:id="30"/>
-    <w:bookmarkStart w:id="45" w:name="methods"/>
+    <w:bookmarkEnd w:id="31"/>
+    <w:bookmarkStart w:id="47" w:name="methods"/>
     <w:p>
       <w:pPr>
         <w:pStyle w:val="Heading2"/>
@@ -689,7 +710,7 @@
         <w:t xml:space="preserve">Methods</w:t>
       </w:r>
     </w:p>
-    <w:bookmarkStart w:id="32" w:name="estimand-and-unit-of-observation"/>
+    <w:bookmarkStart w:id="33" w:name="estimand-and-unit-of-observation"/>
     <w:p>
       <w:pPr>
         <w:pStyle w:val="Heading3"/>
@@ -717,7 +738,7 @@
         </w:rPr>
         <w:t xml:space="preserve"> </w:t>
       </w:r>
-      <w:hyperlink r:id="rId31">
+      <w:hyperlink r:id="rId32">
         <w:r>
           <w:rPr>
             <w:rStyle w:val="Hyperlink"/>
@@ -761,8 +782,8 @@
         <w:t xml:space="preserve">The comparison uses three applications and ten operations, two declared placements and four failure-law conditions. A campaign is the independent experimental and resampling unit. Requests within a campaign may be dependent. Source-only prediction after a placement change is a different estimand, for which the current implementation does not identify a target probability.</w:t>
       </w:r>
     </w:p>
-    <w:bookmarkEnd w:id="32"/>
-    <w:bookmarkStart w:id="35" w:name="X328c05eadbb2e25dc76fb2ffcd534ad653d1100"/>
+    <w:bookmarkEnd w:id="33"/>
+    <w:bookmarkStart w:id="37" w:name="X328c05eadbb2e25dc76fb2ffcd534ad653d1100"/>
     <w:p>
       <w:pPr>
         <w:pStyle w:val="Heading3"/>
@@ -782,7 +803,223 @@
         <w:rPr>
           <w:lang w:val="en-GB"/>
         </w:rPr>
-        <w:t xml:space="preserve">The model is M = &lt;G, R, P, Phi&gt;. G is an operation-specific graph of observed service and database relations. R binds logical replicas to eligibility gates. P is a joint state law compatible with the observations. Phi is the operation predicate. The observation contract, including masks, is part of the identification problem. This notation organizes the earlier graph estimators; the tuple alone is not a novelty claim. The formalization’s origin in the MODELS manuscript/preprint is attributed as such, without describing that manuscript as an accepted MODELS publication.</w:t>
+        <w:t xml:space="preserve">The model is</w:t>
+      </w:r>
+      <w:r>
+        <w:rPr>
+          <w:lang w:val="en-GB"/>
+        </w:rPr>
+        <w:t xml:space="preserve"> </w:t>
+      </w:r>
+      <m:oMath>
+        <m:r>
+          <m:t>M</m:t>
+        </m:r>
+        <m:r>
+          <m:rPr>
+            <m:sty m:val="p"/>
+          </m:rPr>
+          <m:t>=</m:t>
+        </m:r>
+        <m:r>
+          <m:rPr>
+            <m:sty m:val="p"/>
+          </m:rPr>
+          <m:t>⟨</m:t>
+        </m:r>
+        <m:r>
+          <m:t>G</m:t>
+        </m:r>
+        <m:r>
+          <m:rPr>
+            <m:sty m:val="p"/>
+          </m:rPr>
+          <m:t>,</m:t>
+        </m:r>
+        <m:r>
+          <m:t>R</m:t>
+        </m:r>
+        <m:r>
+          <m:rPr>
+            <m:sty m:val="p"/>
+          </m:rPr>
+          <m:t>,</m:t>
+        </m:r>
+        <m:r>
+          <m:t>P</m:t>
+        </m:r>
+        <m:r>
+          <m:rPr>
+            <m:sty m:val="p"/>
+          </m:rPr>
+          <m:t>,</m:t>
+        </m:r>
+        <m:r>
+          <m:rPr>
+            <m:sty m:val="p"/>
+          </m:rPr>
+          <m:t>Φ</m:t>
+        </m:r>
+        <m:r>
+          <m:rPr>
+            <m:sty m:val="p"/>
+          </m:rPr>
+          <m:t>⟩</m:t>
+        </m:r>
+      </m:oMath>
+      <w:r>
+        <w:rPr>
+          <w:lang w:val="en-GB"/>
+        </w:rPr>
+        <w:t xml:space="preserve">.</w:t>
+      </w:r>
+      <w:r>
+        <w:rPr>
+          <w:lang w:val="en-GB"/>
+        </w:rPr>
+        <w:t xml:space="preserve"> </w:t>
+      </w:r>
+      <m:oMath>
+        <m:r>
+          <m:t>G</m:t>
+        </m:r>
+      </m:oMath>
+      <w:r>
+        <w:rPr>
+          <w:lang w:val="en-GB"/>
+        </w:rPr>
+        <w:t xml:space="preserve"> </w:t>
+      </w:r>
+      <w:r>
+        <w:rPr>
+          <w:lang w:val="en-GB"/>
+        </w:rPr>
+        <w:t xml:space="preserve">is an operation-specific graph of observed service and database relations.</w:t>
+      </w:r>
+      <w:r>
+        <w:rPr>
+          <w:lang w:val="en-GB"/>
+        </w:rPr>
+        <w:t xml:space="preserve"> </w:t>
+      </w:r>
+      <m:oMath>
+        <m:r>
+          <m:t>R</m:t>
+        </m:r>
+      </m:oMath>
+      <w:r>
+        <w:rPr>
+          <w:lang w:val="en-GB"/>
+        </w:rPr>
+        <w:t xml:space="preserve"> </w:t>
+      </w:r>
+      <w:r>
+        <w:rPr>
+          <w:lang w:val="en-GB"/>
+        </w:rPr>
+        <w:t xml:space="preserve">binds logical replicas to eligibility gates.</w:t>
+      </w:r>
+      <w:r>
+        <w:rPr>
+          <w:lang w:val="en-GB"/>
+        </w:rPr>
+        <w:t xml:space="preserve"> </w:t>
+      </w:r>
+      <m:oMath>
+        <m:r>
+          <m:t>P</m:t>
+        </m:r>
+      </m:oMath>
+      <w:r>
+        <w:rPr>
+          <w:lang w:val="en-GB"/>
+        </w:rPr>
+        <w:t xml:space="preserve"> </w:t>
+      </w:r>
+      <w:r>
+        <w:rPr>
+          <w:lang w:val="en-GB"/>
+        </w:rPr>
+        <w:t xml:space="preserve">is a joint state law compatible with the observations.</w:t>
+      </w:r>
+      <w:r>
+        <w:rPr>
+          <w:lang w:val="en-GB"/>
+        </w:rPr>
+        <w:t xml:space="preserve"> </w:t>
+      </w:r>
+      <m:oMath>
+        <m:r>
+          <m:rPr>
+            <m:sty m:val="p"/>
+          </m:rPr>
+          <m:t>Φ</m:t>
+        </m:r>
+      </m:oMath>
+      <w:r>
+        <w:rPr>
+          <w:lang w:val="en-GB"/>
+        </w:rPr>
+        <w:t xml:space="preserve"> </w:t>
+      </w:r>
+      <w:r>
+        <w:rPr>
+          <w:lang w:val="en-GB"/>
+        </w:rPr>
+        <w:t xml:space="preserve">is the operation predicate. The observation contract, including masks, is part of the identification problem. This notation organizes the earlier graph estimators; the tuple alone is not a novelty claim. Its origin is the</w:t>
+      </w:r>
+      <w:r>
+        <w:rPr>
+          <w:lang w:val="en-GB"/>
+        </w:rPr>
+        <w:t xml:space="preserve"> </w:t>
+      </w:r>
+      <w:hyperlink r:id="rId13">
+        <w:r>
+          <w:rPr>
+            <w:rStyle w:val="Hyperlink"/>
+            <w:lang w:val="en-GB"/>
+          </w:rPr>
+          <w:t xml:space="preserve">Krasnovsky–Maslovskaya preprint</w:t>
+        </w:r>
+      </w:hyperlink>
+      <w:r>
+        <w:rPr>
+          <w:lang w:val="en-GB"/>
+        </w:rPr>
+        <w:t xml:space="preserve">, cited as a preprint rather than an accepted MODELS publication.</w:t>
+      </w:r>
+    </w:p>
+    <w:p>
+      <w:pPr>
+        <w:pStyle w:val="BodyText"/>
+      </w:pPr>
+      <w:r>
+        <w:rPr>
+          <w:lang w:val="en-GB"/>
+        </w:rPr>
+        <w:t xml:space="preserve">The predecessor’s Sections 4–5 already define a typed graph, replication map, general state measure and request predicates, with a product-law baseline for what-if analysis. Our implementation changes the state and observation contract: selected replicas, completion and timing belong to one request-aligned joint law, and masked observations define a set of compatible laws. The replica binding also records eligibility gates. This is a declared execution extension of the earlier object, not an implementation of every distribution or eventual-completion predicate that its general notation permits. The retained local manuscript and reference code keep their separate</w:t>
+      </w:r>
+      <w:r>
+        <w:rPr>
+          <w:lang w:val="en-GB"/>
+        </w:rPr>
+        <w:t xml:space="preserve"> </w:t>
+      </w:r>
+      <w:hyperlink r:id="rId34">
+        <w:r>
+          <w:rPr>
+            <w:rStyle w:val="Hyperlink"/>
+            <w:lang w:val="en-GB"/>
+          </w:rPr>
+          <w:t xml:space="preserve">byte provenance</w:t>
+        </w:r>
+      </w:hyperlink>
+      <w:r>
+        <w:rPr>
+          <w:lang w:val="en-GB"/>
+        </w:rPr>
+        <w:t xml:space="preserve">.</w:t>
       </w:r>
     </w:p>
     <w:p>
@@ -1641,7 +1878,7 @@
         </w:rPr>
         <w:t xml:space="preserve"> </w:t>
       </w:r>
-      <w:hyperlink r:id="rId33">
+      <w:hyperlink r:id="rId35">
         <w:r>
           <w:rPr>
             <w:rStyle w:val="Hyperlink"/>
@@ -1662,7 +1899,7 @@
         </w:rPr>
         <w:t xml:space="preserve"> </w:t>
       </w:r>
-      <w:hyperlink r:id="rId34">
+      <w:hyperlink r:id="rId36">
         <w:r>
           <w:rPr>
             <w:rStyle w:val="Hyperlink"/>
@@ -1678,8 +1915,8 @@
         <w:t xml:space="preserve">. The prospective wrapper preserves the qualified numeric identification/solve path, while changing campaign identity, expected calibration census and stage timing. It does not tune an unexplained q from semantic labels.</w:t>
       </w:r>
     </w:p>
-    <w:bookmarkEnd w:id="35"/>
-    <w:bookmarkStart w:id="37" w:name="Xaca6518484ef186592f7dceb6ce7ca825ecd5a0"/>
+    <w:bookmarkEnd w:id="37"/>
+    <w:bookmarkStart w:id="39" w:name="Xaca6518484ef186592f7dceb6ce7ca825ecd5a0"/>
     <w:p>
       <w:pPr>
         <w:pStyle w:val="Heading3"/>
@@ -1699,18 +1936,488 @@
         <w:rPr>
           <w:lang w:val="en-GB"/>
         </w:rPr>
-        <w:t xml:space="preserve">Let B(s) be synchronous reachability of every declared required node in state s. Let</w:t>
+        <w:t xml:space="preserve">Let</w:t>
+      </w:r>
+      <w:r>
+        <w:rPr>
+          <w:lang w:val="en-GB"/>
+        </w:rPr>
+        <w:t xml:space="preserve"> </w:t>
+      </w:r>
+      <m:oMath>
+        <m:r>
+          <m:t>B</m:t>
+        </m:r>
+        <m:r>
+          <m:rPr>
+            <m:sty m:val="p"/>
+          </m:rPr>
+          <m:t>(</m:t>
+        </m:r>
+        <m:r>
+          <m:t>s</m:t>
+        </m:r>
+        <m:r>
+          <m:rPr>
+            <m:sty m:val="p"/>
+          </m:rPr>
+          <m:t>)</m:t>
+        </m:r>
+      </m:oMath>
+      <w:r>
+        <w:rPr>
+          <w:lang w:val="en-GB"/>
+        </w:rPr>
+        <w:t xml:space="preserve"> </w:t>
+      </w:r>
+      <w:r>
+        <w:rPr>
+          <w:lang w:val="en-GB"/>
+        </w:rPr>
+        <w:t xml:space="preserve">be synchronous reachability of every declared required node in state</w:t>
+      </w:r>
+      <w:r>
+        <w:rPr>
+          <w:lang w:val="en-GB"/>
+        </w:rPr>
+        <w:t xml:space="preserve"> </w:t>
+      </w:r>
+      <m:oMath>
+        <m:r>
+          <m:t>s</m:t>
+        </m:r>
+      </m:oMath>
+      <w:r>
+        <w:rPr>
+          <w:lang w:val="en-GB"/>
+        </w:rPr>
+        <w:t xml:space="preserve">. For each controlled service</w:t>
+      </w:r>
+      <w:r>
+        <w:rPr>
+          <w:lang w:val="en-GB"/>
+        </w:rPr>
+        <w:t xml:space="preserve"> </w:t>
+      </w:r>
+      <m:oMath>
+        <m:r>
+          <m:t>v</m:t>
+        </m:r>
+      </m:oMath>
+      <w:r>
+        <w:rPr>
+          <w:lang w:val="en-GB"/>
+        </w:rPr>
+        <w:t xml:space="preserve">, let</w:t>
+      </w:r>
+      <w:r>
+        <w:rPr>
+          <w:lang w:val="en-GB"/>
+        </w:rPr>
+        <w:t xml:space="preserve"> </w:t>
+      </w:r>
+      <m:oMath>
+        <m:sSub>
+          <m:e>
+            <m:r>
+              <m:t>D</m:t>
+            </m:r>
+          </m:e>
+          <m:sub>
+            <m:r>
+              <m:t>v</m:t>
+            </m:r>
+            <m:r>
+              <m:t>r</m:t>
+            </m:r>
+          </m:sub>
+        </m:sSub>
+      </m:oMath>
+      <w:r>
+        <w:rPr>
+          <w:lang w:val="en-GB"/>
+        </w:rPr>
+        <w:t xml:space="preserve"> </w:t>
+      </w:r>
+      <w:r>
+        <w:rPr>
+          <w:lang w:val="en-GB"/>
+        </w:rPr>
+        <w:t xml:space="preserve">indicate that replica</w:t>
+      </w:r>
+      <w:r>
+        <w:rPr>
+          <w:lang w:val="en-GB"/>
+        </w:rPr>
+        <w:t xml:space="preserve"> </w:t>
+      </w:r>
+      <m:oMath>
+        <m:r>
+          <m:t>r</m:t>
+        </m:r>
+      </m:oMath>
+      <w:r>
+        <w:rPr>
+          <w:lang w:val="en-GB"/>
+        </w:rPr>
+        <w:t xml:space="preserve"> </w:t>
+      </w:r>
+      <w:r>
+        <w:rPr>
+          <w:lang w:val="en-GB"/>
+        </w:rPr>
+        <w:t xml:space="preserve">is demanded by a mandatory call, and let</w:t>
+      </w:r>
+      <w:r>
+        <w:rPr>
+          <w:lang w:val="en-GB"/>
+        </w:rPr>
+        <w:t xml:space="preserve"> </w:t>
+      </w:r>
+      <m:oMath>
+        <m:sSub>
+          <m:e>
+            <m:r>
+              <m:t>A</m:t>
+            </m:r>
+          </m:e>
+          <m:sub>
+            <m:r>
+              <m:t>v</m:t>
+            </m:r>
+            <m:r>
+              <m:t>r</m:t>
+            </m:r>
+          </m:sub>
+        </m:sSub>
+        <m:r>
+          <m:rPr>
+            <m:sty m:val="p"/>
+          </m:rPr>
+          <m:t>(</m:t>
+        </m:r>
+        <m:r>
+          <m:t>s</m:t>
+        </m:r>
+        <m:r>
+          <m:rPr>
+            <m:sty m:val="p"/>
+          </m:rPr>
+          <m:t>)</m:t>
+        </m:r>
+      </m:oMath>
+      <w:r>
+        <w:rPr>
+          <w:lang w:val="en-GB"/>
+        </w:rPr>
+        <w:t xml:space="preserve"> </w:t>
+      </w:r>
+      <w:r>
+        <w:rPr>
+          <w:lang w:val="en-GB"/>
+        </w:rPr>
+        <w:t xml:space="preserve">be the conjunction of that replica’s eligibility gates under</w:t>
+      </w:r>
+      <w:r>
+        <w:rPr>
+          <w:lang w:val="en-GB"/>
+        </w:rPr>
+        <w:t xml:space="preserve"> </w:t>
+      </w:r>
+      <m:oMath>
+        <m:r>
+          <m:t>R</m:t>
+        </m:r>
+      </m:oMath>
+      <w:r>
+        <w:rPr>
+          <w:lang w:val="en-GB"/>
+        </w:rPr>
+        <w:t xml:space="preserve">. Define</w:t>
       </w:r>
     </w:p>
     <w:p>
       <w:pPr>
         <w:pStyle w:val="BodyText"/>
       </w:pPr>
-      <w:r>
-        <w:rPr>
-          <w:lang w:val="en-GB"/>
-        </w:rPr>
-        <w:t xml:space="preserve">Rsel(s) = B(s) AND [for each controlled service, at least one replica is demanded and every demanded replica has all its eligibility gates true].</w:t>
+      <m:oMathPara>
+        <m:oMathParaPr>
+          <m:jc m:val="center"/>
+        </m:oMathParaPr>
+        <m:oMath>
+          <m:sSub>
+            <m:e>
+              <m:r>
+                <m:t>R</m:t>
+              </m:r>
+            </m:e>
+            <m:sub>
+              <m:r>
+                <m:rPr>
+                  <m:sty m:val="p"/>
+                </m:rPr>
+                <m:t>s</m:t>
+              </m:r>
+              <m:r>
+                <m:rPr>
+                  <m:sty m:val="p"/>
+                </m:rPr>
+                <m:t>e</m:t>
+              </m:r>
+              <m:r>
+                <m:rPr>
+                  <m:sty m:val="p"/>
+                </m:rPr>
+                <m:t>l</m:t>
+              </m:r>
+            </m:sub>
+          </m:sSub>
+          <m:r>
+            <m:rPr>
+              <m:sty m:val="p"/>
+            </m:rPr>
+            <m:t>(</m:t>
+          </m:r>
+          <m:r>
+            <m:t>s</m:t>
+          </m:r>
+          <m:r>
+            <m:rPr>
+              <m:sty m:val="p"/>
+            </m:rPr>
+            <m:t>)</m:t>
+          </m:r>
+          <m:r>
+            <m:rPr>
+              <m:sty m:val="p"/>
+            </m:rPr>
+            <m:t>=</m:t>
+          </m:r>
+          <m:r>
+            <m:t>B</m:t>
+          </m:r>
+          <m:r>
+            <m:rPr>
+              <m:sty m:val="p"/>
+            </m:rPr>
+            <m:t>(</m:t>
+          </m:r>
+          <m:r>
+            <m:t>s</m:t>
+          </m:r>
+          <m:r>
+            <m:rPr>
+              <m:sty m:val="p"/>
+            </m:rPr>
+            <m:t>)</m:t>
+          </m:r>
+          <m:r>
+            <m:rPr>
+              <m:sty m:val="p"/>
+            </m:rPr>
+            <m:t>∧</m:t>
+          </m:r>
+          <m:limLow>
+            <m:e>
+              <m:r>
+                <m:rPr>
+                  <m:sty m:val="p"/>
+                </m:rPr>
+                <m:t>⋀</m:t>
+              </m:r>
+            </m:e>
+            <m:lim>
+              <m:r>
+                <m:t>v</m:t>
+              </m:r>
+            </m:lim>
+          </m:limLow>
+          <m:d>
+            <m:dPr>
+              <m:begChr m:val="["/>
+              <m:sepChr m:val=""/>
+              <m:endChr m:val="]"/>
+              <m:grow/>
+            </m:dPr>
+            <m:e>
+              <m:d>
+                <m:dPr>
+                  <m:begChr m:val="("/>
+                  <m:sepChr m:val=""/>
+                  <m:endChr m:val=")"/>
+                  <m:grow/>
+                </m:dPr>
+                <m:e>
+                  <m:limLow>
+                    <m:e>
+                      <m:r>
+                        <m:rPr>
+                          <m:sty m:val="p"/>
+                        </m:rPr>
+                        <m:t>⋁</m:t>
+                      </m:r>
+                    </m:e>
+                    <m:lim>
+                      <m:r>
+                        <m:t>r</m:t>
+                      </m:r>
+                    </m:lim>
+                  </m:limLow>
+                  <m:sSub>
+                    <m:e>
+                      <m:r>
+                        <m:t>D</m:t>
+                      </m:r>
+                    </m:e>
+                    <m:sub>
+                      <m:r>
+                        <m:t>v</m:t>
+                      </m:r>
+                      <m:r>
+                        <m:t>r</m:t>
+                      </m:r>
+                    </m:sub>
+                  </m:sSub>
+                  <m:r>
+                    <m:rPr>
+                      <m:sty m:val="p"/>
+                    </m:rPr>
+                    <m:t>(</m:t>
+                  </m:r>
+                  <m:r>
+                    <m:t>s</m:t>
+                  </m:r>
+                  <m:r>
+                    <m:rPr>
+                      <m:sty m:val="p"/>
+                    </m:rPr>
+                    <m:t>)</m:t>
+                  </m:r>
+                </m:e>
+              </m:d>
+              <m:r>
+                <m:rPr>
+                  <m:sty m:val="p"/>
+                </m:rPr>
+                <m:t>∧</m:t>
+              </m:r>
+              <m:limLow>
+                <m:e>
+                  <m:r>
+                    <m:rPr>
+                      <m:sty m:val="p"/>
+                    </m:rPr>
+                    <m:t>⋀</m:t>
+                  </m:r>
+                </m:e>
+                <m:lim>
+                  <m:r>
+                    <m:t>r</m:t>
+                  </m:r>
+                </m:lim>
+              </m:limLow>
+              <m:d>
+                <m:dPr>
+                  <m:begChr m:val="("/>
+                  <m:sepChr m:val=""/>
+                  <m:endChr m:val=")"/>
+                  <m:grow/>
+                </m:dPr>
+                <m:e>
+                  <m:r>
+                    <m:rPr>
+                      <m:sty m:val="p"/>
+                    </m:rPr>
+                    <m:t>¬</m:t>
+                  </m:r>
+                  <m:sSub>
+                    <m:e>
+                      <m:r>
+                        <m:t>D</m:t>
+                      </m:r>
+                    </m:e>
+                    <m:sub>
+                      <m:r>
+                        <m:t>v</m:t>
+                      </m:r>
+                      <m:r>
+                        <m:t>r</m:t>
+                      </m:r>
+                    </m:sub>
+                  </m:sSub>
+                  <m:r>
+                    <m:rPr>
+                      <m:sty m:val="p"/>
+                    </m:rPr>
+                    <m:t>(</m:t>
+                  </m:r>
+                  <m:r>
+                    <m:t>s</m:t>
+                  </m:r>
+                  <m:r>
+                    <m:rPr>
+                      <m:sty m:val="p"/>
+                    </m:rPr>
+                    <m:t>)</m:t>
+                  </m:r>
+                  <m:r>
+                    <m:rPr>
+                      <m:sty m:val="p"/>
+                    </m:rPr>
+                    <m:t>∨</m:t>
+                  </m:r>
+                  <m:sSub>
+                    <m:e>
+                      <m:r>
+                        <m:t>A</m:t>
+                      </m:r>
+                    </m:e>
+                    <m:sub>
+                      <m:r>
+                        <m:t>v</m:t>
+                      </m:r>
+                      <m:r>
+                        <m:t>r</m:t>
+                      </m:r>
+                    </m:sub>
+                  </m:sSub>
+                  <m:r>
+                    <m:rPr>
+                      <m:sty m:val="p"/>
+                    </m:rPr>
+                    <m:t>(</m:t>
+                  </m:r>
+                  <m:r>
+                    <m:t>s</m:t>
+                  </m:r>
+                  <m:r>
+                    <m:rPr>
+                      <m:sty m:val="p"/>
+                    </m:rPr>
+                    <m:t>)</m:t>
+                  </m:r>
+                </m:e>
+              </m:d>
+            </m:e>
+          </m:d>
+          <m:r>
+            <m:rPr>
+              <m:sty m:val="p"/>
+            </m:rPr>
+            <m:t>.</m:t>
+          </m:r>
+        </m:oMath>
+      </m:oMathPara>
+    </w:p>
+    <w:p>
+      <w:pPr>
+        <w:pStyle w:val="FirstParagraph"/>
+      </w:pPr>
+      <w:r>
+        <w:rPr>
+          <w:lang w:val="en-GB"/>
+        </w:rPr>
+        <w:t xml:space="preserve">Thus each controlled service must have at least one demanded replica, and every demanded replica must have all its eligibility gates true. Both replicas may be demanded within one attempt; there is no exclusive-choice or independent-routing assumption.</w:t>
       </w:r>
     </w:p>
     <w:p>
@@ -1721,7 +2428,237 @@
         <w:rPr>
           <w:lang w:val="en-GB"/>
         </w:rPr>
-        <w:t xml:space="preserve">Let C(s) be C0 AND every required Cg AND the presence of each bound required synchronous edge. Define E(s) = Rsel(s) AND C(s) AND T(s). A missing required edge makes completion false even if an alternative path reaches the same service. Optional synchronous work and asynchronous work are not automatically prerequisites of immediate business completion. This is a declared immediate-completion class, not a model of eventual completion.</w:t>
+        <w:t xml:space="preserve">Let</w:t>
+      </w:r>
+      <w:r>
+        <w:rPr>
+          <w:lang w:val="en-GB"/>
+        </w:rPr>
+        <w:t xml:space="preserve"> </w:t>
+      </w:r>
+      <m:oMath>
+        <m:r>
+          <m:t>C</m:t>
+        </m:r>
+        <m:r>
+          <m:rPr>
+            <m:sty m:val="p"/>
+          </m:rPr>
+          <m:t>(</m:t>
+        </m:r>
+        <m:r>
+          <m:t>s</m:t>
+        </m:r>
+        <m:r>
+          <m:rPr>
+            <m:sty m:val="p"/>
+          </m:rPr>
+          <m:t>)</m:t>
+        </m:r>
+      </m:oMath>
+      <w:r>
+        <w:rPr>
+          <w:lang w:val="en-GB"/>
+        </w:rPr>
+        <w:t xml:space="preserve"> </w:t>
+      </w:r>
+      <w:r>
+        <w:rPr>
+          <w:lang w:val="en-GB"/>
+        </w:rPr>
+        <w:t xml:space="preserve">be</w:t>
+      </w:r>
+      <w:r>
+        <w:rPr>
+          <w:lang w:val="en-GB"/>
+        </w:rPr>
+        <w:t xml:space="preserve"> </w:t>
+      </w:r>
+      <m:oMath>
+        <m:sSub>
+          <m:e>
+            <m:r>
+              <m:t>C</m:t>
+            </m:r>
+          </m:e>
+          <m:sub>
+            <m:r>
+              <m:t>0</m:t>
+            </m:r>
+          </m:sub>
+        </m:sSub>
+      </m:oMath>
+      <w:r>
+        <w:rPr>
+          <w:lang w:val="en-GB"/>
+        </w:rPr>
+        <w:t xml:space="preserve"> </w:t>
+      </w:r>
+      <w:r>
+        <w:rPr>
+          <w:lang w:val="en-GB"/>
+        </w:rPr>
+        <w:t xml:space="preserve">conjoined with every required</w:t>
+      </w:r>
+      <w:r>
+        <w:rPr>
+          <w:lang w:val="en-GB"/>
+        </w:rPr>
+        <w:t xml:space="preserve"> </w:t>
+      </w:r>
+      <m:oMath>
+        <m:sSub>
+          <m:e>
+            <m:r>
+              <m:t>C</m:t>
+            </m:r>
+          </m:e>
+          <m:sub>
+            <m:r>
+              <m:t>g</m:t>
+            </m:r>
+          </m:sub>
+        </m:sSub>
+      </m:oMath>
+      <w:r>
+        <w:rPr>
+          <w:lang w:val="en-GB"/>
+        </w:rPr>
+        <w:t xml:space="preserve"> </w:t>
+      </w:r>
+      <w:r>
+        <w:rPr>
+          <w:lang w:val="en-GB"/>
+        </w:rPr>
+        <w:t xml:space="preserve">and the presence of each bound required synchronous edge. Define</w:t>
+      </w:r>
+      <w:r>
+        <w:rPr>
+          <w:lang w:val="en-GB"/>
+        </w:rPr>
+        <w:t xml:space="preserve"> </w:t>
+      </w:r>
+      <m:oMath>
+        <m:r>
+          <m:t>E</m:t>
+        </m:r>
+        <m:r>
+          <m:rPr>
+            <m:sty m:val="p"/>
+          </m:rPr>
+          <m:t>(</m:t>
+        </m:r>
+        <m:r>
+          <m:t>s</m:t>
+        </m:r>
+        <m:r>
+          <m:rPr>
+            <m:sty m:val="p"/>
+          </m:rPr>
+          <m:t>)</m:t>
+        </m:r>
+        <m:r>
+          <m:rPr>
+            <m:sty m:val="p"/>
+          </m:rPr>
+          <m:t>=</m:t>
+        </m:r>
+        <m:sSub>
+          <m:e>
+            <m:r>
+              <m:t>R</m:t>
+            </m:r>
+          </m:e>
+          <m:sub>
+            <m:r>
+              <m:rPr>
+                <m:sty m:val="p"/>
+              </m:rPr>
+              <m:t>s</m:t>
+            </m:r>
+            <m:r>
+              <m:rPr>
+                <m:sty m:val="p"/>
+              </m:rPr>
+              <m:t>e</m:t>
+            </m:r>
+            <m:r>
+              <m:rPr>
+                <m:sty m:val="p"/>
+              </m:rPr>
+              <m:t>l</m:t>
+            </m:r>
+          </m:sub>
+        </m:sSub>
+        <m:r>
+          <m:rPr>
+            <m:sty m:val="p"/>
+          </m:rPr>
+          <m:t>(</m:t>
+        </m:r>
+        <m:r>
+          <m:t>s</m:t>
+        </m:r>
+        <m:r>
+          <m:rPr>
+            <m:sty m:val="p"/>
+          </m:rPr>
+          <m:t>)</m:t>
+        </m:r>
+        <m:r>
+          <m:rPr>
+            <m:sty m:val="p"/>
+          </m:rPr>
+          <m:t>∧</m:t>
+        </m:r>
+        <m:r>
+          <m:t>C</m:t>
+        </m:r>
+        <m:r>
+          <m:rPr>
+            <m:sty m:val="p"/>
+          </m:rPr>
+          <m:t>(</m:t>
+        </m:r>
+        <m:r>
+          <m:t>s</m:t>
+        </m:r>
+        <m:r>
+          <m:rPr>
+            <m:sty m:val="p"/>
+          </m:rPr>
+          <m:t>)</m:t>
+        </m:r>
+        <m:r>
+          <m:rPr>
+            <m:sty m:val="p"/>
+          </m:rPr>
+          <m:t>∧</m:t>
+        </m:r>
+        <m:r>
+          <m:t>T</m:t>
+        </m:r>
+        <m:r>
+          <m:rPr>
+            <m:sty m:val="p"/>
+          </m:rPr>
+          <m:t>(</m:t>
+        </m:r>
+        <m:r>
+          <m:t>s</m:t>
+        </m:r>
+        <m:r>
+          <m:rPr>
+            <m:sty m:val="p"/>
+          </m:rPr>
+          <m:t>)</m:t>
+        </m:r>
+      </m:oMath>
+      <w:r>
+        <w:rPr>
+          <w:lang w:val="en-GB"/>
+        </w:rPr>
+        <w:t xml:space="preserve">. A missing required edge makes completion false even if an alternative path reaches the same service. Optional synchronous work and asynchronous work are not automatically prerequisites of immediate business completion. This is a declared immediate-completion class, not a model of eventual completion.</w:t>
       </w:r>
     </w:p>
     <w:p>
@@ -1732,35 +2669,229 @@
         <w:rPr>
           <w:lang w:val="en-GB"/>
         </w:rPr>
-        <w:t xml:space="preserve">The implemented graph functionals are B (GID), Rsel (Gselected), E (Gstar), Rsel</w:t>
-      </w:r>
-      <w:r>
-        <w:rPr>
-          <w:i/>
-          <w:iCs/>
-          <w:lang w:val="en-GB"/>
-        </w:rPr>
-        <w:t xml:space="preserve">C (without deadline), B</w:t>
-      </w:r>
-      <w:r>
-        <w:rPr>
-          <w:lang w:val="en-GB"/>
-        </w:rPr>
-        <w:t xml:space="preserve">C</w:t>
-      </w:r>
-      <w:r>
-        <w:rPr>
-          <w:i/>
-          <w:iCs/>
-          <w:lang w:val="en-GB"/>
-        </w:rPr>
-        <w:t xml:space="preserve">T (without selection), and Rsel</w:t>
-      </w:r>
-      <w:r>
-        <w:rPr>
-          <w:lang w:val="en-GB"/>
-        </w:rPr>
-        <w:t xml:space="preserve">T (without completion). All use the same discovered model and joint observation law. Thus a difference between two of these functionals isolates a mathematical guard in this model; it does not by itself identify a real-world causal mechanism.</w:t>
+        <w:t xml:space="preserve">The implemented graph functionals are</w:t>
+      </w:r>
+      <w:r>
+        <w:rPr>
+          <w:lang w:val="en-GB"/>
+        </w:rPr>
+        <w:t xml:space="preserve"> </w:t>
+      </w:r>
+      <m:oMath>
+        <m:r>
+          <m:t>B</m:t>
+        </m:r>
+      </m:oMath>
+      <w:r>
+        <w:rPr>
+          <w:lang w:val="en-GB"/>
+        </w:rPr>
+        <w:t xml:space="preserve"> </w:t>
+      </w:r>
+      <w:r>
+        <w:rPr>
+          <w:lang w:val="en-GB"/>
+        </w:rPr>
+        <w:t xml:space="preserve">(GID),</w:t>
+      </w:r>
+      <w:r>
+        <w:rPr>
+          <w:lang w:val="en-GB"/>
+        </w:rPr>
+        <w:t xml:space="preserve"> </w:t>
+      </w:r>
+      <m:oMath>
+        <m:sSub>
+          <m:e>
+            <m:r>
+              <m:t>R</m:t>
+            </m:r>
+          </m:e>
+          <m:sub>
+            <m:r>
+              <m:rPr>
+                <m:sty m:val="p"/>
+              </m:rPr>
+              <m:t>s</m:t>
+            </m:r>
+            <m:r>
+              <m:rPr>
+                <m:sty m:val="p"/>
+              </m:rPr>
+              <m:t>e</m:t>
+            </m:r>
+            <m:r>
+              <m:rPr>
+                <m:sty m:val="p"/>
+              </m:rPr>
+              <m:t>l</m:t>
+            </m:r>
+          </m:sub>
+        </m:sSub>
+      </m:oMath>
+      <w:r>
+        <w:rPr>
+          <w:lang w:val="en-GB"/>
+        </w:rPr>
+        <w:t xml:space="preserve"> </w:t>
+      </w:r>
+      <w:r>
+        <w:rPr>
+          <w:lang w:val="en-GB"/>
+        </w:rPr>
+        <w:t xml:space="preserve">(Gselected),</w:t>
+      </w:r>
+      <w:r>
+        <w:rPr>
+          <w:lang w:val="en-GB"/>
+        </w:rPr>
+        <w:t xml:space="preserve"> </w:t>
+      </w:r>
+      <m:oMath>
+        <m:r>
+          <m:t>E</m:t>
+        </m:r>
+      </m:oMath>
+      <w:r>
+        <w:rPr>
+          <w:lang w:val="en-GB"/>
+        </w:rPr>
+        <w:t xml:space="preserve"> </w:t>
+      </w:r>
+      <w:r>
+        <w:rPr>
+          <w:lang w:val="en-GB"/>
+        </w:rPr>
+        <w:t xml:space="preserve">(Gstar),</w:t>
+      </w:r>
+      <w:r>
+        <w:rPr>
+          <w:lang w:val="en-GB"/>
+        </w:rPr>
+        <w:t xml:space="preserve"> </w:t>
+      </w:r>
+      <m:oMath>
+        <m:sSub>
+          <m:e>
+            <m:r>
+              <m:t>R</m:t>
+            </m:r>
+          </m:e>
+          <m:sub>
+            <m:r>
+              <m:rPr>
+                <m:sty m:val="p"/>
+              </m:rPr>
+              <m:t>s</m:t>
+            </m:r>
+            <m:r>
+              <m:rPr>
+                <m:sty m:val="p"/>
+              </m:rPr>
+              <m:t>e</m:t>
+            </m:r>
+            <m:r>
+              <m:rPr>
+                <m:sty m:val="p"/>
+              </m:rPr>
+              <m:t>l</m:t>
+            </m:r>
+          </m:sub>
+        </m:sSub>
+        <m:r>
+          <m:t>C</m:t>
+        </m:r>
+      </m:oMath>
+      <w:r>
+        <w:rPr>
+          <w:lang w:val="en-GB"/>
+        </w:rPr>
+        <w:t xml:space="preserve"> </w:t>
+      </w:r>
+      <w:r>
+        <w:rPr>
+          <w:lang w:val="en-GB"/>
+        </w:rPr>
+        <w:t xml:space="preserve">(without deadline),</w:t>
+      </w:r>
+      <w:r>
+        <w:rPr>
+          <w:lang w:val="en-GB"/>
+        </w:rPr>
+        <w:t xml:space="preserve"> </w:t>
+      </w:r>
+      <m:oMath>
+        <m:r>
+          <m:t>B</m:t>
+        </m:r>
+        <m:r>
+          <m:t>C</m:t>
+        </m:r>
+        <m:r>
+          <m:t>T</m:t>
+        </m:r>
+      </m:oMath>
+      <w:r>
+        <w:rPr>
+          <w:lang w:val="en-GB"/>
+        </w:rPr>
+        <w:t xml:space="preserve"> </w:t>
+      </w:r>
+      <w:r>
+        <w:rPr>
+          <w:lang w:val="en-GB"/>
+        </w:rPr>
+        <w:t xml:space="preserve">(without selection), and</w:t>
+      </w:r>
+      <w:r>
+        <w:rPr>
+          <w:lang w:val="en-GB"/>
+        </w:rPr>
+        <w:t xml:space="preserve"> </w:t>
+      </w:r>
+      <m:oMath>
+        <m:sSub>
+          <m:e>
+            <m:r>
+              <m:t>R</m:t>
+            </m:r>
+          </m:e>
+          <m:sub>
+            <m:r>
+              <m:rPr>
+                <m:sty m:val="p"/>
+              </m:rPr>
+              <m:t>s</m:t>
+            </m:r>
+            <m:r>
+              <m:rPr>
+                <m:sty m:val="p"/>
+              </m:rPr>
+              <m:t>e</m:t>
+            </m:r>
+            <m:r>
+              <m:rPr>
+                <m:sty m:val="p"/>
+              </m:rPr>
+              <m:t>l</m:t>
+            </m:r>
+          </m:sub>
+        </m:sSub>
+        <m:r>
+          <m:t>T</m:t>
+        </m:r>
+      </m:oMath>
+      <w:r>
+        <w:rPr>
+          <w:lang w:val="en-GB"/>
+        </w:rPr>
+        <w:t xml:space="preserve"> </w:t>
+      </w:r>
+      <w:r>
+        <w:rPr>
+          <w:lang w:val="en-GB"/>
+        </w:rPr>
+        <w:t xml:space="preserve">(without completion), where multiplication denotes Boolean conjunction. All use the same discovered model and joint observation law. Thus a difference between two of these functionals isolates a mathematical guard in this model; it does not by itself identify a real-world causal mechanism.</w:t>
       </w:r>
     </w:p>
     <w:p>
@@ -1785,23 +2916,251 @@
         <w:rPr>
           <w:lang w:val="en-GB"/>
         </w:rPr>
-        <w:t xml:space="preserve">For every complete state, E &lt;= Rsel &lt;= B, and E is no greater than any of its three single-guard ablations. For every law P,</w:t>
+        <w:t xml:space="preserve">For every complete state,</w:t>
+      </w:r>
+      <w:r>
+        <w:rPr>
+          <w:lang w:val="en-GB"/>
+        </w:rPr>
+        <w:t xml:space="preserve"> </w:t>
+      </w:r>
+      <m:oMath>
+        <m:r>
+          <m:t>E</m:t>
+        </m:r>
+        <m:r>
+          <m:rPr>
+            <m:sty m:val="p"/>
+          </m:rPr>
+          <m:t>≤</m:t>
+        </m:r>
+        <m:sSub>
+          <m:e>
+            <m:r>
+              <m:t>R</m:t>
+            </m:r>
+          </m:e>
+          <m:sub>
+            <m:r>
+              <m:rPr>
+                <m:sty m:val="p"/>
+              </m:rPr>
+              <m:t>s</m:t>
+            </m:r>
+            <m:r>
+              <m:rPr>
+                <m:sty m:val="p"/>
+              </m:rPr>
+              <m:t>e</m:t>
+            </m:r>
+            <m:r>
+              <m:rPr>
+                <m:sty m:val="p"/>
+              </m:rPr>
+              <m:t>l</m:t>
+            </m:r>
+          </m:sub>
+        </m:sSub>
+        <m:r>
+          <m:rPr>
+            <m:sty m:val="p"/>
+          </m:rPr>
+          <m:t>≤</m:t>
+        </m:r>
+        <m:r>
+          <m:t>B</m:t>
+        </m:r>
+      </m:oMath>
+      <w:r>
+        <w:rPr>
+          <w:lang w:val="en-GB"/>
+        </w:rPr>
+        <w:t xml:space="preserve">, and</w:t>
+      </w:r>
+      <w:r>
+        <w:rPr>
+          <w:lang w:val="en-GB"/>
+        </w:rPr>
+        <w:t xml:space="preserve"> </w:t>
+      </w:r>
+      <m:oMath>
+        <m:r>
+          <m:t>E</m:t>
+        </m:r>
+      </m:oMath>
+      <w:r>
+        <w:rPr>
+          <w:lang w:val="en-GB"/>
+        </w:rPr>
+        <w:t xml:space="preserve"> </w:t>
+      </w:r>
+      <w:r>
+        <w:rPr>
+          <w:lang w:val="en-GB"/>
+        </w:rPr>
+        <w:t xml:space="preserve">is no greater than any of its three single-guard ablations. For every law</w:t>
+      </w:r>
+      <w:r>
+        <w:rPr>
+          <w:lang w:val="en-GB"/>
+        </w:rPr>
+        <w:t xml:space="preserve"> </w:t>
+      </w:r>
+      <m:oMath>
+        <m:r>
+          <m:t>P</m:t>
+        </m:r>
+      </m:oMath>
+      <w:r>
+        <w:rPr>
+          <w:lang w:val="en-GB"/>
+        </w:rPr>
+        <w:t xml:space="preserve">,</w:t>
       </w:r>
     </w:p>
     <w:p>
       <w:pPr>
         <w:pStyle w:val="BodyText"/>
       </w:pPr>
-      <w:r>
-        <w:rPr>
-          <w:lang w:val="en-GB"/>
-        </w:rPr>
-        <w:t xml:space="preserve">E_P[B] - E_P[E] = P(B = 1, E = 0).</w:t>
-      </w:r>
-    </w:p>
-    <w:p>
-      <w:pPr>
-        <w:pStyle w:val="BodyText"/>
+      <m:oMathPara>
+        <m:oMathParaPr>
+          <m:jc m:val="center"/>
+        </m:oMathParaPr>
+        <m:oMath>
+          <m:sSub>
+            <m:e>
+              <m:r>
+                <m:rPr>
+                  <m:scr m:val="double-struck"/>
+                  <m:sty m:val="p"/>
+                </m:rPr>
+                <m:t>E</m:t>
+              </m:r>
+            </m:e>
+            <m:sub>
+              <m:r>
+                <m:t>P</m:t>
+              </m:r>
+            </m:sub>
+          </m:sSub>
+          <m:r>
+            <m:rPr>
+              <m:sty m:val="p"/>
+            </m:rPr>
+            <m:t>[</m:t>
+          </m:r>
+          <m:r>
+            <m:t>B</m:t>
+          </m:r>
+          <m:r>
+            <m:rPr>
+              <m:sty m:val="p"/>
+            </m:rPr>
+            <m:t>]</m:t>
+          </m:r>
+          <m:r>
+            <m:rPr>
+              <m:sty m:val="p"/>
+            </m:rPr>
+            <m:t>−</m:t>
+          </m:r>
+          <m:sSub>
+            <m:e>
+              <m:r>
+                <m:rPr>
+                  <m:scr m:val="double-struck"/>
+                  <m:sty m:val="p"/>
+                </m:rPr>
+                <m:t>E</m:t>
+              </m:r>
+            </m:e>
+            <m:sub>
+              <m:r>
+                <m:t>P</m:t>
+              </m:r>
+            </m:sub>
+          </m:sSub>
+          <m:r>
+            <m:rPr>
+              <m:sty m:val="p"/>
+            </m:rPr>
+            <m:t>[</m:t>
+          </m:r>
+          <m:r>
+            <m:t>E</m:t>
+          </m:r>
+          <m:r>
+            <m:rPr>
+              <m:sty m:val="p"/>
+            </m:rPr>
+            <m:t>]</m:t>
+          </m:r>
+          <m:r>
+            <m:rPr>
+              <m:sty m:val="p"/>
+            </m:rPr>
+            <m:t>=</m:t>
+          </m:r>
+          <m:r>
+            <m:t>P</m:t>
+          </m:r>
+          <m:r>
+            <m:rPr>
+              <m:sty m:val="p"/>
+            </m:rPr>
+            <m:t>{</m:t>
+          </m:r>
+          <m:r>
+            <m:t>B</m:t>
+          </m:r>
+          <m:r>
+            <m:rPr>
+              <m:sty m:val="p"/>
+            </m:rPr>
+            <m:t>=</m:t>
+          </m:r>
+          <m:r>
+            <m:t>1</m:t>
+          </m:r>
+          <m:r>
+            <m:rPr>
+              <m:sty m:val="p"/>
+            </m:rPr>
+            <m:t>,</m:t>
+          </m:r>
+          <m:r>
+            <m:t> </m:t>
+          </m:r>
+          <m:r>
+            <m:t>E</m:t>
+          </m:r>
+          <m:r>
+            <m:rPr>
+              <m:sty m:val="p"/>
+            </m:rPr>
+            <m:t>=</m:t>
+          </m:r>
+          <m:r>
+            <m:t>0</m:t>
+          </m:r>
+          <m:r>
+            <m:rPr>
+              <m:sty m:val="p"/>
+            </m:rPr>
+            <m:t>}</m:t>
+          </m:r>
+          <m:r>
+            <m:rPr>
+              <m:sty m:val="p"/>
+            </m:rPr>
+            <m:t>.</m:t>
+          </m:r>
+        </m:oMath>
+      </m:oMathPara>
+    </w:p>
+    <w:p>
+      <w:pPr>
+        <w:pStyle w:val="FirstParagraph"/>
       </w:pPr>
       <w:r>
         <w:rPr>
@@ -1843,6 +3202,205 @@
         <w:rPr>
           <w:lang w:val="en-GB"/>
         </w:rPr>
+        <w:t xml:space="preserve">For a concrete strict inequality, consider one controlled service with replicas a and b. Replica a is eligible and b is not, but the request demands only b. Then</w:t>
+      </w:r>
+      <w:r>
+        <w:rPr>
+          <w:lang w:val="en-GB"/>
+        </w:rPr>
+        <w:t xml:space="preserve"> </w:t>
+      </w:r>
+      <m:oMath>
+        <m:r>
+          <m:t>B</m:t>
+        </m:r>
+        <m:r>
+          <m:rPr>
+            <m:sty m:val="p"/>
+          </m:rPr>
+          <m:t>=</m:t>
+        </m:r>
+        <m:r>
+          <m:t>1</m:t>
+        </m:r>
+      </m:oMath>
+      <w:r>
+        <w:rPr>
+          <w:lang w:val="en-GB"/>
+        </w:rPr>
+        <w:t xml:space="preserve"> </w:t>
+      </w:r>
+      <w:r>
+        <w:rPr>
+          <w:lang w:val="en-GB"/>
+        </w:rPr>
+        <w:t xml:space="preserve">and</w:t>
+      </w:r>
+      <w:r>
+        <w:rPr>
+          <w:lang w:val="en-GB"/>
+        </w:rPr>
+        <w:t xml:space="preserve"> </w:t>
+      </w:r>
+      <m:oMath>
+        <m:sSub>
+          <m:e>
+            <m:r>
+              <m:t>R</m:t>
+            </m:r>
+          </m:e>
+          <m:sub>
+            <m:r>
+              <m:rPr>
+                <m:sty m:val="p"/>
+              </m:rPr>
+              <m:t>s</m:t>
+            </m:r>
+            <m:r>
+              <m:rPr>
+                <m:sty m:val="p"/>
+              </m:rPr>
+              <m:t>e</m:t>
+            </m:r>
+            <m:r>
+              <m:rPr>
+                <m:sty m:val="p"/>
+              </m:rPr>
+              <m:t>l</m:t>
+            </m:r>
+          </m:sub>
+        </m:sSub>
+        <m:r>
+          <m:rPr>
+            <m:sty m:val="p"/>
+          </m:rPr>
+          <m:t>=</m:t>
+        </m:r>
+        <m:r>
+          <m:t>E</m:t>
+        </m:r>
+        <m:r>
+          <m:rPr>
+            <m:sty m:val="p"/>
+          </m:rPr>
+          <m:t>=</m:t>
+        </m:r>
+        <m:r>
+          <m:t>0</m:t>
+        </m:r>
+      </m:oMath>
+      <w:r>
+        <w:rPr>
+          <w:lang w:val="en-GB"/>
+        </w:rPr>
+        <w:t xml:space="preserve">, even if all other guards are true. Similarly,</w:t>
+      </w:r>
+      <w:r>
+        <w:rPr>
+          <w:lang w:val="en-GB"/>
+        </w:rPr>
+        <w:t xml:space="preserve"> </w:t>
+      </w:r>
+      <m:oMath>
+        <m:sSub>
+          <m:e>
+            <m:r>
+              <m:t>R</m:t>
+            </m:r>
+          </m:e>
+          <m:sub>
+            <m:r>
+              <m:rPr>
+                <m:sty m:val="p"/>
+              </m:rPr>
+              <m:t>s</m:t>
+            </m:r>
+            <m:r>
+              <m:rPr>
+                <m:sty m:val="p"/>
+              </m:rPr>
+              <m:t>e</m:t>
+            </m:r>
+            <m:r>
+              <m:rPr>
+                <m:sty m:val="p"/>
+              </m:rPr>
+              <m:t>l</m:t>
+            </m:r>
+          </m:sub>
+        </m:sSub>
+        <m:r>
+          <m:rPr>
+            <m:sty m:val="p"/>
+          </m:rPr>
+          <m:t>=</m:t>
+        </m:r>
+        <m:r>
+          <m:t>C</m:t>
+        </m:r>
+        <m:r>
+          <m:rPr>
+            <m:sty m:val="p"/>
+          </m:rPr>
+          <m:t>=</m:t>
+        </m:r>
+        <m:r>
+          <m:t>1</m:t>
+        </m:r>
+      </m:oMath>
+      <w:r>
+        <w:rPr>
+          <w:lang w:val="en-GB"/>
+        </w:rPr>
+        <w:t xml:space="preserve"> </w:t>
+      </w:r>
+      <w:r>
+        <w:rPr>
+          <w:lang w:val="en-GB"/>
+        </w:rPr>
+        <w:t xml:space="preserve">with</w:t>
+      </w:r>
+      <w:r>
+        <w:rPr>
+          <w:lang w:val="en-GB"/>
+        </w:rPr>
+        <w:t xml:space="preserve"> </w:t>
+      </w:r>
+      <m:oMath>
+        <m:r>
+          <m:t>T</m:t>
+        </m:r>
+        <m:r>
+          <m:rPr>
+            <m:sty m:val="p"/>
+          </m:rPr>
+          <m:t>=</m:t>
+        </m:r>
+        <m:r>
+          <m:t>0</m:t>
+        </m:r>
+      </m:oMath>
+      <w:r>
+        <w:rPr>
+          <w:lang w:val="en-GB"/>
+        </w:rPr>
+        <w:t xml:space="preserve"> </w:t>
+      </w:r>
+      <w:r>
+        <w:rPr>
+          <w:lang w:val="en-GB"/>
+        </w:rPr>
+        <w:t xml:space="preserve">distinguishes execution from the variant that omits the deadline. These are complete-state counterexamples to removing the corresponding guard without an assumption excluding such states.</w:t>
+      </w:r>
+    </w:p>
+    <w:p>
+      <w:pPr>
+        <w:pStyle w:val="BodyText"/>
+      </w:pPr>
+      <w:r>
+        <w:rPr>
+          <w:lang w:val="en-GB"/>
+        </w:rPr>
         <w:t xml:space="preserve">The condition connecting this model to measured availability is additionally Y=E almost surely within the workload/environment class. It requires correct source propagation and call-group completeness assumptions, correct content/fixture assumptions, an adequate external timing boundary, and eligibility that is necessary for the actual execution despite probe lag. The model does not establish these assumptions by observing a successful span. A stale DOWN check can coexist with successful execution; a protocol-successful response can contain corrupt required content. Both are counterexamples to automatic business equivalence. In particular, the sign of B-Y is not constrained by the preceding identity.</w:t>
       </w:r>
     </w:p>
@@ -1862,7 +3420,7 @@
         </w:rPr>
         <w:t xml:space="preserve"> </w:t>
       </w:r>
-      <w:hyperlink r:id="rId36">
+      <w:hyperlink r:id="rId38">
         <w:r>
           <w:rPr>
             <w:rStyle w:val="Hyperlink"/>
@@ -1884,8 +3442,8 @@
         <w:t xml:space="preserve">supplies an independent, scoped routing/execution mechanism check. It does not establish every business-equivalence assumption or explain the historical AINA biases. Only this one deep mechanism is selected; the three ablations are not presented as three additional causal hypotheses.</w:t>
       </w:r>
     </w:p>
-    <w:bookmarkEnd w:id="37"/>
-    <w:bookmarkStart w:id="38" w:name="X11d4db10393470adc4e89f2d19b53f4a4ec0d37"/>
+    <w:bookmarkEnd w:id="39"/>
+    <w:bookmarkStart w:id="40" w:name="X11d4db10393470adc4e89f2d19b53f4a4ec0d37"/>
     <w:p>
       <w:pPr>
         <w:pStyle w:val="Heading3"/>
@@ -1923,27 +3481,270 @@
       <w:pPr>
         <w:pStyle w:val="BodyText"/>
       </w:pPr>
-      <w:r>
-        <w:rPr>
-          <w:lang w:val="en-GB"/>
-        </w:rPr>
-        <w:t xml:space="preserve">L(f) = sum_o Q(o) min_{s in F(o)} f(s),</w:t>
-      </w:r>
-    </w:p>
-    <w:p>
-      <w:pPr>
-        <w:pStyle w:val="BodyText"/>
-      </w:pPr>
-      <w:r>
-        <w:rPr>
-          <w:lang w:val="en-GB"/>
-        </w:rPr>
-        <w:t xml:space="preserve">U(f) = sum_o Q(o) max_{s in F(o)} f(s).</w:t>
-      </w:r>
-    </w:p>
-    <w:p>
-      <w:pPr>
-        <w:pStyle w:val="BodyText"/>
+      <m:oMathPara>
+        <m:oMathParaPr>
+          <m:jc m:val="center"/>
+        </m:oMathParaPr>
+        <m:oMath>
+          <m:r>
+            <m:t>L</m:t>
+          </m:r>
+          <m:r>
+            <m:rPr>
+              <m:sty m:val="p"/>
+            </m:rPr>
+            <m:t>(</m:t>
+          </m:r>
+          <m:r>
+            <m:t>f</m:t>
+          </m:r>
+          <m:r>
+            <m:rPr>
+              <m:sty m:val="p"/>
+            </m:rPr>
+            <m:t>)</m:t>
+          </m:r>
+          <m:r>
+            <m:rPr>
+              <m:sty m:val="p"/>
+            </m:rPr>
+            <m:t>=</m:t>
+          </m:r>
+          <m:nary>
+            <m:naryPr>
+              <m:chr m:val="∑"/>
+              <m:limLoc m:val="undOvr"/>
+              <m:subHide m:val="off"/>
+              <m:supHide m:val="on"/>
+            </m:naryPr>
+            <m:sub>
+              <m:r>
+                <m:t>o</m:t>
+              </m:r>
+            </m:sub>
+            <m:sup>
+              <m:r>
+                <m:t>​</m:t>
+              </m:r>
+            </m:sup>
+            <m:e>
+              <m:r>
+                <m:t>Q</m:t>
+              </m:r>
+            </m:e>
+          </m:nary>
+          <m:r>
+            <m:rPr>
+              <m:sty m:val="p"/>
+            </m:rPr>
+            <m:t>(</m:t>
+          </m:r>
+          <m:r>
+            <m:t>o</m:t>
+          </m:r>
+          <m:r>
+            <m:rPr>
+              <m:sty m:val="p"/>
+            </m:rPr>
+            <m:t>)</m:t>
+          </m:r>
+          <m:limLow>
+            <m:e>
+              <m:r>
+                <m:rPr>
+                  <m:sty m:val="p"/>
+                </m:rPr>
+                <m:t>min</m:t>
+              </m:r>
+            </m:e>
+            <m:lim>
+              <m:r>
+                <m:t>s</m:t>
+              </m:r>
+              <m:r>
+                <m:rPr>
+                  <m:sty m:val="p"/>
+                </m:rPr>
+                <m:t>∈</m:t>
+              </m:r>
+              <m:r>
+                <m:t>F</m:t>
+              </m:r>
+              <m:r>
+                <m:rPr>
+                  <m:sty m:val="p"/>
+                </m:rPr>
+                <m:t>(</m:t>
+              </m:r>
+              <m:r>
+                <m:t>o</m:t>
+              </m:r>
+              <m:r>
+                <m:rPr>
+                  <m:sty m:val="p"/>
+                </m:rPr>
+                <m:t>)</m:t>
+              </m:r>
+            </m:lim>
+          </m:limLow>
+          <m:r>
+            <m:t>f</m:t>
+          </m:r>
+          <m:r>
+            <m:rPr>
+              <m:sty m:val="p"/>
+            </m:rPr>
+            <m:t>(</m:t>
+          </m:r>
+          <m:r>
+            <m:t>s</m:t>
+          </m:r>
+          <m:r>
+            <m:rPr>
+              <m:sty m:val="p"/>
+            </m:rPr>
+            <m:t>)</m:t>
+          </m:r>
+          <m:r>
+            <m:rPr>
+              <m:sty m:val="p"/>
+            </m:rPr>
+            <m:t>,</m:t>
+          </m:r>
+          <m:r>
+            <m:t>  </m:t>
+          </m:r>
+          <m:r>
+            <m:t>U</m:t>
+          </m:r>
+          <m:r>
+            <m:rPr>
+              <m:sty m:val="p"/>
+            </m:rPr>
+            <m:t>(</m:t>
+          </m:r>
+          <m:r>
+            <m:t>f</m:t>
+          </m:r>
+          <m:r>
+            <m:rPr>
+              <m:sty m:val="p"/>
+            </m:rPr>
+            <m:t>)</m:t>
+          </m:r>
+          <m:r>
+            <m:rPr>
+              <m:sty m:val="p"/>
+            </m:rPr>
+            <m:t>=</m:t>
+          </m:r>
+          <m:nary>
+            <m:naryPr>
+              <m:chr m:val="∑"/>
+              <m:limLoc m:val="undOvr"/>
+              <m:subHide m:val="off"/>
+              <m:supHide m:val="on"/>
+            </m:naryPr>
+            <m:sub>
+              <m:r>
+                <m:t>o</m:t>
+              </m:r>
+            </m:sub>
+            <m:sup>
+              <m:r>
+                <m:t>​</m:t>
+              </m:r>
+            </m:sup>
+            <m:e>
+              <m:r>
+                <m:t>Q</m:t>
+              </m:r>
+            </m:e>
+          </m:nary>
+          <m:r>
+            <m:rPr>
+              <m:sty m:val="p"/>
+            </m:rPr>
+            <m:t>(</m:t>
+          </m:r>
+          <m:r>
+            <m:t>o</m:t>
+          </m:r>
+          <m:r>
+            <m:rPr>
+              <m:sty m:val="p"/>
+            </m:rPr>
+            <m:t>)</m:t>
+          </m:r>
+          <m:limLow>
+            <m:e>
+              <m:r>
+                <m:rPr>
+                  <m:sty m:val="p"/>
+                </m:rPr>
+                <m:t>max</m:t>
+              </m:r>
+            </m:e>
+            <m:lim>
+              <m:r>
+                <m:t>s</m:t>
+              </m:r>
+              <m:r>
+                <m:rPr>
+                  <m:sty m:val="p"/>
+                </m:rPr>
+                <m:t>∈</m:t>
+              </m:r>
+              <m:r>
+                <m:t>F</m:t>
+              </m:r>
+              <m:r>
+                <m:rPr>
+                  <m:sty m:val="p"/>
+                </m:rPr>
+                <m:t>(</m:t>
+              </m:r>
+              <m:r>
+                <m:t>o</m:t>
+              </m:r>
+              <m:r>
+                <m:rPr>
+                  <m:sty m:val="p"/>
+                </m:rPr>
+                <m:t>)</m:t>
+              </m:r>
+            </m:lim>
+          </m:limLow>
+          <m:r>
+            <m:t>f</m:t>
+          </m:r>
+          <m:r>
+            <m:rPr>
+              <m:sty m:val="p"/>
+            </m:rPr>
+            <m:t>(</m:t>
+          </m:r>
+          <m:r>
+            <m:t>s</m:t>
+          </m:r>
+          <m:r>
+            <m:rPr>
+              <m:sty m:val="p"/>
+            </m:rPr>
+            <m:t>)</m:t>
+          </m:r>
+          <m:r>
+            <m:rPr>
+              <m:sty m:val="p"/>
+            </m:rPr>
+            <m:t>.</m:t>
+          </m:r>
+        </m:oMath>
+      </m:oMathPara>
+    </w:p>
+    <w:p>
+      <w:pPr>
+        <w:pStyle w:val="FirstParagraph"/>
       </w:pPr>
       <w:r>
         <w:rPr>
@@ -1994,6 +3795,473 @@
       </w:pPr>
       <w:r>
         <w:rPr>
+          <w:b/>
+          <w:bCs/>
+          <w:lang w:val="en-GB"/>
+        </w:rPr>
+        <w:t xml:space="preserve">Identification algorithm.</w:t>
+      </w:r>
+      <w:r>
+        <w:rPr>
+          <w:lang w:val="en-GB"/>
+        </w:rPr>
+        <w:t xml:space="preserve"> </w:t>
+      </w:r>
+      <w:r>
+        <w:rPr>
+          <w:lang w:val="en-GB"/>
+        </w:rPr>
+        <w:t xml:space="preserve">The source declarations and permitted calibration-role files are inputs; the serialized graph model, category counts, functional bounds and point/refusal statuses are outputs.</w:t>
+      </w:r>
+    </w:p>
+    <w:p>
+      <w:pPr>
+        <w:pStyle w:val="Compact"/>
+        <w:numPr>
+          <w:ilvl w:val="0"/>
+          <w:numId w:val="1001"/>
+        </w:numPr>
+      </w:pPr>
+      <w:r>
+        <w:rPr>
+          <w:lang w:val="en-GB"/>
+        </w:rPr>
+        <w:t xml:space="preserve">Extract the observed graph, bind required edges and replica gates to the source declarations, and validate every structural binding. A missing or ambiguous required binding returns an explicit unsupported status.</w:t>
+      </w:r>
+    </w:p>
+    <w:p>
+      <w:pPr>
+        <w:pStyle w:val="Compact"/>
+        <w:numPr>
+          <w:ilvl w:val="0"/>
+          <w:numId w:val="1001"/>
+        </w:numPr>
+      </w:pPr>
+      <w:r>
+        <w:rPr>
+          <w:lang w:val="en-GB"/>
+        </w:rPr>
+        <w:t xml:space="preserve">Form one masked X/D/C/T row per calibration attempt and count identical rows. With</w:t>
+      </w:r>
+      <w:r>
+        <w:rPr>
+          <w:lang w:val="en-GB"/>
+        </w:rPr>
+        <w:t xml:space="preserve"> </w:t>
+      </w:r>
+      <m:oMath>
+        <m:r>
+          <m:t>N</m:t>
+        </m:r>
+      </m:oMath>
+      <w:r>
+        <w:rPr>
+          <w:lang w:val="en-GB"/>
+        </w:rPr>
+        <w:t xml:space="preserve"> </w:t>
+      </w:r>
+      <w:r>
+        <w:rPr>
+          <w:lang w:val="en-GB"/>
+        </w:rPr>
+        <w:t xml:space="preserve">attempts and category count</w:t>
+      </w:r>
+      <w:r>
+        <w:rPr>
+          <w:lang w:val="en-GB"/>
+        </w:rPr>
+        <w:t xml:space="preserve"> </w:t>
+      </w:r>
+      <m:oMath>
+        <m:sSub>
+          <m:e>
+            <m:r>
+              <m:t>n</m:t>
+            </m:r>
+          </m:e>
+          <m:sub>
+            <m:r>
+              <m:t>o</m:t>
+            </m:r>
+          </m:sub>
+        </m:sSub>
+      </m:oMath>
+      <w:r>
+        <w:rPr>
+          <w:lang w:val="en-GB"/>
+        </w:rPr>
+        <w:t xml:space="preserve">, store</w:t>
+      </w:r>
+      <w:r>
+        <w:rPr>
+          <w:lang w:val="en-GB"/>
+        </w:rPr>
+        <w:t xml:space="preserve"> </w:t>
+      </w:r>
+      <m:oMath>
+        <m:r>
+          <m:t>Q</m:t>
+        </m:r>
+        <m:r>
+          <m:rPr>
+            <m:sty m:val="p"/>
+          </m:rPr>
+          <m:t>(</m:t>
+        </m:r>
+        <m:r>
+          <m:t>o</m:t>
+        </m:r>
+        <m:r>
+          <m:rPr>
+            <m:sty m:val="p"/>
+          </m:rPr>
+          <m:t>)</m:t>
+        </m:r>
+        <m:r>
+          <m:rPr>
+            <m:sty m:val="p"/>
+          </m:rPr>
+          <m:t>=</m:t>
+        </m:r>
+        <m:sSub>
+          <m:e>
+            <m:r>
+              <m:t>n</m:t>
+            </m:r>
+          </m:e>
+          <m:sub>
+            <m:r>
+              <m:t>o</m:t>
+            </m:r>
+          </m:sub>
+        </m:sSub>
+        <m:r>
+          <m:rPr>
+            <m:sty m:val="p"/>
+          </m:rPr>
+          <m:t>/</m:t>
+        </m:r>
+        <m:r>
+          <m:t>N</m:t>
+        </m:r>
+      </m:oMath>
+      <w:r>
+        <w:rPr>
+          <w:lang w:val="en-GB"/>
+        </w:rPr>
+        <w:t xml:space="preserve"> </w:t>
+      </w:r>
+      <w:r>
+        <w:rPr>
+          <w:lang w:val="en-GB"/>
+        </w:rPr>
+        <w:t xml:space="preserve">exactly; do not discard incomplete rows.</w:t>
+      </w:r>
+    </w:p>
+    <w:p>
+      <w:pPr>
+        <w:pStyle w:val="Compact"/>
+        <w:numPr>
+          <w:ilvl w:val="0"/>
+          <w:numId w:val="1001"/>
+        </w:numPr>
+      </w:pPr>
+      <w:r>
+        <w:rPr>
+          <w:lang w:val="en-GB"/>
+        </w:rPr>
+        <w:t xml:space="preserve">For each category, enumerate its unknown control bits and the feasible completion extremes. Evaluate each functional and each paired gap on the same complete candidate state. If the category has</w:t>
+      </w:r>
+      <w:r>
+        <w:rPr>
+          <w:lang w:val="en-GB"/>
+        </w:rPr>
+        <w:t xml:space="preserve"> </w:t>
+      </w:r>
+      <m:oMath>
+        <m:sSub>
+          <m:e>
+            <m:r>
+              <m:t>k</m:t>
+            </m:r>
+          </m:e>
+          <m:sub>
+            <m:r>
+              <m:t>o</m:t>
+            </m:r>
+          </m:sub>
+        </m:sSub>
+      </m:oMath>
+      <w:r>
+        <w:rPr>
+          <w:lang w:val="en-GB"/>
+        </w:rPr>
+        <w:t xml:space="preserve"> </w:t>
+      </w:r>
+      <w:r>
+        <w:rPr>
+          <w:lang w:val="en-GB"/>
+        </w:rPr>
+        <w:t xml:space="preserve">unknown control bits, this requires at most</w:t>
+      </w:r>
+      <w:r>
+        <w:rPr>
+          <w:lang w:val="en-GB"/>
+        </w:rPr>
+        <w:t xml:space="preserve"> </w:t>
+      </w:r>
+      <m:oMath>
+        <m:sSup>
+          <m:e>
+            <m:r>
+              <m:t>2</m:t>
+            </m:r>
+          </m:e>
+          <m:sup>
+            <m:sSub>
+              <m:e>
+                <m:r>
+                  <m:t>k</m:t>
+                </m:r>
+              </m:e>
+              <m:sub>
+                <m:r>
+                  <m:t>o</m:t>
+                </m:r>
+              </m:sub>
+            </m:sSub>
+            <m:r>
+              <m:rPr>
+                <m:sty m:val="p"/>
+              </m:rPr>
+              <m:t>+</m:t>
+            </m:r>
+            <m:r>
+              <m:t>1</m:t>
+            </m:r>
+          </m:sup>
+        </m:sSup>
+      </m:oMath>
+      <w:r>
+        <w:rPr>
+          <w:lang w:val="en-GB"/>
+        </w:rPr>
+        <w:t xml:space="preserve"> </w:t>
+      </w:r>
+      <w:r>
+        <w:rPr>
+          <w:lang w:val="en-GB"/>
+        </w:rPr>
+        <w:t xml:space="preserve">candidate states, where</w:t>
+      </w:r>
+      <w:r>
+        <w:rPr>
+          <w:lang w:val="en-GB"/>
+        </w:rPr>
+        <w:t xml:space="preserve"> </w:t>
+      </w:r>
+      <m:oMath>
+        <m:sSub>
+          <m:e>
+            <m:r>
+              <m:t>k</m:t>
+            </m:r>
+          </m:e>
+          <m:sub>
+            <m:r>
+              <m:t>o</m:t>
+            </m:r>
+          </m:sub>
+        </m:sSub>
+        <m:r>
+          <m:rPr>
+            <m:sty m:val="p"/>
+          </m:rPr>
+          <m:t>≤</m:t>
+        </m:r>
+        <m:r>
+          <m:t>10</m:t>
+        </m:r>
+      </m:oMath>
+      <w:r>
+        <w:rPr>
+          <w:lang w:val="en-GB"/>
+        </w:rPr>
+        <w:t xml:space="preserve">.</w:t>
+      </w:r>
+    </w:p>
+    <w:p>
+      <w:pPr>
+        <w:pStyle w:val="Compact"/>
+        <w:numPr>
+          <w:ilvl w:val="0"/>
+          <w:numId w:val="1001"/>
+        </w:numPr>
+      </w:pPr>
+      <w:r>
+        <w:rPr>
+          <w:lang w:val="en-GB"/>
+        </w:rPr>
+        <w:t xml:space="preserve">Accumulate the weighted minimum and maximum for each functional. Return the common value only when its two exact bounds coincide; otherwise retain the interval and a null point.</w:t>
+      </w:r>
+    </w:p>
+    <w:p>
+      <w:pPr>
+        <w:pStyle w:val="Compact"/>
+        <w:numPr>
+          <w:ilvl w:val="0"/>
+          <w:numId w:val="1001"/>
+        </w:numPr>
+      </w:pPr>
+      <w:r>
+        <w:rPr>
+          <w:lang w:val="en-GB"/>
+        </w:rPr>
+        <w:t xml:space="preserve">Serialize the discovered structure, bindings, counts and results, then reproduce the calculation in a separate process before sealing the forecast for later evaluation.</w:t>
+      </w:r>
+    </w:p>
+    <w:p>
+      <w:pPr>
+        <w:pStyle w:val="FirstParagraph"/>
+      </w:pPr>
+      <w:r>
+        <w:rPr>
+          <w:lang w:val="en-GB"/>
+        </w:rPr>
+        <w:t xml:space="preserve">The candidate bound concerns the finite solver after extraction; it is not a runtime bound for acquiring telemetry or integrating an application. It also does not imply that every recorded coordinate is identified. For example, in a simple reachable graph, a category with known</w:t>
+      </w:r>
+      <w:r>
+        <w:rPr>
+          <w:lang w:val="en-GB"/>
+        </w:rPr>
+        <w:t xml:space="preserve"> </w:t>
+      </w:r>
+      <m:oMath>
+        <m:r>
+          <m:t>T</m:t>
+        </m:r>
+        <m:r>
+          <m:rPr>
+            <m:sty m:val="p"/>
+          </m:rPr>
+          <m:t>=</m:t>
+        </m:r>
+        <m:r>
+          <m:t>0</m:t>
+        </m:r>
+      </m:oMath>
+      <w:r>
+        <w:rPr>
+          <w:lang w:val="en-GB"/>
+        </w:rPr>
+        <w:t xml:space="preserve"> </w:t>
+      </w:r>
+      <w:r>
+        <w:rPr>
+          <w:lang w:val="en-GB"/>
+        </w:rPr>
+        <w:t xml:space="preserve">and all other coordinates masked fixes</w:t>
+      </w:r>
+      <w:r>
+        <w:rPr>
+          <w:lang w:val="en-GB"/>
+        </w:rPr>
+        <w:t xml:space="preserve"> </w:t>
+      </w:r>
+      <m:oMath>
+        <m:r>
+          <m:t>E</m:t>
+        </m:r>
+        <m:r>
+          <m:rPr>
+            <m:sty m:val="p"/>
+          </m:rPr>
+          <m:t>=</m:t>
+        </m:r>
+        <m:r>
+          <m:t>0</m:t>
+        </m:r>
+      </m:oMath>
+      <w:r>
+        <w:rPr>
+          <w:lang w:val="en-GB"/>
+        </w:rPr>
+        <w:t xml:space="preserve"> </w:t>
+      </w:r>
+      <w:r>
+        <w:rPr>
+          <w:lang w:val="en-GB"/>
+        </w:rPr>
+        <w:t xml:space="preserve">while</w:t>
+      </w:r>
+      <w:r>
+        <w:rPr>
+          <w:lang w:val="en-GB"/>
+        </w:rPr>
+        <w:t xml:space="preserve"> </w:t>
+      </w:r>
+      <m:oMath>
+        <m:r>
+          <m:t>B</m:t>
+        </m:r>
+      </m:oMath>
+      <w:r>
+        <w:rPr>
+          <w:lang w:val="en-GB"/>
+        </w:rPr>
+        <w:t xml:space="preserve"> </w:t>
+      </w:r>
+      <w:r>
+        <w:rPr>
+          <w:lang w:val="en-GB"/>
+        </w:rPr>
+        <w:t xml:space="preserve">can still range over</w:t>
+      </w:r>
+      <w:r>
+        <w:rPr>
+          <w:lang w:val="en-GB"/>
+        </w:rPr>
+        <w:t xml:space="preserve"> </w:t>
+      </w:r>
+      <m:oMath>
+        <m:r>
+          <m:rPr>
+            <m:sty m:val="p"/>
+          </m:rPr>
+          <m:t>[</m:t>
+        </m:r>
+        <m:r>
+          <m:t>0</m:t>
+        </m:r>
+        <m:r>
+          <m:rPr>
+            <m:sty m:val="p"/>
+          </m:rPr>
+          <m:t>,</m:t>
+        </m:r>
+        <m:r>
+          <m:t>1</m:t>
+        </m:r>
+        <m:r>
+          <m:rPr>
+            <m:sty m:val="p"/>
+          </m:rPr>
+          <m:t>]</m:t>
+        </m:r>
+      </m:oMath>
+      <w:r>
+        <w:rPr>
+          <w:lang w:val="en-GB"/>
+        </w:rPr>
+        <w:t xml:space="preserve">. Removing a guard can therefore destroy point identification. The solver returns that ambiguity instead of imputing the missing states.</w:t>
+      </w:r>
+    </w:p>
+    <w:p>
+      <w:pPr>
+        <w:pStyle w:val="BodyText"/>
+      </w:pPr>
+      <w:r>
+        <w:rPr>
           <w:lang w:val="en-GB"/>
         </w:rPr>
         <w:t xml:space="preserve">The implementation checks at most 64 coordinates and rejects unsupported control dimensions. Artificial controls compare the reduced solver with exhaustive enumeration of every masked category in a small model, exercise known outcomes and informative masking, and verify structural changes and equivalent representations. Saved-model replay occurs in a fresh process. These checks establish arithmetic and dependence on the model structure, not population confidence coverage or adequacy for Y.</w:t>
@@ -2010,8 +4278,8 @@
         <w:t xml:space="preserve">Q estimated from a finite calibration sample is not the population observation law. Forecasting a later period also assumes invariance of the relevant law. Identification bounds, calibration sampling error, between-campaign uncertainty and semantic misspecification are distinct. The earlier independent-primitive/monomial identification results belong to their own restricted model class and are not silently transferred to this joint execution estimator.</w:t>
       </w:r>
     </w:p>
-    <w:bookmarkEnd w:id="38"/>
-    <w:bookmarkStart w:id="41" w:name="comparators-and-information-access"/>
+    <w:bookmarkEnd w:id="40"/>
+    <w:bookmarkStart w:id="43" w:name="comparators-and-information-access"/>
     <w:p>
       <w:pPr>
         <w:pStyle w:val="Heading3"/>
@@ -2039,7 +4307,7 @@
         </w:rPr>
         <w:t xml:space="preserve"> </w:t>
       </w:r>
-      <w:hyperlink r:id="rId39">
+      <w:hyperlink r:id="rId41">
         <w:r>
           <w:rPr>
             <w:rStyle w:val="Hyperlink"/>
@@ -2107,7 +4375,7 @@
         </w:rPr>
         <w:t xml:space="preserve"> </w:t>
       </w:r>
-      <w:hyperlink r:id="rId40">
+      <w:hyperlink r:id="rId42">
         <w:r>
           <w:rPr>
             <w:rStyle w:val="Hyperlink"/>
@@ -2140,8 +4408,8 @@
         <w:t xml:space="preserve">These differences form an information-access comparison, not a claim that every method estimates the same state parameters from identical fields. The external target Y, campaign identities, calibration/test separation and error analysis are shared.</w:t>
       </w:r>
     </w:p>
-    <w:bookmarkEnd w:id="41"/>
-    <w:bookmarkStart w:id="43" w:name="X484a2fe3fff0944d95f760688e0f50071d288e3"/>
+    <w:bookmarkEnd w:id="43"/>
+    <w:bookmarkStart w:id="45" w:name="X484a2fe3fff0944d95f760688e0f50071d288e3"/>
     <w:p>
       <w:pPr>
         <w:pStyle w:val="Heading3"/>
@@ -2202,7 +4470,7 @@
         </w:rPr>
         <w:t xml:space="preserve"> </w:t>
       </w:r>
-      <w:hyperlink r:id="rId42">
+      <w:hyperlink r:id="rId44">
         <w:r>
           <w:rPr>
             <w:rStyle w:val="Hyperlink"/>
@@ -2246,8 +4514,8 @@
         <w:t xml:space="preserve">For every planned source-to-other-placement direction, the current implementation reports transfer as unsupported: null target point/error, unrestricted target-event bounds [0,1], and change bounds relative to a source point where available. Observed target outcomes and changes are opened only for evaluation. These no-information bounds are neither useful transfer forecasts nor confidence intervals. The zero point-coverage result is an explicit limitation, not an omitted experiment or a refit advertised as transport.</w:t>
       </w:r>
     </w:p>
-    <w:bookmarkEnd w:id="43"/>
-    <w:bookmarkStart w:id="44" w:name="X25ff07b890f17560f8efd0d619947e51038bbe6"/>
+    <w:bookmarkEnd w:id="45"/>
+    <w:bookmarkStart w:id="46" w:name="X25ff07b890f17560f8efd0d619947e51038bbe6"/>
     <w:p>
       <w:pPr>
         <w:pStyle w:val="Heading3"/>
@@ -2297,7 +4565,7 @@
         </w:rPr>
         <w:t xml:space="preserve"> </w:t>
       </w:r>
-      <w:hyperlink r:id="rId13">
+      <w:hyperlink r:id="rId14">
         <w:r>
           <w:rPr>
             <w:rStyle w:val="Hyperlink"/>
@@ -2319,9 +4587,9 @@
         <w:t xml:space="preserve">records which publication claims are already supportable and which await the prospective results.</w:t>
       </w:r>
     </w:p>
-    <w:bookmarkEnd w:id="44"/>
-    <w:bookmarkEnd w:id="45"/>
-    <w:bookmarkStart w:id="71" w:name="results"/>
+    <w:bookmarkEnd w:id="46"/>
+    <w:bookmarkEnd w:id="47"/>
+    <w:bookmarkStart w:id="73" w:name="results"/>
     <w:p>
       <w:pPr>
         <w:pStyle w:val="Heading2"/>
@@ -2333,7 +4601,7 @@
         <w:t xml:space="preserve">Results</w:t>
       </w:r>
     </w:p>
-    <w:bookmarkStart w:id="55" w:name="X67f9ab04a00b5bf3e8d2d0acf7f8e15f0435ced"/>
+    <w:bookmarkStart w:id="57" w:name="X67f9ab04a00b5bf3e8d2d0acf7f8e15f0435ced"/>
     <w:p>
       <w:pPr>
         <w:pStyle w:val="Heading3"/>
@@ -2372,7 +4640,7 @@
         </w:rPr>
         <w:t xml:space="preserve"> </w:t>
       </w:r>
-      <w:hyperlink r:id="rId46">
+      <w:hyperlink r:id="rId48">
         <w:r>
           <w:rPr>
             <w:rStyle w:val="Hyperlink"/>
@@ -2791,18 +5059,18 @@
           <wp:inline>
             <wp:extent cx="5334000" cy="2163233"/>
             <wp:effectExtent b="0" l="0" r="0" t="0"/>
-            <wp:docPr descr="Historical AINA aggregate estimates, observed probe frequencies and signed differences" title="" id="48" name="Picture"/>
+            <wp:docPr descr="Historical AINA aggregate estimates, observed probe frequencies and signed differences" title="" id="50" name="Picture"/>
             <a:graphic>
               <a:graphicData uri="http://schemas.openxmlformats.org/drawingml/2006/picture">
                 <pic:pic>
                   <pic:nvPicPr>
-                    <pic:cNvPr descr="../figures/aina-audit-v3-review.png" id="49" name="Picture"/>
+                    <pic:cNvPr descr="../figures/aina-audit-v3-review.png" id="51" name="Picture"/>
                     <pic:cNvPicPr>
                       <a:picLocks noChangeArrowheads="1" noChangeAspect="1"/>
                     </pic:cNvPicPr>
                   </pic:nvPicPr>
                   <pic:blipFill>
-                    <a:blip r:embed="rId47"/>
+                    <a:blip r:embed="rId49"/>
                     <a:stretch>
                       <a:fillRect/>
                     </a:stretch>
@@ -2849,7 +5117,7 @@
         </w:rPr>
         <w:t xml:space="preserve"> </w:t>
       </w:r>
-      <w:hyperlink r:id="rId50">
+      <w:hyperlink r:id="rId52">
         <w:r>
           <w:rPr>
             <w:rStyle w:val="Hyperlink"/>
@@ -2876,7 +5144,7 @@
         </w:rPr>
         <w:t xml:space="preserve"> </w:t>
       </w:r>
-      <w:hyperlink r:id="rId51">
+      <w:hyperlink r:id="rId53">
         <w:r>
           <w:rPr>
             <w:rStyle w:val="Hyperlink"/>
@@ -2903,7 +5171,7 @@
         </w:rPr>
         <w:t xml:space="preserve"> </w:t>
       </w:r>
-      <w:hyperlink r:id="rId52">
+      <w:hyperlink r:id="rId54">
         <w:r>
           <w:rPr>
             <w:rStyle w:val="Hyperlink"/>
@@ -2947,7 +5215,7 @@
         </w:rPr>
         <w:t xml:space="preserve"> </w:t>
       </w:r>
-      <w:hyperlink r:id="rId53">
+      <w:hyperlink r:id="rId55">
         <w:r>
           <w:rPr>
             <w:rStyle w:val="Hyperlink"/>
@@ -2996,7 +5264,7 @@
         </w:rPr>
         <w:t xml:space="preserve"> </w:t>
       </w:r>
-      <w:hyperlink r:id="rId54">
+      <w:hyperlink r:id="rId56">
         <w:r>
           <w:rPr>
             <w:rStyle w:val="Hyperlink"/>
@@ -3018,8 +5286,8 @@
         <w:t xml:space="preserve">examines the documented controller period, sequential probes and timeout configuration. Conditional duration lower bounds exceed the nominal 60-second controller period in 3,483 of 25,000 windows. These bounds indicate a measurement-alignment concern, but do not reconstruct actual per-probe times or establish exact fault overlap. Original application images/runtime identity are not fully pinned. The discrepancy is reproducible as an observation; its historical cause is not established by these checks.</w:t>
       </w:r>
     </w:p>
-    <w:bookmarkEnd w:id="55"/>
-    <w:bookmarkStart w:id="56" w:name="X5cce87afd976305cd1d2593d1b87bff3354d54c"/>
+    <w:bookmarkEnd w:id="57"/>
+    <w:bookmarkStart w:id="58" w:name="X5cce87afd976305cd1d2593d1b87bff3354d54c"/>
     <w:p>
       <w:pPr>
         <w:pStyle w:val="Heading3"/>
@@ -3277,7 +5545,7 @@
         </w:rPr>
         <w:t xml:space="preserve"> </w:t>
       </w:r>
-      <w:hyperlink r:id="rId36">
+      <w:hyperlink r:id="rId38">
         <w:r>
           <w:rPr>
             <w:rStyle w:val="Hyperlink"/>
@@ -3310,8 +5578,8 @@
         <w:t xml:space="preserve">The initial study gate qualified 31/32 cells because one native-parser cleanliness check failed. A separately versioned replay on the final immutable uploaded inputs qualified the remaining cell while preserving all request outcomes and inferential results. A concurrent append is a plausible explanation for the original parser failure, but the precise bytes observed at that moment were not retained. This repair is evidence about input integrity, not another independent experiment or an extra block. The result supports one scoped mechanism; it neither identifies a mediation fraction nor explains the historical AINA bias.</w:t>
       </w:r>
     </w:p>
-    <w:bookmarkEnd w:id="56"/>
-    <w:bookmarkStart w:id="59" w:name="Xa4f2a1b99eb38c03a1b89ff95f05a6c035af07d"/>
+    <w:bookmarkEnd w:id="58"/>
+    <w:bookmarkStart w:id="61" w:name="Xa4f2a1b99eb38c03a1b89ff95f05a6c035af07d"/>
     <w:p>
       <w:pPr>
         <w:pStyle w:val="Heading3"/>
@@ -3738,7 +6006,7 @@
         </w:rPr>
         <w:t xml:space="preserve"> </w:t>
       </w:r>
-      <w:hyperlink r:id="rId57">
+      <w:hyperlink r:id="rId59">
         <w:r>
           <w:rPr>
             <w:rStyle w:val="Hyperlink"/>
@@ -3787,7 +6055,7 @@
         </w:rPr>
         <w:t xml:space="preserve"> </w:t>
       </w:r>
-      <w:hyperlink r:id="rId58">
+      <w:hyperlink r:id="rId60">
         <w:r>
           <w:rPr>
             <w:rStyle w:val="Hyperlink"/>
@@ -3809,8 +6077,8 @@
         <w:t xml:space="preserve">supplies ten point forecasts, ten exact saved-model replays and 41 structural controls. Its fixed-k quantization and all-attempt eligibility-based parameterization are explicit. The earlier AINA probability law is not silently represented as an unchanged application of the new observation contract.</w:t>
       </w:r>
     </w:p>
-    <w:bookmarkEnd w:id="59"/>
-    <w:bookmarkStart w:id="67" w:name="Xa62ec04076493218a52dd8cbbbb18cadd750d5c"/>
+    <w:bookmarkEnd w:id="61"/>
+    <w:bookmarkStart w:id="69" w:name="Xa62ec04076493218a52dd8cbbbb18cadd750d5c"/>
     <w:p>
       <w:pPr>
         <w:pStyle w:val="Heading3"/>
@@ -3904,7 +6172,7 @@
         </w:rPr>
         <w:t xml:space="preserve"> </w:t>
       </w:r>
-      <w:hyperlink r:id="rId60">
+      <w:hyperlink r:id="rId62">
         <w:r>
           <w:rPr>
             <w:rStyle w:val="Hyperlink"/>
@@ -3942,7 +6210,7 @@
         </w:rPr>
         <w:t xml:space="preserve"> </w:t>
       </w:r>
-      <w:hyperlink r:id="rId61">
+      <w:hyperlink r:id="rId63">
         <w:r>
           <w:rPr>
             <w:rStyle w:val="Hyperlink"/>
@@ -3964,7 +6232,7 @@
         <w:t xml:space="preserve">derives the legacy wrapper’s profile from the sealed campaign identity, preserves the eight-field input files and rejects extra fields. Exact-schema controls reproduce the original error and show equivalence to the qualified legacy projection with that metadata supplied explicitly. It changes no graph functional, native observation, PMX failure policy or outcome. Its full-duration preflight uses a new registered seed and namespace; v1 is preserved as failed development evidence.</w:t>
       </w:r>
     </w:p>
-    <w:bookmarkStart w:id="63" w:name="X880e93b24695459a513dfacfeebfbf3589e2f3b"/>
+    <w:bookmarkStart w:id="65" w:name="X880e93b24695459a513dfacfeebfbf3589e2f3b"/>
     <w:p>
       <w:pPr>
         <w:pStyle w:val="Heading4"/>
@@ -4028,7 +6296,7 @@
         </w:rPr>
         <w:t xml:space="preserve"> </w:t>
       </w:r>
-      <w:hyperlink r:id="rId62">
+      <w:hyperlink r:id="rId64">
         <w:r>
           <w:rPr>
             <w:rStyle w:val="Hyperlink"/>
@@ -4050,8 +6318,8 @@
         <w:t xml:space="preserve">retains all 200 method slots, all 21,600 all-sequence test attempts and the exact missing forecasts. Primary PMX has 13 points, six valid conditional-local refusals and one technical failure; inclusive PMX has 19 points and one failure. Gstar has 10 points, eight ambiguous cells and two structural refusals. The successful subchain retains 48 known oracle solves and passes 1293 other strict provenance/replay/read-order checks. Those checks do not remove the failed admission gates. A separately declared exact-input process diagnostic follows; the cause of the nonterminating process is not inferred from its timeout alone.</w:t>
       </w:r>
     </w:p>
-    <w:bookmarkEnd w:id="63"/>
-    <w:bookmarkStart w:id="64" w:name="Xf831647aee167505ae71107c3ae6e0b2616b92b"/>
+    <w:bookmarkEnd w:id="65"/>
+    <w:bookmarkStart w:id="66" w:name="Xf831647aee167505ae71107c3ae6e0b2616b92b"/>
     <w:p>
       <w:pPr>
         <w:pStyle w:val="Heading4"/>
@@ -4079,7 +6347,7 @@
         </w:rPr>
         <w:t xml:space="preserve"> </w:t>
       </w:r>
-      <w:hyperlink r:id="rId40">
+      <w:hyperlink r:id="rId42">
         <w:r>
           <w:rPr>
             <w:rStyle w:val="Hyperlink"/>
@@ -4112,8 +6380,8 @@
         <w:t xml:space="preserve">All 48 known solver-oracle records pass. The 32 previously supported forecasts remain exactly unchanged, six conditional unsupported slots retain null points/reasons, and two forecasts are recovered. No business test outcome is read in this repair qualification. These results establish a scoped computational repair on development inputs. The newly versioned full-duration preflight using seed 771605 subsequently passed its complete audit, as reported below.</w:t>
       </w:r>
     </w:p>
-    <w:bookmarkEnd w:id="64"/>
-    <w:bookmarkStart w:id="66" w:name="qualified-full-v3-preflight"/>
+    <w:bookmarkEnd w:id="66"/>
+    <w:bookmarkStart w:id="68" w:name="qualified-full-v3-preflight"/>
     <w:p>
       <w:pPr>
         <w:pStyle w:val="Heading4"/>
@@ -4160,7 +6428,7 @@
         </w:rPr>
         <w:t xml:space="preserve"> </w:t>
       </w:r>
-      <w:hyperlink r:id="rId65">
+      <w:hyperlink r:id="rId67">
         <w:r>
           <w:rPr>
             <w:rStyle w:val="Hyperlink"/>
@@ -4193,9 +6461,9 @@
         <w:t xml:space="preserve">Technical qualification preserves the methods’ valid refusals. Gstar supplies 12/20 points, GID and G0 18/20, B0 20/20, primary PMX 14/20 and inclusive PMX 20/20. Gstar has six masked-law ambiguities in OpenTelemetry Demo and two unexplained-parent structural refusals in DeathStarBench. Primary PMX retains six conditional-propagation/positivity refusals in OpenTelemetry Demo. No technical forecast failure remains. Low error and superiority played no role in admission.</w:t>
       </w:r>
     </w:p>
-    <w:bookmarkEnd w:id="66"/>
-    <w:bookmarkEnd w:id="67"/>
-    <w:bookmarkStart w:id="70" w:name="X3e3842fe780a5d9580f897dc4217b830c2425fa"/>
+    <w:bookmarkEnd w:id="68"/>
+    <w:bookmarkEnd w:id="69"/>
+    <w:bookmarkStart w:id="72" w:name="X3e3842fe780a5d9580f897dc4217b830c2425fa"/>
     <w:p>
       <w:pPr>
         <w:pStyle w:val="Heading3"/>
@@ -4223,7 +6491,7 @@
         </w:rPr>
         <w:t xml:space="preserve"> </w:t>
       </w:r>
-      <w:hyperlink r:id="rId68">
+      <w:hyperlink r:id="rId70">
         <w:r>
           <w:rPr>
             <w:rStyle w:val="Hyperlink"/>
@@ -4294,7 +6562,7 @@
         </w:rPr>
         <w:t xml:space="preserve"> </w:t>
       </w:r>
-      <w:hyperlink r:id="rId69">
+      <w:hyperlink r:id="rId71">
         <w:r>
           <w:rPr>
             <w:rStyle w:val="Hyperlink"/>
@@ -4327,9 +6595,9 @@
         <w:t xml:space="preserve">The final main section must report all 800 planned operation cells per method, support and absence reasons, own/common-support errors, the six prespecified paired contrasts, all-sequence/stable distinctions, source-only transfer coverage, measured stage/process costs and unresolved quantities. The reported source-only transfer procedure currently identifies no target point under an unrestricted changed joint law. That limitation must remain visible alongside current-campaign results, and target-calibrated rebuilding must not be relabelled as transfer.</w:t>
       </w:r>
     </w:p>
-    <w:bookmarkEnd w:id="70"/>
-    <w:bookmarkEnd w:id="71"/>
-    <w:bookmarkStart w:id="78" w:name="discussion"/>
+    <w:bookmarkEnd w:id="72"/>
+    <w:bookmarkEnd w:id="73"/>
+    <w:bookmarkStart w:id="80" w:name="discussion"/>
     <w:p>
       <w:pPr>
         <w:pStyle w:val="Heading2"/>
@@ -4341,7 +6609,7 @@
         <w:t xml:space="preserve">Discussion</w:t>
       </w:r>
     </w:p>
-    <w:bookmarkStart w:id="72" w:name="X9d6b68513f878977fec1830a6879ec8b9936a8e"/>
+    <w:bookmarkStart w:id="74" w:name="X9d6b68513f878977fec1830a6879ec8b9936a8e"/>
     <w:p>
       <w:pPr>
         <w:pStyle w:val="Heading3"/>
@@ -4386,8 +6654,8 @@
         <w:t xml:space="preserve">The practical output is therefore conditional. A reachability forecast is justified as an execution forecast only under its stated event equivalence. An execution forecast is justified as a business forecast only under the additional operation contract and measurement assumptions. Independent error and coverage tables assess the latter relationship on their supported application conditions. The present procedure does not automatically select a universally smallest adequate model.</w:t>
       </w:r>
     </w:p>
-    <w:bookmarkEnd w:id="72"/>
-    <w:bookmarkStart w:id="73" w:name="identification-and-observation-quality"/>
+    <w:bookmarkEnd w:id="74"/>
+    <w:bookmarkStart w:id="75" w:name="identification-and-observation-quality"/>
     <w:p>
       <w:pPr>
         <w:pStyle w:val="Heading3"/>
@@ -4432,8 +6700,8 @@
         <w:t xml:space="preserve">The support policy is deliberately observable. Every calibration attempt enters the denominator, including failures, timeouts and untraced attempts. Missing evidence can widen a bound or prevent structural binding; it does not disappear by conditioning on complete traces. This avoids one form of selective reporting, but does not establish that the available instrumentation identifies all requested functionals. The independent results must show point coverage, the reasons for ambiguity, structural refusal and technical failure alongside error. Technical failures remain distinct from a valid method-level refusal to identify a point.</w:t>
       </w:r>
     </w:p>
-    <w:bookmarkEnd w:id="73"/>
-    <w:bookmarkStart w:id="74" w:name="causal-scope-and-guard-ablations"/>
+    <w:bookmarkEnd w:id="75"/>
+    <w:bookmarkStart w:id="76" w:name="causal-scope-and-guard-ablations"/>
     <w:p>
       <w:pPr>
         <w:pStyle w:val="Heading3"/>
@@ -4478,8 +6746,8 @@
         <w:t xml:space="preserve">Historical timing bounds are likewise diagnostic rather than causal. They show that some conditional duration lower bounds are incompatible with treating every original probe window as wholly contained in one short controller period. They do not reconstruct actual probe timestamps or assign an unobserved overlap to a particular failure. The historical biases motivate this investigation while retaining their unresolved causal attribution.</w:t>
       </w:r>
     </w:p>
-    <w:bookmarkEnd w:id="74"/>
-    <w:bookmarkStart w:id="75" w:name="interpreting-independent-comparisons"/>
+    <w:bookmarkEnd w:id="76"/>
+    <w:bookmarkStart w:id="77" w:name="interpreting-independent-comparisons"/>
     <w:p>
       <w:pPr>
         <w:pStyle w:val="Heading3"/>
@@ -4535,8 +6803,8 @@
         <w:t xml:space="preserve">The all-sequence result is primary. The stable view uses the same frozen forecast on a separately reported, bracketed subset of attempts, and can change the observed operating-condition mix. It does not rescue an unsuccessful primary forecast or exclude every DOWN state. Differences between the views are interpreted with their retained fractions and condition coverage.</w:t>
       </w:r>
     </w:p>
-    <w:bookmarkEnd w:id="75"/>
-    <w:bookmarkStart w:id="76" w:name="transfer-cost-and-automation"/>
+    <w:bookmarkEnd w:id="77"/>
+    <w:bookmarkStart w:id="78" w:name="transfer-cost-and-automation"/>
     <w:p>
       <w:pPr>
         <w:pStyle w:val="Heading3"/>
@@ -4581,8 +6849,8 @@
         <w:t xml:space="preserve">Automation begins after several manual choices: the external success contract, source error-propagation rules, required and optional call groups, peer identity declarations, fault/placement class and comparator adapters. The downstream extraction, identification, calculation, replay and scoring are automated under those declarations. This scope is useful and reproducible, but does not establish fully automatic integration of an unfamiliar application. Low CPU time alone is not evidence of low total integration or monitoring cost.</w:t>
       </w:r>
     </w:p>
-    <w:bookmarkEnd w:id="76"/>
-    <w:bookmarkStart w:id="77" w:name="generalization-and-reproducibility"/>
+    <w:bookmarkEnd w:id="78"/>
+    <w:bookmarkStart w:id="79" w:name="generalization-and-reproducibility"/>
     <w:p>
       <w:pPr>
         <w:pStyle w:val="Heading3"/>
@@ -4627,9 +6895,9 @@
         <w:t xml:space="preserve">Reproducibility requires preserving the failures that changed the implementation. The first full comparison preflight’s PMX profile-interface failure is retained beside its versioned repair. The second preflight exposes a zero-step PMX resource-estimation loop; its separately qualified clock-progress correction preserves all previously supported forecasts on the saved development inputs. That repair is disclosed as a derived binary, and its qualification does not add independent test campaigns. The H-EXEC immutable-input replay retains the original parser failure and all unchanged outcomes. A successful replay verifies the recorded calculation and input association; it does not create another independent campaign. The final article must preserve any further technical failures, invalid probabilities, empty contrasts and unfavorable results, and base its accuracy conclusions on the audited prospective evidence.</w:t>
       </w:r>
     </w:p>
-    <w:bookmarkEnd w:id="77"/>
-    <w:bookmarkEnd w:id="78"/>
-    <w:bookmarkStart w:id="86" w:name="references"/>
+    <w:bookmarkEnd w:id="79"/>
+    <w:bookmarkEnd w:id="80"/>
+    <w:bookmarkStart w:id="88" w:name="references"/>
     <w:p>
       <w:pPr>
         <w:pStyle w:val="Heading2"/>
@@ -4677,7 +6945,7 @@
         </w:rPr>
         <w:t xml:space="preserve"> </w:t>
       </w:r>
-      <w:hyperlink r:id="rId79">
+      <w:hyperlink r:id="rId81">
         <w:r>
           <w:rPr>
             <w:rStyle w:val="Hyperlink"/>
@@ -4722,58 +6990,6 @@
           <w:lang w:val="en-GB"/>
         </w:rPr>
         <w:t xml:space="preserve">. Proceedings of ACM SIGMETRICS 2002.</w:t>
-      </w:r>
-      <w:r>
-        <w:rPr>
-          <w:lang w:val="en-GB"/>
-        </w:rPr>
-        <w:t xml:space="preserve"> </w:t>
-      </w:r>
-      <w:hyperlink r:id="rId15">
-        <w:r>
-          <w:rPr>
-            <w:rStyle w:val="Hyperlink"/>
-            <w:lang w:val="en-GB"/>
-          </w:rPr>
-          <w:t xml:space="preserve">Author-hosted paper</w:t>
-        </w:r>
-      </w:hyperlink>
-      <w:r>
-        <w:rPr>
-          <w:lang w:val="en-GB"/>
-        </w:rPr>
-        <w:t xml:space="preserve">.</w:t>
-      </w:r>
-    </w:p>
-    <w:p>
-      <w:pPr>
-        <w:pStyle w:val="BodyText"/>
-      </w:pPr>
-      <w:r>
-        <w:rPr>
-          <w:lang w:val="en-GB"/>
-        </w:rPr>
-        <w:t xml:space="preserve">Duffield, N. (2006).</w:t>
-      </w:r>
-      <w:r>
-        <w:rPr>
-          <w:lang w:val="en-GB"/>
-        </w:rPr>
-        <w:t xml:space="preserve"> </w:t>
-      </w:r>
-      <w:r>
-        <w:rPr>
-          <w:i/>
-          <w:iCs/>
-          <w:lang w:val="en-GB"/>
-        </w:rPr>
-        <w:t xml:space="preserve">Network Tomography of Binary Network Performance Characteristics</w:t>
-      </w:r>
-      <w:r>
-        <w:rPr>
-          <w:lang w:val="en-GB"/>
-        </w:rPr>
-        <w:t xml:space="preserve">.</w:t>
       </w:r>
       <w:r>
         <w:rPr>
@@ -4805,7 +7021,7 @@
         <w:rPr>
           <w:lang w:val="en-GB"/>
         </w:rPr>
-        <w:t xml:space="preserve">Foures, D., Albert, V., and Nketsa, A. (2016).</w:t>
+        <w:t xml:space="preserve">Duffield, N. (2006).</w:t>
       </w:r>
       <w:r>
         <w:rPr>
@@ -4819,6 +7035,58 @@
           <w:iCs/>
           <w:lang w:val="en-GB"/>
         </w:rPr>
+        <w:t xml:space="preserve">Network Tomography of Binary Network Performance Characteristics</w:t>
+      </w:r>
+      <w:r>
+        <w:rPr>
+          <w:lang w:val="en-GB"/>
+        </w:rPr>
+        <w:t xml:space="preserve">.</w:t>
+      </w:r>
+      <w:r>
+        <w:rPr>
+          <w:lang w:val="en-GB"/>
+        </w:rPr>
+        <w:t xml:space="preserve"> </w:t>
+      </w:r>
+      <w:hyperlink r:id="rId17">
+        <w:r>
+          <w:rPr>
+            <w:rStyle w:val="Hyperlink"/>
+            <w:lang w:val="en-GB"/>
+          </w:rPr>
+          <w:t xml:space="preserve">Author-hosted paper</w:t>
+        </w:r>
+      </w:hyperlink>
+      <w:r>
+        <w:rPr>
+          <w:lang w:val="en-GB"/>
+        </w:rPr>
+        <w:t xml:space="preserve">.</w:t>
+      </w:r>
+    </w:p>
+    <w:p>
+      <w:pPr>
+        <w:pStyle w:val="BodyText"/>
+      </w:pPr>
+      <w:r>
+        <w:rPr>
+          <w:lang w:val="en-GB"/>
+        </w:rPr>
+        <w:t xml:space="preserve">Foures, D., Albert, V., and Nketsa, A. (2016).</w:t>
+      </w:r>
+      <w:r>
+        <w:rPr>
+          <w:lang w:val="en-GB"/>
+        </w:rPr>
+        <w:t xml:space="preserve"> </w:t>
+      </w:r>
+      <w:r>
+        <w:rPr>
+          <w:i/>
+          <w:iCs/>
+          <w:lang w:val="en-GB"/>
+        </w:rPr>
         <w:t xml:space="preserve">A new specification-based qualitative metric for simulation model validity</w:t>
       </w:r>
       <w:r>
@@ -4833,7 +7101,7 @@
         </w:rPr>
         <w:t xml:space="preserve"> </w:t>
       </w:r>
-      <w:hyperlink r:id="rId80">
+      <w:hyperlink r:id="rId82">
         <w:r>
           <w:rPr>
             <w:rStyle w:val="Hyperlink"/>
@@ -4885,7 +7153,7 @@
         </w:rPr>
         <w:t xml:space="preserve"> </w:t>
       </w:r>
-      <w:hyperlink r:id="rId22">
+      <w:hyperlink r:id="rId23">
         <w:r>
           <w:rPr>
             <w:rStyle w:val="Hyperlink"/>
@@ -4937,7 +7205,7 @@
         </w:rPr>
         <w:t xml:space="preserve"> </w:t>
       </w:r>
-      <w:hyperlink r:id="rId81">
+      <w:hyperlink r:id="rId83">
         <w:r>
           <w:rPr>
             <w:rStyle w:val="Hyperlink"/>
@@ -4989,7 +7257,7 @@
         </w:rPr>
         <w:t xml:space="preserve"> </w:t>
       </w:r>
-      <w:hyperlink r:id="rId82">
+      <w:hyperlink r:id="rId84">
         <w:r>
           <w:rPr>
             <w:rStyle w:val="Hyperlink"/>
@@ -5041,7 +7309,7 @@
         </w:rPr>
         <w:t xml:space="preserve"> </w:t>
       </w:r>
-      <w:hyperlink r:id="rId83">
+      <w:hyperlink r:id="rId85">
         <w:r>
           <w:rPr>
             <w:rStyle w:val="Hyperlink"/>
@@ -5190,7 +7458,7 @@
         <w:rPr>
           <w:lang w:val="en-GB"/>
         </w:rPr>
-        <w:t xml:space="preserve">Mazkatli, M., Monschein, D., Armbruster, M., Heinrich, R., and Koziolek, A. (2025).</w:t>
+        <w:t xml:space="preserve">Krasnovsky, A. A., and Maslovskaya, A. (2026).</w:t>
       </w:r>
       <w:r>
         <w:rPr>
@@ -5204,6 +7472,58 @@
           <w:iCs/>
           <w:lang w:val="en-GB"/>
         </w:rPr>
+        <w:t xml:space="preserve">Stochastic Connectivity as the Foundation of a Runtime Model for Microservice Availability Analysis</w:t>
+      </w:r>
+      <w:r>
+        <w:rPr>
+          <w:lang w:val="en-GB"/>
+        </w:rPr>
+        <w:t xml:space="preserve">. arXiv:2607.00740v1, 1 July 2026.</w:t>
+      </w:r>
+      <w:r>
+        <w:rPr>
+          <w:lang w:val="en-GB"/>
+        </w:rPr>
+        <w:t xml:space="preserve"> </w:t>
+      </w:r>
+      <w:hyperlink r:id="rId13">
+        <w:r>
+          <w:rPr>
+            <w:rStyle w:val="Hyperlink"/>
+            <w:lang w:val="en-GB"/>
+          </w:rPr>
+          <w:t xml:space="preserve">Preprint version</w:t>
+        </w:r>
+      </w:hyperlink>
+      <w:r>
+        <w:rPr>
+          <w:lang w:val="en-GB"/>
+        </w:rPr>
+        <w:t xml:space="preserve">.</w:t>
+      </w:r>
+    </w:p>
+    <w:p>
+      <w:pPr>
+        <w:pStyle w:val="BodyText"/>
+      </w:pPr>
+      <w:r>
+        <w:rPr>
+          <w:lang w:val="en-GB"/>
+        </w:rPr>
+        <w:t xml:space="preserve">Mazkatli, M., Monschein, D., Armbruster, M., Heinrich, R., and Koziolek, A. (2025).</w:t>
+      </w:r>
+      <w:r>
+        <w:rPr>
+          <w:lang w:val="en-GB"/>
+        </w:rPr>
+        <w:t xml:space="preserve"> </w:t>
+      </w:r>
+      <w:r>
+        <w:rPr>
+          <w:i/>
+          <w:iCs/>
+          <w:lang w:val="en-GB"/>
+        </w:rPr>
         <w:t xml:space="preserve">Continuous integration of architectural performance models with parametric dependencies – the CIPM approach</w:t>
       </w:r>
       <w:r>
@@ -5218,7 +7538,7 @@
         </w:rPr>
         <w:t xml:space="preserve"> </w:t>
       </w:r>
-      <w:hyperlink r:id="rId84">
+      <w:hyperlink r:id="rId86">
         <w:r>
           <w:rPr>
             <w:rStyle w:val="Hyperlink"/>
@@ -5270,7 +7590,7 @@
         </w:rPr>
         <w:t xml:space="preserve"> </w:t>
       </w:r>
-      <w:hyperlink r:id="rId85">
+      <w:hyperlink r:id="rId87">
         <w:r>
           <w:rPr>
             <w:rStyle w:val="Hyperlink"/>
@@ -5322,7 +7642,7 @@
         </w:rPr>
         <w:t xml:space="preserve"> </w:t>
       </w:r>
-      <w:hyperlink r:id="rId28">
+      <w:hyperlink r:id="rId29">
         <w:r>
           <w:rPr>
             <w:rStyle w:val="Hyperlink"/>
@@ -5374,7 +7694,7 @@
         </w:rPr>
         <w:t xml:space="preserve"> </w:t>
       </w:r>
-      <w:hyperlink r:id="rId20">
+      <w:hyperlink r:id="rId21">
         <w:r>
           <w:rPr>
             <w:rStyle w:val="Hyperlink"/>
@@ -5390,8 +7710,8 @@
         <w:t xml:space="preserve">.</w:t>
       </w:r>
     </w:p>
-    <w:bookmarkEnd w:id="86"/>
-    <w:bookmarkStart w:id="96" w:name="Xca5978b00292db4c29cfb3375589ea70af0cfb1"/>
+    <w:bookmarkEnd w:id="88"/>
+    <w:bookmarkStart w:id="98" w:name="Xca5978b00292db4c29cfb3375589ea70af0cfb1"/>
     <w:p>
       <w:pPr>
         <w:pStyle w:val="Heading2"/>
@@ -5403,7 +7723,7 @@
         <w:t xml:space="preserve">Appendix: contribution and evidence boundaries</w:t>
       </w:r>
     </w:p>
-    <w:bookmarkStart w:id="93" w:name="contribution-and-evidence-table"/>
+    <w:bookmarkStart w:id="95" w:name="contribution-and-evidence-table"/>
     <w:p>
       <w:pPr>
         <w:pStyle w:val="Heading3"/>
@@ -5524,7 +7844,7 @@
             <w:pPr>
               <w:pStyle w:val="Compact"/>
             </w:pPr>
-            <w:hyperlink r:id="rId46">
+            <w:hyperlink r:id="rId48">
               <w:r>
                 <w:rPr>
                   <w:rStyle w:val="Hyperlink"/>
@@ -5545,7 +7865,7 @@
               </w:rPr>
               <w:t xml:space="preserve"> </w:t>
             </w:r>
-            <w:hyperlink r:id="rId53">
+            <w:hyperlink r:id="rId55">
               <w:r>
                 <w:rPr>
                   <w:rStyle w:val="Hyperlink"/>
@@ -5606,7 +7926,7 @@
             <w:pPr>
               <w:pStyle w:val="Compact"/>
             </w:pPr>
-            <w:hyperlink r:id="rId87">
+            <w:hyperlink r:id="rId89">
               <w:r>
                 <w:rPr>
                   <w:rStyle w:val="Hyperlink"/>
@@ -5627,7 +7947,7 @@
               </w:rPr>
               <w:t xml:space="preserve"> </w:t>
             </w:r>
-            <w:hyperlink r:id="rId88">
+            <w:hyperlink r:id="rId90">
               <w:r>
                 <w:rPr>
                   <w:rStyle w:val="Hyperlink"/>
@@ -5648,7 +7968,28 @@
               <w:rPr>
                 <w:lang w:val="en-GB"/>
               </w:rPr>
-              <w:t xml:space="preserve">Attribute the MODELS manuscript/preprint as an origin, without an accepted-publication claim. Do not imply a universal reliability formalism is new</w:t>
+              <w:t xml:space="preserve">The origin is the</w:t>
+            </w:r>
+            <w:r>
+              <w:rPr>
+                <w:lang w:val="en-GB"/>
+              </w:rPr>
+              <w:t xml:space="preserve"> </w:t>
+            </w:r>
+            <w:hyperlink r:id="rId13">
+              <w:r>
+                <w:rPr>
+                  <w:rStyle w:val="Hyperlink"/>
+                  <w:lang w:val="en-GB"/>
+                </w:rPr>
+                <w:t xml:space="preserve">Krasnovsky–Maslovskaya preprint</w:t>
+              </w:r>
+            </w:hyperlink>
+            <w:r>
+              <w:rPr>
+                <w:lang w:val="en-GB"/>
+              </w:rPr>
+              <w:t xml:space="preserve">, without an accepted-MODELS-publication claim. Do not imply a universal reliability formalism is new</w:t>
             </w:r>
           </w:p>
         </w:tc>
@@ -5758,7 +8099,7 @@
               </w:rPr>
               <w:t xml:space="preserve"> </w:t>
             </w:r>
-            <w:hyperlink r:id="rId57">
+            <w:hyperlink r:id="rId59">
               <w:r>
                 <w:rPr>
                   <w:rStyle w:val="Hyperlink"/>
@@ -5877,7 +8218,7 @@
             <w:pPr>
               <w:pStyle w:val="Compact"/>
             </w:pPr>
-            <w:hyperlink r:id="rId89">
+            <w:hyperlink r:id="rId91">
               <w:r>
                 <w:rPr>
                   <w:rStyle w:val="Hyperlink"/>
@@ -5944,7 +8285,7 @@
             <w:pPr>
               <w:pStyle w:val="Compact"/>
             </w:pPr>
-            <w:hyperlink r:id="rId36">
+            <w:hyperlink r:id="rId38">
               <w:r>
                 <w:rPr>
                   <w:rStyle w:val="Hyperlink"/>
@@ -6011,7 +8352,7 @@
             <w:pPr>
               <w:pStyle w:val="Compact"/>
             </w:pPr>
-            <w:hyperlink r:id="rId39">
+            <w:hyperlink r:id="rId41">
               <w:r>
                 <w:rPr>
                   <w:rStyle w:val="Hyperlink"/>
@@ -6078,7 +8419,7 @@
             <w:pPr>
               <w:pStyle w:val="Compact"/>
             </w:pPr>
-            <w:hyperlink r:id="rId90">
+            <w:hyperlink r:id="rId92">
               <w:r>
                 <w:rPr>
                   <w:rStyle w:val="Hyperlink"/>
@@ -6099,7 +8440,7 @@
               </w:rPr>
               <w:t xml:space="preserve"> </w:t>
             </w:r>
-            <w:hyperlink r:id="rId58">
+            <w:hyperlink r:id="rId60">
               <w:r>
                 <w:rPr>
                   <w:rStyle w:val="Hyperlink"/>
@@ -6178,7 +8519,7 @@
               </w:rPr>
               <w:t xml:space="preserve"> </w:t>
             </w:r>
-            <w:hyperlink r:id="rId40">
+            <w:hyperlink r:id="rId42">
               <w:r>
                 <w:rPr>
                   <w:rStyle w:val="Hyperlink"/>
@@ -6459,7 +8800,7 @@
         </w:rPr>
         <w:t xml:space="preserve"> </w:t>
       </w:r>
-      <w:hyperlink r:id="rId91">
+      <w:hyperlink r:id="rId93">
         <w:r>
           <w:rPr>
             <w:rStyle w:val="Hyperlink"/>
@@ -6486,7 +8827,7 @@
         </w:rPr>
         <w:t xml:space="preserve"> </w:t>
       </w:r>
-      <w:hyperlink r:id="rId92">
+      <w:hyperlink r:id="rId94">
         <w:r>
           <w:rPr>
             <w:rStyle w:val="Hyperlink"/>
@@ -6508,8 +8849,8 @@
         <w:t xml:space="preserve">identify the sources and access limits behind the attribution boundaries. In particular, log-linear/rank identification, binary network tomography, sharp probability bounds, automatic architectural calibration and event/resource-driven reliability modeling predate this work. The final novelty claim must name the declared execution/observation class, supported identification algorithm and linked independent tests, rather than claiming these broader research directions as new.</w:t>
       </w:r>
     </w:p>
-    <w:bookmarkEnd w:id="93"/>
-    <w:bookmarkStart w:id="94" w:name="manual-input-and-integration-inventory"/>
+    <w:bookmarkEnd w:id="95"/>
+    <w:bookmarkStart w:id="96" w:name="manual-input-and-integration-inventory"/>
     <w:p>
       <w:pPr>
         <w:pStyle w:val="Heading3"/>
@@ -6627,7 +8968,7 @@
             <w:pPr>
               <w:pStyle w:val="Compact"/>
             </w:pPr>
-            <w:hyperlink r:id="rId31">
+            <w:hyperlink r:id="rId32">
               <w:r>
                 <w:rPr>
                   <w:rStyle w:val="Hyperlink"/>
@@ -6759,7 +9100,7 @@
             <w:pPr>
               <w:pStyle w:val="Compact"/>
             </w:pPr>
-            <w:hyperlink r:id="rId33">
+            <w:hyperlink r:id="rId35">
               <w:r>
                 <w:rPr>
                   <w:rStyle w:val="Hyperlink"/>
@@ -6897,7 +9238,7 @@
             <w:pPr>
               <w:pStyle w:val="Compact"/>
             </w:pPr>
-            <w:hyperlink r:id="rId39">
+            <w:hyperlink r:id="rId41">
               <w:r>
                 <w:rPr>
                   <w:rStyle w:val="Hyperlink"/>
@@ -7022,7 +9363,7 @@
             <w:pPr>
               <w:pStyle w:val="Compact"/>
             </w:pPr>
-            <w:hyperlink r:id="rId42">
+            <w:hyperlink r:id="rId44">
               <w:r>
                 <w:rPr>
                   <w:rStyle w:val="Hyperlink"/>
@@ -7069,8 +9410,8 @@
         </w:tc>
       </w:tr>
     </w:tbl>
-    <w:bookmarkEnd w:id="94"/>
-    <w:bookmarkStart w:id="95" w:name="Xd813bc0ac44da3215c8dbccccb245cb170c3963"/>
+    <w:bookmarkEnd w:id="96"/>
+    <w:bookmarkStart w:id="97" w:name="Xd813bc0ac44da3215c8dbccccb245cb170c3963"/>
     <w:p>
       <w:pPr>
         <w:pStyle w:val="Heading3"/>
@@ -7087,7 +9428,7 @@
         <w:pStyle w:val="Compact"/>
         <w:numPr>
           <w:ilvl w:val="0"/>
-          <w:numId w:val="1001"/>
+          <w:numId w:val="1002"/>
         </w:numPr>
       </w:pPr>
       <w:r>
@@ -7102,7 +9443,7 @@
         <w:pStyle w:val="Compact"/>
         <w:numPr>
           <w:ilvl w:val="0"/>
-          <w:numId w:val="1001"/>
+          <w:numId w:val="1002"/>
         </w:numPr>
       </w:pPr>
       <w:r>
@@ -7117,7 +9458,7 @@
         <w:pStyle w:val="Compact"/>
         <w:numPr>
           <w:ilvl w:val="0"/>
-          <w:numId w:val="1001"/>
+          <w:numId w:val="1002"/>
         </w:numPr>
       </w:pPr>
       <w:r>
@@ -7132,7 +9473,7 @@
         <w:pStyle w:val="Compact"/>
         <w:numPr>
           <w:ilvl w:val="0"/>
-          <w:numId w:val="1001"/>
+          <w:numId w:val="1002"/>
         </w:numPr>
       </w:pPr>
       <w:r>
@@ -7147,7 +9488,7 @@
         <w:pStyle w:val="Compact"/>
         <w:numPr>
           <w:ilvl w:val="0"/>
-          <w:numId w:val="1001"/>
+          <w:numId w:val="1002"/>
         </w:numPr>
       </w:pPr>
       <w:r>
@@ -7162,7 +9503,7 @@
         <w:pStyle w:val="Compact"/>
         <w:numPr>
           <w:ilvl w:val="0"/>
-          <w:numId w:val="1001"/>
+          <w:numId w:val="1002"/>
         </w:numPr>
       </w:pPr>
       <w:r>
@@ -7172,8 +9513,8 @@
         <w:t xml:space="preserve">Main findings, error/coverage tables, measured costs and final conclusions must be filled from the admitted prospective evidence, with its exact run and source provenance. This table cannot be used to mark those pending conditions complete.</w:t>
       </w:r>
     </w:p>
-    <w:bookmarkEnd w:id="95"/>
-    <w:bookmarkEnd w:id="96"/>
+    <w:bookmarkEnd w:id="97"/>
+    <w:bookmarkEnd w:id="98"/>
     <w:sectPr>
       <w:footnotePr>
         <w:numRestart w:val="eachSect"/>
@@ -7373,6 +9714,36 @@
     <w:abstractNumId w:val="990"/>
   </w:num>
   <w:num w:numId="1001">
+    <w:abstractNumId w:val="99411"/>
+    <w:lvlOverride w:ilvl="0">
+      <w:startOverride w:val="1"/>
+    </w:lvlOverride>
+    <w:lvlOverride w:ilvl="1">
+      <w:startOverride w:val="1"/>
+    </w:lvlOverride>
+    <w:lvlOverride w:ilvl="2">
+      <w:startOverride w:val="1"/>
+    </w:lvlOverride>
+    <w:lvlOverride w:ilvl="3">
+      <w:startOverride w:val="1"/>
+    </w:lvlOverride>
+    <w:lvlOverride w:ilvl="4">
+      <w:startOverride w:val="1"/>
+    </w:lvlOverride>
+    <w:lvlOverride w:ilvl="5">
+      <w:startOverride w:val="1"/>
+    </w:lvlOverride>
+    <w:lvlOverride w:ilvl="6">
+      <w:startOverride w:val="1"/>
+    </w:lvlOverride>
+    <w:lvlOverride w:ilvl="7">
+      <w:startOverride w:val="1"/>
+    </w:lvlOverride>
+    <w:lvlOverride w:ilvl="8">
+      <w:startOverride w:val="1"/>
+    </w:lvlOverride>
+  </w:num>
+  <w:num w:numId="1002">
     <w:abstractNumId w:val="99411"/>
     <w:lvlOverride w:ilvl="0">
       <w:startOverride w:val="1"/>

</xml_diff>